<commit_message>
docs: the complete chain grid and its default columns
Co-Authored-By: Claude Opus 5 <noreply@anthropic.com>
</commit_message>
<xml_diff>
--- a/docs/manuals/reference-guide/reference-guide.docx
+++ b/docs/manuals/reference-guide/reference-guide.docx
@@ -17239,9 +17239,33 @@
         <w:t>The chain</w:t>
       </w:r>
       <w:r>
-        <w:t xml:space="preserve"> — calls | strike | puts around spot, at-the-money strike in gold,</w:t>
-        <w:br/>
-        <w:t xml:space="preserve">   in-the-money cells shaded. </w:t>
+        <w:t xml:space="preserve"> — the complete chain for the selected expiration: </w:t>
+      </w:r>
+      <w:r>
+        <w:rPr>
+          <w:b/>
+        </w:rPr>
+        <w:t>every</w:t>
+      </w:r>
+      <w:r>
+        <w:t xml:space="preserve"> strike,</w:t>
+        <w:br/>
+        <w:t xml:space="preserve">   calls | strike | puts, in a scroll box that opens centred on spot. At-the-money</w:t>
+        <w:br/>
+        <w:t xml:space="preserve">   strike in gold, in-the-money cells shaded. Default columns, call side outward to</w:t>
+        <w:br/>
+        <w:t xml:space="preserve">   the strike: </w:t>
+      </w:r>
+      <w:r>
+        <w:rPr>
+          <w:b/>
+        </w:rPr>
+        <w:t>Delta · OI · Volume · Bid · Ask</w:t>
+      </w:r>
+      <w:r>
+        <w:t>, mirrored on the put side.</w:t>
+        <w:br/>
+        <w:t xml:space="preserve">   </w:t>
       </w:r>
       <w:r>
         <w:rPr>
@@ -17256,16 +17280,16 @@
         <w:rPr>
           <w:b/>
         </w:rPr>
-        <w:t>The new leg</w:t>
-        <w:br/>
-        <w:t xml:space="preserve">   is priced at the MARK either way</w:t>
-      </w:r>
-      <w:r>
-        <w:t xml:space="preserve"> — the column only decides the side. Pricing a</w:t>
-        <w:br/>
-        <w:t xml:space="preserve">   sell at the bid would make every structure look worse by the full spread and</w:t>
-        <w:br/>
-        <w:t xml:space="preserve">   disagree with the volatility implied from the mark. </w:t>
+        <w:t>The new leg is priced at the MARK</w:t>
+        <w:br/>
+        <w:t xml:space="preserve">   either way</w:t>
+      </w:r>
+      <w:r>
+        <w:t xml:space="preserve"> — the column only decides the side. Pricing a sell at the bid would</w:t>
+        <w:br/>
+        <w:t xml:space="preserve">   make every structure look worse by the full spread and disagree with the</w:t>
+        <w:br/>
+        <w:t xml:space="preserve">   volatility implied from the mark. </w:t>
       </w:r>
       <w:r>
         <w:rPr>
@@ -17274,9 +17298,9 @@
         <w:t>Columns</w:t>
       </w:r>
       <w:r>
-        <w:t xml:space="preserve"> adds Mark, IV,</w:t>
-        <w:br/>
-        <w:t xml:space="preserve">   Gamma, Theta, Vega or Volume to the default Bid, Ask, Delta, OI, and remembers it.</w:t>
+        <w:t xml:space="preserve"> adds Mark, IV, Gamma, Theta or Vega,</w:t>
+        <w:br/>
+        <w:t xml:space="preserve">   and remembers it.</w:t>
       </w:r>
     </w:p>
     <w:p>

</xml_diff>

<commit_message>
docs: one shared Calculator/Simulator position; the renamed Simulator tabs
Co-Authored-By: Claude Opus 5 <noreply@anthropic.com>
</commit_message>
<xml_diff>
--- a/docs/manuals/reference-guide/reference-guide.docx
+++ b/docs/manuals/reference-guide/reference-guide.docx
@@ -18463,11 +18463,22 @@
         <w:rPr>
           <w:b/>
         </w:rPr>
-        <w:t>Copy to Simulator</w:t>
-      </w:r>
-      <w:r>
-        <w:rPr/>
-        <w:t xml:space="preserve"> sends the exact legs across. </w:t>
+        <w:t>The Simulator shows this same position</w:t>
+      </w:r>
+      <w:r>
+        <w:rPr/>
+        <w:t xml:space="preserve"> — the Calculator and the Simulator work on </w:t>
+      </w:r>
+      <w:r>
+        <w:rPr>
+          <w:b/>
+        </w:rPr>
+        <w:t>one shared position</w:t>
+      </w:r>
+      <w:r>
+        <w:rPr/>
+        <w:t xml:space="preserve"> — the same symbol, strategy, legs and selected expiration. Whichever page you edited last is what the other one opens with, so there is nothing to copy between them.</w:t>
+        <w:br/>
       </w:r>
       <w:r>
         <w:rPr>
@@ -18477,7 +18488,7 @@
       </w:r>
       <w:r>
         <w:rPr/>
-        <w:t xml:space="preserve"> charts them.</w:t>
+        <w:t xml:space="preserve"> charts the legs.</w:t>
       </w:r>
     </w:p>
     <w:p>
@@ -19160,51 +19171,15 @@
     <w:p>
       <w:r>
         <w:rPr/>
-        <w:t>Then use the three subtabs:</w:t>
-      </w:r>
-    </w:p>
-    <w:p>
-      <w:r>
-        <w:rPr>
-          <w:b/>
-        </w:rPr>
-        <w:t>Replay.</w:t>
-      </w:r>
-      <w:r>
-        <w:rPr/>
-        <w:t xml:space="preserve"> Re-prices the whole netted position along the underlying's recent actual</w:t>
-        <w:br/>
-        <w:t xml:space="preserve">price path. Stacked panels show price, the position's own </w:t>
-      </w:r>
-      <w:r>
-        <w:rPr>
-          <w:b/>
-        </w:rPr>
-        <w:t>profit and loss</w:t>
-      </w:r>
-      <w:r>
-        <w:rPr/>
-        <w:t xml:space="preserve"> from the</w:t>
-        <w:br/>
-        <w:t>first bar, and four Greeks, over a dated axis; the scrub cursor's line states each</w:t>
-        <w:br/>
-        <w:t>bar's price, profit or loss and delta.</w:t>
-      </w:r>
-    </w:p>
-    <w:p>
-      <w:r>
-        <w:rPr/>
-        <w:t>This is the most under-used view in the app. It answers "would I have been stopped out</w:t>
-        <w:br/>
-        <w:t>of this?" using real historical movement rather than a hypothetical slider.</w:t>
-      </w:r>
-    </w:p>
-    <w:p>
-      <w:r>
-        <w:rPr>
-          <w:b/>
-        </w:rPr>
-        <w:t>What-if.</w:t>
+        <w:t>Then use the three subtabs, in order:</w:t>
+      </w:r>
+    </w:p>
+    <w:p>
+      <w:r>
+        <w:rPr>
+          <w:b/>
+        </w:rPr>
+        <w:t>Price &amp; Time.</w:t>
       </w:r>
       <w:r>
         <w:rPr/>
@@ -19218,7 +19193,9 @@
       </w:r>
       <w:r>
         <w:rPr/>
-        <w:t>. Two sliders:</w:t>
+        <w:t>. Two</w:t>
+        <w:br/>
+        <w:t>sliders:</w:t>
       </w:r>
     </w:p>
     <w:p>
@@ -19292,7 +19269,7 @@
         <w:rPr>
           <w:b/>
         </w:rPr>
-        <w:t>IV Shock.</w:t>
+        <w:t>Volatility.</w:t>
       </w:r>
       <w:r>
         <w:rPr/>
@@ -19310,27 +19287,71 @@
         <w:br/>
         <w:t>volatility against the shocked one, with the change) under a one-line verdict. This is</w:t>
         <w:br/>
-        <w:t>the view that</w:t>
-        <w:br/>
-        <w:t>explains losses people find inexplicable: a position can be correct on direction and</w:t>
-        <w:br/>
-        <w:t>still lose money because implied volatility collapsed after an event, or gained value</w:t>
-        <w:br/>
-        <w:t>purely because it rose. Selling premium into an IV spike and buying it back after the</w:t>
-        <w:br/>
-        <w:t>crush is the whole basis of event trading.</w:t>
-      </w:r>
-    </w:p>
-    <w:p>
-      <w:r>
-        <w:rPr>
-          <w:b/>
-        </w:rPr>
-        <w:t>Copy to Calculator</w:t>
-      </w:r>
-      <w:r>
-        <w:rPr/>
-        <w:t xml:space="preserve"> sends the legs back the other way.</w:t>
+        <w:t>the view that explains losses people find inexplicable: a position can be correct on</w:t>
+        <w:br/>
+        <w:t>direction and still lose money because implied volatility collapsed after an event, or</w:t>
+        <w:br/>
+        <w:t>gained value purely because it rose. Selling premium into an IV spike and buying it</w:t>
+        <w:br/>
+        <w:t>back after the crush is the whole basis of event trading.</w:t>
+      </w:r>
+    </w:p>
+    <w:p>
+      <w:r>
+        <w:rPr>
+          <w:b/>
+        </w:rPr>
+        <w:t>History.</w:t>
+      </w:r>
+      <w:r>
+        <w:rPr/>
+        <w:t xml:space="preserve"> Re-prices the whole netted position along the underlying's recent actual</w:t>
+        <w:br/>
+        <w:t xml:space="preserve">price path. Stacked panels show price, the position's own </w:t>
+      </w:r>
+      <w:r>
+        <w:rPr>
+          <w:b/>
+        </w:rPr>
+        <w:t>profit and loss</w:t>
+      </w:r>
+      <w:r>
+        <w:rPr/>
+        <w:t xml:space="preserve"> from the</w:t>
+        <w:br/>
+        <w:t>first bar, and four Greeks, over a dated axis; the scrub cursor's line states each</w:t>
+        <w:br/>
+        <w:t>bar's price, profit or loss and delta.</w:t>
+      </w:r>
+    </w:p>
+    <w:p>
+      <w:r>
+        <w:rPr/>
+        <w:t>This is the most under-used view in the app. It answers "would I have been stopped out</w:t>
+        <w:br/>
+        <w:t>of this?" using real historical movement rather than a hypothetical slider.</w:t>
+      </w:r>
+    </w:p>
+    <w:p>
+      <w:r>
+        <w:rPr>
+          <w:b/>
+        </w:rPr>
+        <w:t>One position with the Calculator.</w:t>
+      </w:r>
+      <w:r>
+        <w:rPr/>
+        <w:t xml:space="preserve"> The Simulator opens with the Calculator's</w:t>
+        <w:br/>
+        <w:t>symbol, strategy and legs, and an edit here is what the Calculator opens with next.</w:t>
+        <w:br/>
+        <w:t>Before 2026-09-12 two buttons copied legs between the pages. ⚠ The Simulator cannot</w:t>
+        <w:br/>
+        <w:t>value shares, so a covered call, protective put or collar arrives with its option</w:t>
+        <w:br/>
+        <w:t>legs only and a note; the share legs are carried through untouched and never deleted</w:t>
+        <w:br/>
+        <w:t>by an edit here.</w:t>
       </w:r>
     </w:p>
     <w:p>
@@ -19368,9 +19389,9 @@
         <w:rPr/>
         <w:t>. The three views map exactly onto the three ways a trade goes wrong: the</w:t>
         <w:br/>
-        <w:t>underlying moved (What-if), time ran out (Days passed), or volatility changed (IV</w:t>
-        <w:br/>
-        <w:t>Shock). Testing all three before entering is the single highest-value habit this app</w:t>
+        <w:t>underlying moved or time ran out (Price &amp; Time), or volatility changed</w:t>
+        <w:br/>
+        <w:t>(Volatility). Testing all three before entering is the single highest-value habit this app</w:t>
         <w:br/>
         <w:t>supports.</w:t>
       </w:r>
@@ -19384,7 +19405,7 @@
       </w:r>
       <w:r>
         <w:rPr/>
-        <w:t xml:space="preserve"> Replay uses the underlying's real path but re-prices the option</w:t>
+        <w:t xml:space="preserve"> History uses the underlying's real path but re-prices the option</w:t>
         <w:br/>
         <w:t>with a model, so it cannot reproduce actual bid/ask spreads or fills. Treat it as</w:t>
         <w:br/>
@@ -34388,31 +34409,31 @@
               <w:rPr>
                 <w:b/>
               </w:rPr>
-              <w:t>Replay</w:t>
-            </w:r>
-            <w:r>
-              <w:rPr/>
-              <w:t xml:space="preserve"> (real historical path) · </w:t>
+              <w:t>Price &amp; Time</w:t>
+            </w:r>
+            <w:r>
+              <w:rPr/>
+              <w:t xml:space="preserve"> (price and time sliders) · </w:t>
             </w:r>
             <w:r>
               <w:rPr>
                 <w:b/>
               </w:rPr>
-              <w:t>What-if</w:t>
-            </w:r>
-            <w:r>
-              <w:rPr/>
-              <w:t xml:space="preserve"> (price and time sliders) · </w:t>
+              <w:t>Volatility</w:t>
+            </w:r>
+            <w:r>
+              <w:rPr/>
+              <w:t xml:space="preserve"> (volatility multiplier) · </w:t>
             </w:r>
             <w:r>
               <w:rPr>
                 <w:b/>
               </w:rPr>
-              <w:t>IV Shock</w:t>
-            </w:r>
-            <w:r>
-              <w:rPr/>
-              <w:t xml:space="preserve"> (volatility multiplier)</w:t>
+              <w:t>History</w:t>
+            </w:r>
+            <w:r>
+              <w:rPr/>
+              <w:t xml:space="preserve"> (real historical path)</w:t>
             </w:r>
           </w:p>
         </w:tc>
@@ -36079,7 +36100,7 @@
             <w:r/>
             <w:r>
               <w:rPr/>
-              <w:t>Calculator</w:t>
+              <w:t>Calculator ⇄ Simulator</w:t>
             </w:r>
           </w:p>
         </w:tc>
@@ -36092,9 +36113,9 @@
             <w:r/>
             <w:r>
               <w:rPr>
-                <w:b/>
-              </w:rPr>
-              <w:t>Copy to Simulator</w:t>
+                <w:i/>
+              </w:rPr>
+              <w:t>(nothing to press)</w:t>
             </w:r>
           </w:p>
         </w:tc>
@@ -36107,7 +36128,7 @@
             <w:r/>
             <w:r>
               <w:rPr/>
-              <w:t>Simulator</w:t>
+              <w:t>the other page</w:t>
             </w:r>
           </w:p>
         </w:tc>
@@ -36120,7 +36141,7 @@
             <w:r/>
             <w:r>
               <w:rPr/>
-              <w:t>The exact legs</w:t>
+              <w:t>One shared position: symbol, strategy, legs, selected expiration — whichever page was edited last</w:t>
             </w:r>
           </w:p>
         </w:tc>
@@ -36134,7 +36155,7 @@
             <w:r/>
             <w:r>
               <w:rPr/>
-              <w:t>Simulator</w:t>
+              <w:t>Flow Alerts</w:t>
             </w:r>
           </w:p>
         </w:tc>
@@ -36148,7 +36169,7 @@
               <w:rPr>
                 <w:b/>
               </w:rPr>
-              <w:t>Copy to Calculator</w:t>
+              <w:t>click a row</w:t>
             </w:r>
           </w:p>
         </w:tc>
@@ -36160,7 +36181,7 @@
             <w:r/>
             <w:r>
               <w:rPr/>
-              <w:t>Calculator</w:t>
+              <w:t>Dealer Positioning</w:t>
             </w:r>
           </w:p>
         </w:tc>
@@ -36172,7 +36193,7 @@
             <w:r/>
             <w:r>
               <w:rPr/>
-              <w:t>The exact legs</w:t>
+              <w:t>That row's symbol</w:t>
             </w:r>
           </w:p>
         </w:tc>
@@ -36187,7 +36208,7 @@
             <w:r/>
             <w:r>
               <w:rPr/>
-              <w:t>Flow Alerts</w:t>
+              <w:t>Opportunity Board</w:t>
             </w:r>
           </w:p>
         </w:tc>
@@ -36199,10 +36220,8 @@
           <w:p>
             <w:r/>
             <w:r>
-              <w:rPr>
-                <w:b/>
-              </w:rPr>
-              <w:t>click a row</w:t>
+              <w:rPr/>
+              <w:t>read the row, then open</w:t>
             </w:r>
           </w:p>
         </w:tc>
@@ -36215,7 +36234,7 @@
             <w:r/>
             <w:r>
               <w:rPr/>
-              <w:t>Dealer Positioning</w:t>
+              <w:t>Dealer Positioning · Strategy Finder</w:t>
             </w:r>
           </w:p>
         </w:tc>
@@ -36223,56 +36242,6 @@
           <w:tcPr>
             <w:tcW w:type="dxa" w:w="2160"/>
             <w:shd w:val="clear" w:color="auto" w:fill="F4F6FA"/>
-          </w:tcPr>
-          <w:p>
-            <w:r/>
-            <w:r>
-              <w:rPr/>
-              <w:t>That row's symbol</w:t>
-            </w:r>
-          </w:p>
-        </w:tc>
-      </w:tr>
-      <w:tr>
-        <w:tc>
-          <w:tcPr>
-            <w:tcW w:type="dxa" w:w="2160"/>
-          </w:tcPr>
-          <w:p>
-            <w:r/>
-            <w:r>
-              <w:rPr/>
-              <w:t>Opportunity Board</w:t>
-            </w:r>
-          </w:p>
-        </w:tc>
-        <w:tc>
-          <w:tcPr>
-            <w:tcW w:type="dxa" w:w="2160"/>
-          </w:tcPr>
-          <w:p>
-            <w:r/>
-            <w:r>
-              <w:rPr/>
-              <w:t>read the row, then open</w:t>
-            </w:r>
-          </w:p>
-        </w:tc>
-        <w:tc>
-          <w:tcPr>
-            <w:tcW w:type="dxa" w:w="2160"/>
-          </w:tcPr>
-          <w:p>
-            <w:r/>
-            <w:r>
-              <w:rPr/>
-              <w:t>Dealer Positioning · Strategy Finder</w:t>
-            </w:r>
-          </w:p>
-        </w:tc>
-        <w:tc>
-          <w:tcPr>
-            <w:tcW w:type="dxa" w:w="2160"/>
           </w:tcPr>
           <w:p>
             <w:r/>

</xml_diff>

<commit_message>
feat(calc,sim): grid clicks move a leg; strike and price dropdowns; drop the card layout
- A Bid/Ask click in the chain grid now MOVES the leg on the same side and
  type (entry.pick_target, nearest strike when several match) and adds a leg
  only when none matches (leg_editor.place_pick). Quantity and price source
  stay; a typed price goes, since it described the old contract.
- The strike is a dropdown of the real ladder again (the arrows still step).
  Not with_input: Quasar's filter box has a 50px min-width the page CSS cannot
  override, and it rendered under the step button.
- Each Calculator leg row has a Bid / Mark / Ask dropdown
  (chain_grid.extract_price; a zero side is no reading, never $0.00).
- Table tracks tightened and row text set to 11px so both fit a 1280px window.
- The unused two-line card layout, its grids, accent tokens and .leg-card
  theme rules are deleted; card_tokens -> leg_tokens.

Co-Authored-By: Claude Opus 5 <noreply@anthropic.com>
</commit_message>
<xml_diff>
--- a/docs/manuals/reference-guide/reference-guide.docx
+++ b/docs/manuals/reference-guide/reference-guide.docx
@@ -17314,15 +17314,28 @@
         <w:t>Click a Bid to SELL, an Ask to BUY.</w:t>
       </w:r>
       <w:r>
-        <w:t xml:space="preserve"> ⚠ </w:t>
-      </w:r>
-      <w:r>
-        <w:rPr>
-          <w:b/>
-        </w:rPr>
-        <w:t>The new leg is priced at the MARK</w:t>
-        <w:br/>
-        <w:t xml:space="preserve">   either way</w:t>
+        <w:t xml:space="preserve"> The click </w:t>
+      </w:r>
+      <w:r>
+        <w:rPr>
+          <w:b/>
+        </w:rPr>
+        <w:t>moves</w:t>
+      </w:r>
+      <w:r>
+        <w:t xml:space="preserve"> the leg already on</w:t>
+        <w:br/>
+        <w:t xml:space="preserve">   that side and type (a put Bid moves the short put), and adds a leg only when</w:t>
+        <w:br/>
+        <w:t xml:space="preserve">   there is none — so a template is edited from the chain rather than piled onto.</w:t>
+        <w:br/>
+        <w:t xml:space="preserve">   ⚠ </w:t>
+      </w:r>
+      <w:r>
+        <w:rPr>
+          <w:b/>
+        </w:rPr>
+        <w:t>The leg is priced at the MARK either way</w:t>
       </w:r>
       <w:r>
         <w:t xml:space="preserve"> — the column only decides the side. Pricing a sell at the bid would</w:t>
@@ -17384,9 +17397,22 @@
       <w:r>
         <w:t xml:space="preserve"> read from</w:t>
         <w:br/>
-        <w:t xml:space="preserve">   the chain. The strike is typed (snapped to the real ladder) or stepped with ‹ › and</w:t>
-        <w:br/>
-        <w:t xml:space="preserve">   the ↑ ↓ keys, and each change re-prices the leg — </w:t>
+        <w:t xml:space="preserve">   the chain. The strike is a dropdown of the real ladder, stepped with ‹ ›, and a </w:t>
+      </w:r>
+      <w:r>
+        <w:rPr>
+          <w:b/>
+        </w:rPr>
+        <w:t>Bid /</w:t>
+        <w:br/>
+        <w:t xml:space="preserve">   Mark / Ask</w:t>
+      </w:r>
+      <w:r>
+        <w:t xml:space="preserve"> dropdown picks which side of the quote prices the leg — Mark by</w:t>
+        <w:br/>
+        <w:t xml:space="preserve">   default; Bid or Ask shows what a fill at the natural side would cost. Each</w:t>
+        <w:br/>
+        <w:t xml:space="preserve">   change re-prices the leg — </w:t>
       </w:r>
       <w:r>
         <w:rPr>
@@ -19090,7 +19116,9 @@
         <w:rPr/>
         <w:t>) or the leg rows (BUY/SELL and CALL/PUT</w:t>
         <w:br/>
-        <w:t>toggles, typed-or-stepped strike, the expiry strip for every leg at once). Each leg</w:t>
+        <w:t>toggles, a strike dropdown, the expiry strip for every leg at once). A grid click</w:t>
+        <w:br/>
+        <w:t>moves the leg already on that side rather than adding another. Each leg</w:t>
         <w:br/>
         <w:t xml:space="preserve">row shows its </w:t>
       </w:r>

</xml_diff>

<commit_message>
feat(nav): Strategy Finder moves to the main menu, under Options
/options/swing leaves the Options tab strip and becomes a standalone rail
row in the STRATEGY section, between the Options group and Trade Analyzer.
The route is unchanged, so Send-to links and the gallery shot still resolve.
Breadcrumb reads Strategy > Strategy Finder; the page has no tab strip.

Both end-user manuals move their Strategy Finder section after Rescue to
keep manual order matching the rail, and their menu tables are corrected.

Co-Authored-By: Claude Opus 5 <noreply@anthropic.com>
</commit_message>
<xml_diff>
--- a/docs/manuals/reference-guide/reference-guide.docx
+++ b/docs/manuals/reference-guide/reference-guide.docx
@@ -32,7 +32,7 @@
           <w:color w:val="5B6678"/>
           <w:sz w:val="18"/>
         </w:rPr>
-        <w:t>NeuralStrike · Generated 2026-09-12</w:t>
+        <w:t>NeuralStrike · Generated 2026-09-13</w:t>
       </w:r>
     </w:p>
     <w:p/>
@@ -1098,7 +1098,7 @@
             <w:r/>
             <w:r>
               <w:rPr/>
-              <w:t>▸ Strategy Finder</w:t>
+              <w:t>▸ Expected Move</w:t>
             </w:r>
           </w:p>
         </w:tc>
@@ -1111,7 +1111,7 @@
             <w:r/>
             <w:r>
               <w:rPr/>
-              <w:t>You have one symbol and want the best structure for it.</w:t>
+              <w:t>You want to see whether your strikes sit outside the market's expected range.</w:t>
             </w:r>
           </w:p>
         </w:tc>
@@ -1125,7 +1125,7 @@
             <w:r/>
             <w:r>
               <w:rPr/>
-              <w:t>▸ Expected Move</w:t>
+              <w:t>▸ Captured Signals</w:t>
             </w:r>
           </w:p>
         </w:tc>
@@ -1137,7 +1137,7 @@
             <w:r/>
             <w:r>
               <w:rPr/>
-              <w:t>You want to see whether your strikes sit outside the market's expected range.</w:t>
+              <w:t>You want to follow signals you bookmarked and see if they worked.</w:t>
             </w:r>
           </w:p>
         </w:tc>
@@ -1152,7 +1152,7 @@
             <w:r/>
             <w:r>
               <w:rPr/>
-              <w:t>▸ Captured Signals</w:t>
+              <w:t>▸ Paper Ledger</w:t>
             </w:r>
           </w:p>
         </w:tc>
@@ -1165,7 +1165,7 @@
             <w:r/>
             <w:r>
               <w:rPr/>
-              <w:t>You want to follow signals you bookmarked and see if they worked.</w:t>
+              <w:t>You want your own hand-kept practice trades.</w:t>
             </w:r>
           </w:p>
         </w:tc>
@@ -1179,7 +1179,7 @@
             <w:r/>
             <w:r>
               <w:rPr/>
-              <w:t>▸ Paper Ledger</w:t>
+              <w:t>▸ Paper Account</w:t>
             </w:r>
           </w:p>
         </w:tc>
@@ -1191,7 +1191,7 @@
             <w:r/>
             <w:r>
               <w:rPr/>
-              <w:t>You want your own hand-kept practice trades.</w:t>
+              <w:t>You want the automated practice engine's account.</w:t>
             </w:r>
           </w:p>
         </w:tc>
@@ -1206,7 +1206,7 @@
             <w:r/>
             <w:r>
               <w:rPr/>
-              <w:t>▸ Paper Account</w:t>
+              <w:t>▸ Rescue</w:t>
             </w:r>
           </w:p>
         </w:tc>
@@ -1219,7 +1219,7 @@
             <w:r/>
             <w:r>
               <w:rPr/>
-              <w:t>You want the automated practice engine's account.</w:t>
+              <w:t>You have a credit spread going wrong and want ranked repair options.</w:t>
             </w:r>
           </w:p>
         </w:tc>
@@ -1232,8 +1232,10 @@
           <w:p>
             <w:r/>
             <w:r>
-              <w:rPr/>
-              <w:t>▸ Rescue</w:t>
+              <w:rPr>
+                <w:b/>
+              </w:rPr>
+              <w:t>Strategy Finder</w:t>
             </w:r>
           </w:p>
         </w:tc>
@@ -1245,7 +1247,7 @@
             <w:r/>
             <w:r>
               <w:rPr/>
-              <w:t>You have a credit spread going wrong and want ranked repair options.</w:t>
+              <w:t>You have one symbol and want the best structure for it.</w:t>
             </w:r>
           </w:p>
         </w:tc>
@@ -20975,651 +20977,6 @@
       </w:pPr>
       <w:r>
         <w:rPr/>
-        <w:t>Strategy Finder</w:t>
-      </w:r>
-    </w:p>
-    <w:p>
-      <w:r>
-        <w:rPr>
-          <w:i/>
-        </w:rPr>
-        <w:t xml:space="preserve">Menu: STRATEGY → Options → Strategy Finder · Route </w:t>
-      </w:r>
-      <w:r>
-        <w:rPr>
-          <w:rFonts w:ascii="Consolas" w:hAnsi="Consolas"/>
-          <w:color w:val="334455"/>
-          <w:sz w:val="19"/>
-        </w:rPr>
-        <w:t>/options/swing</w:t>
-      </w:r>
-    </w:p>
-    <w:p>
-      <w:pPr>
-        <w:pStyle w:val="Heading3"/>
-      </w:pPr>
-      <w:r>
-        <w:rPr/>
-        <w:t>What it is</w:t>
-      </w:r>
-    </w:p>
-    <w:p>
-      <w:r>
-        <w:rPr/>
-        <w:t>The Market Scanner inverted. Instead of scanning many symbols for one kind of trade, you</w:t>
-        <w:br/>
-        <w:t xml:space="preserve">give it </w:t>
-      </w:r>
-      <w:r>
-        <w:rPr>
-          <w:b/>
-        </w:rPr>
-        <w:t>one symbol</w:t>
-      </w:r>
-      <w:r>
-        <w:rPr/>
-        <w:t xml:space="preserve"> and it ranks </w:t>
-      </w:r>
-      <w:r>
-        <w:rPr>
-          <w:b/>
-        </w:rPr>
-        <w:t>every strategy family</w:t>
-      </w:r>
-      <w:r>
-        <w:rPr/>
-        <w:t xml:space="preserve"> for that symbol on a single</w:t>
-        <w:br/>
-        <w:t>comparable score.</w:t>
-      </w:r>
-    </w:p>
-    <w:p>
-      <w:pPr>
-        <w:pStyle w:val="Heading3"/>
-      </w:pPr>
-      <w:r>
-        <w:rPr/>
-        <w:t>Where the data comes from</w:t>
-      </w:r>
-    </w:p>
-    <w:tbl>
-      <w:tblPr>
-        <w:tblW w:type="auto" w:w="0"/>
-        <w:jc w:val="left"/>
-        <w:tblLayout w:type="autofit"/>
-        <w:tblLook w:firstColumn="1" w:firstRow="1" w:lastColumn="0" w:lastRow="0" w:noHBand="0" w:noVBand="1" w:val="04A0"/>
-        <w:tblBorders>
-          <w:top w:val="single" w:sz="4" w:space="0" w:color="D8DEE9"/>
-          <w:left w:val="single" w:sz="4" w:space="0" w:color="D8DEE9"/>
-          <w:bottom w:val="single" w:sz="4" w:space="0" w:color="D8DEE9"/>
-          <w:right w:val="single" w:sz="4" w:space="0" w:color="D8DEE9"/>
-          <w:insideH w:val="single" w:sz="4" w:space="0" w:color="D8DEE9"/>
-          <w:insideV w:val="single" w:sz="4" w:space="0" w:color="D8DEE9"/>
-        </w:tblBorders>
-      </w:tblPr>
-      <w:tblGrid>
-        <w:gridCol w:w="4320"/>
-        <w:gridCol w:w="4320"/>
-      </w:tblGrid>
-      <w:tr>
-        <w:tc>
-          <w:tcPr>
-            <w:tcW w:type="dxa" w:w="4320"/>
-            <w:shd w:val="clear" w:color="auto" w:fill="EAF2FB"/>
-          </w:tcPr>
-          <w:p>
-            <w:r>
-              <w:rPr>
-                <w:b/>
-              </w:rPr>
-            </w:r>
-          </w:p>
-        </w:tc>
-        <w:tc>
-          <w:tcPr>
-            <w:tcW w:type="dxa" w:w="4320"/>
-            <w:shd w:val="clear" w:color="auto" w:fill="EAF2FB"/>
-          </w:tcPr>
-          <w:p>
-            <w:r>
-              <w:rPr>
-                <w:b/>
-              </w:rPr>
-            </w:r>
-          </w:p>
-        </w:tc>
-      </w:tr>
-      <w:tr>
-        <w:tc>
-          <w:tcPr>
-            <w:tcW w:type="dxa" w:w="4320"/>
-          </w:tcPr>
-          <w:p>
-            <w:r/>
-            <w:r>
-              <w:rPr/>
-              <w:t>Service</w:t>
-            </w:r>
-          </w:p>
-        </w:tc>
-        <w:tc>
-          <w:tcPr>
-            <w:tcW w:type="dxa" w:w="4320"/>
-          </w:tcPr>
-          <w:p>
-            <w:r/>
-            <w:r>
-              <w:rPr>
-                <w:rFonts w:ascii="Consolas" w:hAnsi="Consolas"/>
-                <w:color w:val="334455"/>
-                <w:sz w:val="19"/>
-              </w:rPr>
-              <w:t>options_svc</w:t>
-            </w:r>
-            <w:r>
-              <w:rPr/>
-              <w:t xml:space="preserve"> (:8211), </w:t>
-            </w:r>
-            <w:r>
-              <w:rPr>
-                <w:rFonts w:ascii="Consolas" w:hAnsi="Consolas"/>
-                <w:color w:val="334455"/>
-                <w:sz w:val="19"/>
-              </w:rPr>
-              <w:t>swing_scan</w:t>
-            </w:r>
-            <w:r>
-              <w:rPr/>
-              <w:t xml:space="preserve"> command → </w:t>
-            </w:r>
-            <w:r>
-              <w:rPr>
-                <w:rFonts w:ascii="Consolas" w:hAnsi="Consolas"/>
-                <w:color w:val="334455"/>
-                <w:sz w:val="19"/>
-              </w:rPr>
-              <w:t>cache:options:swing</w:t>
-            </w:r>
-          </w:p>
-        </w:tc>
-      </w:tr>
-      <w:tr>
-        <w:tc>
-          <w:tcPr>
-            <w:tcW w:type="dxa" w:w="4320"/>
-            <w:shd w:val="clear" w:color="auto" w:fill="F4F6FA"/>
-          </w:tcPr>
-          <w:p>
-            <w:r/>
-            <w:r>
-              <w:rPr/>
-              <w:t>Trigger</w:t>
-            </w:r>
-          </w:p>
-        </w:tc>
-        <w:tc>
-          <w:tcPr>
-            <w:tcW w:type="dxa" w:w="4320"/>
-            <w:shd w:val="clear" w:color="auto" w:fill="F4F6FA"/>
-          </w:tcPr>
-          <w:p>
-            <w:r/>
-            <w:r>
-              <w:rPr/>
-              <w:t xml:space="preserve">On demand — press </w:t>
-            </w:r>
-            <w:r>
-              <w:rPr>
-                <w:b/>
-              </w:rPr>
-              <w:t>Scan</w:t>
-            </w:r>
-          </w:p>
-        </w:tc>
-      </w:tr>
-    </w:tbl>
-    <w:p/>
-    <w:p>
-      <w:pPr>
-        <w:pStyle w:val="Heading3"/>
-      </w:pPr>
-      <w:r>
-        <w:rPr/>
-        <w:t>Reading the screen</w:t>
-      </w:r>
-    </w:p>
-    <w:p>
-      <w:r>
-        <w:rPr>
-          <w:b/>
-        </w:rPr>
-        <w:t>Inputs:</w:t>
-      </w:r>
-      <w:r>
-        <w:rPr/>
-        <w:t xml:space="preserve"> symbol, </w:t>
-      </w:r>
-      <w:r>
-        <w:rPr>
-          <w:b/>
-        </w:rPr>
-        <w:t>DTE min/max</w:t>
-      </w:r>
-      <w:r>
-        <w:rPr/>
-        <w:t xml:space="preserve"> (wider allows more candidates), and a </w:t>
-      </w:r>
-      <w:r>
-        <w:rPr>
-          <w:b/>
-        </w:rPr>
-        <w:t>Strategies</w:t>
-      </w:r>
-      <w:r>
-        <w:rPr/>
-        <w:br/>
-        <w:t>multiselect across three families:</w:t>
-      </w:r>
-    </w:p>
-    <w:p>
-      <w:pPr>
-        <w:pStyle w:val="ListBullet"/>
-      </w:pPr>
-      <w:r>
-        <w:rPr>
-          <w:b/>
-        </w:rPr>
-        <w:t>Directional</w:t>
-      </w:r>
-      <w:r>
-        <w:t xml:space="preserve"> — long and naked short calls and puts.</w:t>
-      </w:r>
-    </w:p>
-    <w:p>
-      <w:pPr>
-        <w:pStyle w:val="ListBullet"/>
-      </w:pPr>
-      <w:r>
-        <w:rPr>
-          <w:b/>
-        </w:rPr>
-        <w:t>Spreads</w:t>
-      </w:r>
-      <w:r>
-        <w:t xml:space="preserve"> — debit (bull call, bear put) and credit (PCS, CCS).</w:t>
-      </w:r>
-    </w:p>
-    <w:p>
-      <w:pPr>
-        <w:pStyle w:val="ListBullet"/>
-      </w:pPr>
-      <w:r>
-        <w:rPr>
-          <w:b/>
-        </w:rPr>
-        <w:t>Neutral</w:t>
-      </w:r>
-      <w:r>
-        <w:t xml:space="preserve"> — iron condors.</w:t>
-      </w:r>
-    </w:p>
-    <w:p>
-      <w:r>
-        <w:rPr/>
-        <w:t xml:space="preserve">An </w:t>
-      </w:r>
-      <w:r>
-        <w:rPr>
-          <w:b/>
-        </w:rPr>
-        <w:t>Advanced</w:t>
-      </w:r>
-      <w:r>
-        <w:rPr/>
-        <w:t xml:space="preserve"> panel exposes the credit-spread filters: put/call </w:t>
-      </w:r>
-      <w:r>
-        <w:rPr>
-          <w:b/>
-        </w:rPr>
-        <w:t>delta</w:t>
-      </w:r>
-      <w:r>
-        <w:rPr/>
-        <w:t xml:space="preserve"> bounds (how</w:t>
-        <w:br/>
-        <w:t>far out-of-the-money the strikes sit — a smaller absolute delta is safer but pays less)</w:t>
-        <w:br/>
-        <w:t xml:space="preserve">and a </w:t>
-      </w:r>
-      <w:r>
-        <w:rPr>
-          <w:b/>
-        </w:rPr>
-        <w:t>minimum credit</w:t>
-      </w:r>
-      <w:r>
-        <w:rPr/>
-        <w:t xml:space="preserve"> percentage.</w:t>
-      </w:r>
-    </w:p>
-    <w:p>
-      <w:r>
-        <w:rPr>
-          <w:b/>
-        </w:rPr>
-        <w:t>The view banner.</w:t>
-      </w:r>
-      <w:r>
-        <w:rPr/>
-        <w:t xml:space="preserve"> Before ranking anything, the scanner </w:t>
-      </w:r>
-      <w:r>
-        <w:rPr>
-          <w:i/>
-        </w:rPr>
-        <w:t>infers a market view</w:t>
-      </w:r>
-      <w:r>
-        <w:rPr/>
-        <w:t xml:space="preserve"> for the</w:t>
-        <w:br/>
-        <w:t>symbol from its technicals and implied volatility — a direction, a conviction level, and</w:t>
-        <w:br/>
-        <w:t>a volatility regime. It then scores each candidate on two things:</w:t>
-      </w:r>
-    </w:p>
-    <w:p>
-      <w:pPr>
-        <w:pStyle w:val="ListNumber"/>
-      </w:pPr>
-      <w:r>
-        <w:rPr>
-          <w:b/>
-        </w:rPr>
-        <w:t>Fit</w:t>
-      </w:r>
-      <w:r>
-        <w:t xml:space="preserve"> — how well the structure matches that inferred view.</w:t>
-      </w:r>
-    </w:p>
-    <w:p>
-      <w:pPr>
-        <w:pStyle w:val="ListNumber"/>
-      </w:pPr>
-      <w:r>
-        <w:rPr>
-          <w:b/>
-        </w:rPr>
-        <w:t>Structural quality</w:t>
-      </w:r>
-      <w:r>
-        <w:t xml:space="preserve"> — whether the trade is well-built regardless of view.</w:t>
-      </w:r>
-    </w:p>
-    <w:p>
-      <w:r>
-        <w:rPr/>
-        <w:t>That is what makes a long call and a put credit spread comparable on one 0–100 number.</w:t>
-      </w:r>
-    </w:p>
-    <w:p>
-      <w:r>
-        <w:rPr>
-          <w:b/>
-        </w:rPr>
-        <w:t>The columns:</w:t>
-      </w:r>
-      <w:r>
-        <w:rPr/>
-        <w:t xml:space="preserve"> Strategy · Bias · Legs · Exp · DTE · Debit/Credit · Max P · Max L ·</w:t>
-        <w:br/>
-        <w:t xml:space="preserve">R:R · PoP · BE (breakeven) · Vol Rank · Score · </w:t>
-      </w:r>
-      <w:r>
-        <w:rPr>
-          <w:b/>
-        </w:rPr>
-        <w:t>Grade</w:t>
-      </w:r>
-      <w:r>
-        <w:rPr/>
-        <w:t>.</w:t>
-      </w:r>
-    </w:p>
-    <w:p>
-      <w:r>
-        <w:rPr>
-          <w:b/>
-        </w:rPr>
-        <w:t>The Grade is quality-gated, not fit-gated</w:t>
-      </w:r>
-      <w:r>
-        <w:rPr/>
-        <w:t xml:space="preserve"> — it is driven by structural quality and</w:t>
-        <w:br/>
-        <w:t>per-family hard gates, and carries a tooltip explaining the reason. A high score with a</w:t>
-        <w:br/>
-        <w:t>poor grade means "fits your view, but badly constructed".</w:t>
-      </w:r>
-    </w:p>
-    <w:p>
-      <w:r>
-        <w:rPr>
-          <w:b/>
-        </w:rPr>
-        <w:t>The status line</w:t>
-      </w:r>
-      <w:r>
-        <w:rPr/>
-        <w:t xml:space="preserve"> reports how many candidates were </w:t>
-      </w:r>
-      <w:r>
-        <w:rPr>
-          <w:b/>
-        </w:rPr>
-        <w:t>cut below the quality bar</w:t>
-      </w:r>
-      <w:r>
-        <w:rPr/>
-        <w:t>. That</w:t>
-        <w:br/>
-        <w:t xml:space="preserve">count is what distinguishes </w:t>
-      </w:r>
-      <w:r>
-        <w:rPr>
-          <w:i/>
-        </w:rPr>
-        <w:t>"the scan found things and rejected them all"</w:t>
-      </w:r>
-      <w:r>
-        <w:rPr/>
-        <w:t xml:space="preserve"> from </w:t>
-      </w:r>
-      <w:r>
-        <w:rPr>
-          <w:i/>
-        </w:rPr>
-        <w:t>"the</w:t>
-        <w:br/>
-        <w:t>scan found nothing"</w:t>
-      </w:r>
-      <w:r>
-        <w:rPr/>
-        <w:t xml:space="preserve"> — two very different situations that would otherwise look identical.</w:t>
-      </w:r>
-    </w:p>
-    <w:p>
-      <w:r>
-        <w:rPr>
-          <w:b/>
-        </w:rPr>
-        <w:t>Row actions</w:t>
-      </w:r>
-      <w:r>
-        <w:rPr/>
-        <w:t xml:space="preserve"> send to </w:t>
-      </w:r>
-      <w:r>
-        <w:rPr>
-          <w:color w:val="5D5294"/>
-        </w:rPr>
-        <w:t>Calculator</w:t>
-      </w:r>
-      <w:r>
-        <w:rPr/>
-        <w:t xml:space="preserve"> or </w:t>
-      </w:r>
-      <w:r>
-        <w:rPr>
-          <w:color w:val="5D5294"/>
-        </w:rPr>
-        <w:t>Expected Move</w:t>
-      </w:r>
-      <w:r>
-        <w:rPr/>
-        <w:t xml:space="preserve"> for</w:t>
-        <w:br/>
-        <w:t>all types, and to paper trading for credit structures (PCS, CCS, IC) and defined-risk</w:t>
-        <w:br/>
-        <w:t>debit structures (long call/put, bull call, bear put). Naked shorts are excluded from</w:t>
-        <w:br/>
-        <w:t>paper trading because their risk is undefined.</w:t>
-      </w:r>
-    </w:p>
-    <w:p>
-      <w:pPr>
-        <w:pStyle w:val="Heading3"/>
-      </w:pPr>
-      <w:r>
-        <w:rPr/>
-        <w:t>Why it matters</w:t>
-      </w:r>
-    </w:p>
-    <w:p>
-      <w:r>
-        <w:rPr/>
-        <w:t>Most traders default to one structure and force every market view through it. This page</w:t>
-        <w:br/>
-        <w:t>inverts that: it starts from what the symbol is actually doing and asks which structure</w:t>
-        <w:br/>
-        <w:t>best expresses it. Frequently the answer is not the one you had in mind.</w:t>
-      </w:r>
-    </w:p>
-    <w:p>
-      <w:r>
-        <w:rPr/>
-        <w:t>The Fit-plus-Quality score is the app's most genuinely useful piece of scoring, because</w:t>
-        <w:br/>
-        <w:t>it makes structures comparable that normally cannot be compared at all.</w:t>
-      </w:r>
-    </w:p>
-    <w:p>
-      <w:r>
-        <w:rPr>
-          <w:b/>
-        </w:rPr>
-        <w:t>Where it is weak.</w:t>
-      </w:r>
-      <w:r>
-        <w:rPr/>
-        <w:t xml:space="preserve"> The inferred view is a model output, not a fact. If you disagree</w:t>
-        <w:br/>
-        <w:t>with the banner, the ranking beneath it is ranking against the wrong hypothesis — read</w:t>
-        <w:br/>
-        <w:t>the banner first and discard the scan if it is wrong.</w:t>
-      </w:r>
-    </w:p>
-    <w:p>
-      <w:pPr>
-        <w:pStyle w:val="Heading3"/>
-      </w:pPr>
-      <w:r>
-        <w:rPr/>
-        <w:t>When to use it</w:t>
-      </w:r>
-    </w:p>
-    <w:p>
-      <w:r>
-        <w:rPr/>
-        <w:t xml:space="preserve">After </w:t>
-      </w:r>
-      <w:r>
-        <w:rPr>
-          <w:color w:val="5D5294"/>
-        </w:rPr>
-        <w:t>Opportunity Board</w:t>
-      </w:r>
-      <w:r>
-        <w:rPr/>
-        <w:t xml:space="preserve"> or </w:t>
-      </w:r>
-      <w:r>
-        <w:rPr>
-          <w:color w:val="5D5294"/>
-        </w:rPr>
-        <w:t>Momentum</w:t>
-      </w:r>
-      <w:r>
-        <w:rPr/>
-        <w:t xml:space="preserve"> surfaces a</w:t>
-        <w:br/>
-        <w:t>symbol, and any time you have a directional opinion and want the best way to express it.</w:t>
-      </w:r>
-    </w:p>
-    <w:p>
-      <w:pPr>
-        <w:pStyle w:val="Heading3"/>
-      </w:pPr>
-      <w:r>
-        <w:rPr/>
-        <w:t>Related pages</w:t>
-      </w:r>
-    </w:p>
-    <w:p>
-      <w:r>
-        <w:rPr>
-          <w:color w:val="5D5294"/>
-        </w:rPr>
-        <w:t>Market Scanner</w:t>
-      </w:r>
-      <w:r>
-        <w:rPr/>
-        <w:t xml:space="preserve"> · </w:t>
-      </w:r>
-      <w:r>
-        <w:rPr>
-          <w:color w:val="5D5294"/>
-        </w:rPr>
-        <w:t>Calculator</w:t>
-      </w:r>
-      <w:r>
-        <w:rPr/>
-        <w:t xml:space="preserve"> ·</w:t>
-        <w:br/>
-      </w:r>
-      <w:r>
-        <w:rPr>
-          <w:color w:val="5D5294"/>
-        </w:rPr>
-        <w:t>Overview</w:t>
-      </w:r>
-      <w:r>
-        <w:rPr/>
-        <w:t xml:space="preserve"> (for the directional opinion itself).</w:t>
-      </w:r>
-    </w:p>
-    <w:p>
-      <w:r>
-        <w:br/>
-      </w:r>
-    </w:p>
-    <w:p>
-      <w:pPr>
-        <w:pStyle w:val="Heading2"/>
-      </w:pPr>
-      <w:r>
-        <w:rPr/>
         <w:t>Income</w:t>
       </w:r>
     </w:p>
@@ -27958,6 +27315,651 @@
       <w:r>
         <w:rPr/>
         <w:t xml:space="preserve"> (to model a repair before applying it).</w:t>
+      </w:r>
+    </w:p>
+    <w:p>
+      <w:r>
+        <w:br/>
+      </w:r>
+    </w:p>
+    <w:p>
+      <w:pPr>
+        <w:pStyle w:val="Heading2"/>
+      </w:pPr>
+      <w:r>
+        <w:rPr/>
+        <w:t>Strategy Finder</w:t>
+      </w:r>
+    </w:p>
+    <w:p>
+      <w:r>
+        <w:rPr>
+          <w:i/>
+        </w:rPr>
+        <w:t xml:space="preserve">Menu: STRATEGY → Strategy Finder · Route </w:t>
+      </w:r>
+      <w:r>
+        <w:rPr>
+          <w:rFonts w:ascii="Consolas" w:hAnsi="Consolas"/>
+          <w:color w:val="334455"/>
+          <w:sz w:val="19"/>
+        </w:rPr>
+        <w:t>/options/swing</w:t>
+      </w:r>
+    </w:p>
+    <w:p>
+      <w:pPr>
+        <w:pStyle w:val="Heading3"/>
+      </w:pPr>
+      <w:r>
+        <w:rPr/>
+        <w:t>What it is</w:t>
+      </w:r>
+    </w:p>
+    <w:p>
+      <w:r>
+        <w:rPr/>
+        <w:t>The Market Scanner inverted. Instead of scanning many symbols for one kind of trade, you</w:t>
+        <w:br/>
+        <w:t xml:space="preserve">give it </w:t>
+      </w:r>
+      <w:r>
+        <w:rPr>
+          <w:b/>
+        </w:rPr>
+        <w:t>one symbol</w:t>
+      </w:r>
+      <w:r>
+        <w:rPr/>
+        <w:t xml:space="preserve"> and it ranks </w:t>
+      </w:r>
+      <w:r>
+        <w:rPr>
+          <w:b/>
+        </w:rPr>
+        <w:t>every strategy family</w:t>
+      </w:r>
+      <w:r>
+        <w:rPr/>
+        <w:t xml:space="preserve"> for that symbol on a single</w:t>
+        <w:br/>
+        <w:t>comparable score.</w:t>
+      </w:r>
+    </w:p>
+    <w:p>
+      <w:pPr>
+        <w:pStyle w:val="Heading3"/>
+      </w:pPr>
+      <w:r>
+        <w:rPr/>
+        <w:t>Where the data comes from</w:t>
+      </w:r>
+    </w:p>
+    <w:tbl>
+      <w:tblPr>
+        <w:tblW w:type="auto" w:w="0"/>
+        <w:jc w:val="left"/>
+        <w:tblLayout w:type="autofit"/>
+        <w:tblLook w:firstColumn="1" w:firstRow="1" w:lastColumn="0" w:lastRow="0" w:noHBand="0" w:noVBand="1" w:val="04A0"/>
+        <w:tblBorders>
+          <w:top w:val="single" w:sz="4" w:space="0" w:color="D8DEE9"/>
+          <w:left w:val="single" w:sz="4" w:space="0" w:color="D8DEE9"/>
+          <w:bottom w:val="single" w:sz="4" w:space="0" w:color="D8DEE9"/>
+          <w:right w:val="single" w:sz="4" w:space="0" w:color="D8DEE9"/>
+          <w:insideH w:val="single" w:sz="4" w:space="0" w:color="D8DEE9"/>
+          <w:insideV w:val="single" w:sz="4" w:space="0" w:color="D8DEE9"/>
+        </w:tblBorders>
+      </w:tblPr>
+      <w:tblGrid>
+        <w:gridCol w:w="4320"/>
+        <w:gridCol w:w="4320"/>
+      </w:tblGrid>
+      <w:tr>
+        <w:tc>
+          <w:tcPr>
+            <w:tcW w:type="dxa" w:w="4320"/>
+            <w:shd w:val="clear" w:color="auto" w:fill="EAF2FB"/>
+          </w:tcPr>
+          <w:p>
+            <w:r>
+              <w:rPr>
+                <w:b/>
+              </w:rPr>
+            </w:r>
+          </w:p>
+        </w:tc>
+        <w:tc>
+          <w:tcPr>
+            <w:tcW w:type="dxa" w:w="4320"/>
+            <w:shd w:val="clear" w:color="auto" w:fill="EAF2FB"/>
+          </w:tcPr>
+          <w:p>
+            <w:r>
+              <w:rPr>
+                <w:b/>
+              </w:rPr>
+            </w:r>
+          </w:p>
+        </w:tc>
+      </w:tr>
+      <w:tr>
+        <w:tc>
+          <w:tcPr>
+            <w:tcW w:type="dxa" w:w="4320"/>
+          </w:tcPr>
+          <w:p>
+            <w:r/>
+            <w:r>
+              <w:rPr/>
+              <w:t>Service</w:t>
+            </w:r>
+          </w:p>
+        </w:tc>
+        <w:tc>
+          <w:tcPr>
+            <w:tcW w:type="dxa" w:w="4320"/>
+          </w:tcPr>
+          <w:p>
+            <w:r/>
+            <w:r>
+              <w:rPr>
+                <w:rFonts w:ascii="Consolas" w:hAnsi="Consolas"/>
+                <w:color w:val="334455"/>
+                <w:sz w:val="19"/>
+              </w:rPr>
+              <w:t>options_svc</w:t>
+            </w:r>
+            <w:r>
+              <w:rPr/>
+              <w:t xml:space="preserve"> (:8211), </w:t>
+            </w:r>
+            <w:r>
+              <w:rPr>
+                <w:rFonts w:ascii="Consolas" w:hAnsi="Consolas"/>
+                <w:color w:val="334455"/>
+                <w:sz w:val="19"/>
+              </w:rPr>
+              <w:t>swing_scan</w:t>
+            </w:r>
+            <w:r>
+              <w:rPr/>
+              <w:t xml:space="preserve"> command → </w:t>
+            </w:r>
+            <w:r>
+              <w:rPr>
+                <w:rFonts w:ascii="Consolas" w:hAnsi="Consolas"/>
+                <w:color w:val="334455"/>
+                <w:sz w:val="19"/>
+              </w:rPr>
+              <w:t>cache:options:swing</w:t>
+            </w:r>
+          </w:p>
+        </w:tc>
+      </w:tr>
+      <w:tr>
+        <w:tc>
+          <w:tcPr>
+            <w:tcW w:type="dxa" w:w="4320"/>
+            <w:shd w:val="clear" w:color="auto" w:fill="F4F6FA"/>
+          </w:tcPr>
+          <w:p>
+            <w:r/>
+            <w:r>
+              <w:rPr/>
+              <w:t>Trigger</w:t>
+            </w:r>
+          </w:p>
+        </w:tc>
+        <w:tc>
+          <w:tcPr>
+            <w:tcW w:type="dxa" w:w="4320"/>
+            <w:shd w:val="clear" w:color="auto" w:fill="F4F6FA"/>
+          </w:tcPr>
+          <w:p>
+            <w:r/>
+            <w:r>
+              <w:rPr/>
+              <w:t xml:space="preserve">On demand — press </w:t>
+            </w:r>
+            <w:r>
+              <w:rPr>
+                <w:b/>
+              </w:rPr>
+              <w:t>Scan</w:t>
+            </w:r>
+          </w:p>
+        </w:tc>
+      </w:tr>
+    </w:tbl>
+    <w:p/>
+    <w:p>
+      <w:pPr>
+        <w:pStyle w:val="Heading3"/>
+      </w:pPr>
+      <w:r>
+        <w:rPr/>
+        <w:t>Reading the screen</w:t>
+      </w:r>
+    </w:p>
+    <w:p>
+      <w:r>
+        <w:rPr>
+          <w:b/>
+        </w:rPr>
+        <w:t>Inputs:</w:t>
+      </w:r>
+      <w:r>
+        <w:rPr/>
+        <w:t xml:space="preserve"> symbol, </w:t>
+      </w:r>
+      <w:r>
+        <w:rPr>
+          <w:b/>
+        </w:rPr>
+        <w:t>DTE min/max</w:t>
+      </w:r>
+      <w:r>
+        <w:rPr/>
+        <w:t xml:space="preserve"> (wider allows more candidates), and a </w:t>
+      </w:r>
+      <w:r>
+        <w:rPr>
+          <w:b/>
+        </w:rPr>
+        <w:t>Strategies</w:t>
+      </w:r>
+      <w:r>
+        <w:rPr/>
+        <w:br/>
+        <w:t>multiselect across three families:</w:t>
+      </w:r>
+    </w:p>
+    <w:p>
+      <w:pPr>
+        <w:pStyle w:val="ListBullet"/>
+      </w:pPr>
+      <w:r>
+        <w:rPr>
+          <w:b/>
+        </w:rPr>
+        <w:t>Directional</w:t>
+      </w:r>
+      <w:r>
+        <w:t xml:space="preserve"> — long and naked short calls and puts.</w:t>
+      </w:r>
+    </w:p>
+    <w:p>
+      <w:pPr>
+        <w:pStyle w:val="ListBullet"/>
+      </w:pPr>
+      <w:r>
+        <w:rPr>
+          <w:b/>
+        </w:rPr>
+        <w:t>Spreads</w:t>
+      </w:r>
+      <w:r>
+        <w:t xml:space="preserve"> — debit (bull call, bear put) and credit (PCS, CCS).</w:t>
+      </w:r>
+    </w:p>
+    <w:p>
+      <w:pPr>
+        <w:pStyle w:val="ListBullet"/>
+      </w:pPr>
+      <w:r>
+        <w:rPr>
+          <w:b/>
+        </w:rPr>
+        <w:t>Neutral</w:t>
+      </w:r>
+      <w:r>
+        <w:t xml:space="preserve"> — iron condors.</w:t>
+      </w:r>
+    </w:p>
+    <w:p>
+      <w:r>
+        <w:rPr/>
+        <w:t xml:space="preserve">An </w:t>
+      </w:r>
+      <w:r>
+        <w:rPr>
+          <w:b/>
+        </w:rPr>
+        <w:t>Advanced</w:t>
+      </w:r>
+      <w:r>
+        <w:rPr/>
+        <w:t xml:space="preserve"> panel exposes the credit-spread filters: put/call </w:t>
+      </w:r>
+      <w:r>
+        <w:rPr>
+          <w:b/>
+        </w:rPr>
+        <w:t>delta</w:t>
+      </w:r>
+      <w:r>
+        <w:rPr/>
+        <w:t xml:space="preserve"> bounds (how</w:t>
+        <w:br/>
+        <w:t>far out-of-the-money the strikes sit — a smaller absolute delta is safer but pays less)</w:t>
+        <w:br/>
+        <w:t xml:space="preserve">and a </w:t>
+      </w:r>
+      <w:r>
+        <w:rPr>
+          <w:b/>
+        </w:rPr>
+        <w:t>minimum credit</w:t>
+      </w:r>
+      <w:r>
+        <w:rPr/>
+        <w:t xml:space="preserve"> percentage.</w:t>
+      </w:r>
+    </w:p>
+    <w:p>
+      <w:r>
+        <w:rPr>
+          <w:b/>
+        </w:rPr>
+        <w:t>The view banner.</w:t>
+      </w:r>
+      <w:r>
+        <w:rPr/>
+        <w:t xml:space="preserve"> Before ranking anything, the scanner </w:t>
+      </w:r>
+      <w:r>
+        <w:rPr>
+          <w:i/>
+        </w:rPr>
+        <w:t>infers a market view</w:t>
+      </w:r>
+      <w:r>
+        <w:rPr/>
+        <w:t xml:space="preserve"> for the</w:t>
+        <w:br/>
+        <w:t>symbol from its technicals and implied volatility — a direction, a conviction level, and</w:t>
+        <w:br/>
+        <w:t>a volatility regime. It then scores each candidate on two things:</w:t>
+      </w:r>
+    </w:p>
+    <w:p>
+      <w:pPr>
+        <w:pStyle w:val="ListNumber"/>
+      </w:pPr>
+      <w:r>
+        <w:rPr>
+          <w:b/>
+        </w:rPr>
+        <w:t>Fit</w:t>
+      </w:r>
+      <w:r>
+        <w:t xml:space="preserve"> — how well the structure matches that inferred view.</w:t>
+      </w:r>
+    </w:p>
+    <w:p>
+      <w:pPr>
+        <w:pStyle w:val="ListNumber"/>
+      </w:pPr>
+      <w:r>
+        <w:rPr>
+          <w:b/>
+        </w:rPr>
+        <w:t>Structural quality</w:t>
+      </w:r>
+      <w:r>
+        <w:t xml:space="preserve"> — whether the trade is well-built regardless of view.</w:t>
+      </w:r>
+    </w:p>
+    <w:p>
+      <w:r>
+        <w:rPr/>
+        <w:t>That is what makes a long call and a put credit spread comparable on one 0–100 number.</w:t>
+      </w:r>
+    </w:p>
+    <w:p>
+      <w:r>
+        <w:rPr>
+          <w:b/>
+        </w:rPr>
+        <w:t>The columns:</w:t>
+      </w:r>
+      <w:r>
+        <w:rPr/>
+        <w:t xml:space="preserve"> Strategy · Bias · Legs · Exp · DTE · Debit/Credit · Max P · Max L ·</w:t>
+        <w:br/>
+        <w:t xml:space="preserve">R:R · PoP · BE (breakeven) · Vol Rank · Score · </w:t>
+      </w:r>
+      <w:r>
+        <w:rPr>
+          <w:b/>
+        </w:rPr>
+        <w:t>Grade</w:t>
+      </w:r>
+      <w:r>
+        <w:rPr/>
+        <w:t>.</w:t>
+      </w:r>
+    </w:p>
+    <w:p>
+      <w:r>
+        <w:rPr>
+          <w:b/>
+        </w:rPr>
+        <w:t>The Grade is quality-gated, not fit-gated</w:t>
+      </w:r>
+      <w:r>
+        <w:rPr/>
+        <w:t xml:space="preserve"> — it is driven by structural quality and</w:t>
+        <w:br/>
+        <w:t>per-family hard gates, and carries a tooltip explaining the reason. A high score with a</w:t>
+        <w:br/>
+        <w:t>poor grade means "fits your view, but badly constructed".</w:t>
+      </w:r>
+    </w:p>
+    <w:p>
+      <w:r>
+        <w:rPr>
+          <w:b/>
+        </w:rPr>
+        <w:t>The status line</w:t>
+      </w:r>
+      <w:r>
+        <w:rPr/>
+        <w:t xml:space="preserve"> reports how many candidates were </w:t>
+      </w:r>
+      <w:r>
+        <w:rPr>
+          <w:b/>
+        </w:rPr>
+        <w:t>cut below the quality bar</w:t>
+      </w:r>
+      <w:r>
+        <w:rPr/>
+        <w:t>. That</w:t>
+        <w:br/>
+        <w:t xml:space="preserve">count is what distinguishes </w:t>
+      </w:r>
+      <w:r>
+        <w:rPr>
+          <w:i/>
+        </w:rPr>
+        <w:t>"the scan found things and rejected them all"</w:t>
+      </w:r>
+      <w:r>
+        <w:rPr/>
+        <w:t xml:space="preserve"> from </w:t>
+      </w:r>
+      <w:r>
+        <w:rPr>
+          <w:i/>
+        </w:rPr>
+        <w:t>"the</w:t>
+        <w:br/>
+        <w:t>scan found nothing"</w:t>
+      </w:r>
+      <w:r>
+        <w:rPr/>
+        <w:t xml:space="preserve"> — two very different situations that would otherwise look identical.</w:t>
+      </w:r>
+    </w:p>
+    <w:p>
+      <w:r>
+        <w:rPr>
+          <w:b/>
+        </w:rPr>
+        <w:t>Row actions</w:t>
+      </w:r>
+      <w:r>
+        <w:rPr/>
+        <w:t xml:space="preserve"> send to </w:t>
+      </w:r>
+      <w:r>
+        <w:rPr>
+          <w:color w:val="5D5294"/>
+        </w:rPr>
+        <w:t>Calculator</w:t>
+      </w:r>
+      <w:r>
+        <w:rPr/>
+        <w:t xml:space="preserve"> or </w:t>
+      </w:r>
+      <w:r>
+        <w:rPr>
+          <w:color w:val="5D5294"/>
+        </w:rPr>
+        <w:t>Expected Move</w:t>
+      </w:r>
+      <w:r>
+        <w:rPr/>
+        <w:t xml:space="preserve"> for</w:t>
+        <w:br/>
+        <w:t>all types, and to paper trading for credit structures (PCS, CCS, IC) and defined-risk</w:t>
+        <w:br/>
+        <w:t>debit structures (long call/put, bull call, bear put). Naked shorts are excluded from</w:t>
+        <w:br/>
+        <w:t>paper trading because their risk is undefined.</w:t>
+      </w:r>
+    </w:p>
+    <w:p>
+      <w:pPr>
+        <w:pStyle w:val="Heading3"/>
+      </w:pPr>
+      <w:r>
+        <w:rPr/>
+        <w:t>Why it matters</w:t>
+      </w:r>
+    </w:p>
+    <w:p>
+      <w:r>
+        <w:rPr/>
+        <w:t>Most traders default to one structure and force every market view through it. This page</w:t>
+        <w:br/>
+        <w:t>inverts that: it starts from what the symbol is actually doing and asks which structure</w:t>
+        <w:br/>
+        <w:t>best expresses it. Frequently the answer is not the one you had in mind.</w:t>
+      </w:r>
+    </w:p>
+    <w:p>
+      <w:r>
+        <w:rPr/>
+        <w:t>The Fit-plus-Quality score is the app's most genuinely useful piece of scoring, because</w:t>
+        <w:br/>
+        <w:t>it makes structures comparable that normally cannot be compared at all.</w:t>
+      </w:r>
+    </w:p>
+    <w:p>
+      <w:r>
+        <w:rPr>
+          <w:b/>
+        </w:rPr>
+        <w:t>Where it is weak.</w:t>
+      </w:r>
+      <w:r>
+        <w:rPr/>
+        <w:t xml:space="preserve"> The inferred view is a model output, not a fact. If you disagree</w:t>
+        <w:br/>
+        <w:t>with the banner, the ranking beneath it is ranking against the wrong hypothesis — read</w:t>
+        <w:br/>
+        <w:t>the banner first and discard the scan if it is wrong.</w:t>
+      </w:r>
+    </w:p>
+    <w:p>
+      <w:pPr>
+        <w:pStyle w:val="Heading3"/>
+      </w:pPr>
+      <w:r>
+        <w:rPr/>
+        <w:t>When to use it</w:t>
+      </w:r>
+    </w:p>
+    <w:p>
+      <w:r>
+        <w:rPr/>
+        <w:t xml:space="preserve">After </w:t>
+      </w:r>
+      <w:r>
+        <w:rPr>
+          <w:color w:val="5D5294"/>
+        </w:rPr>
+        <w:t>Opportunity Board</w:t>
+      </w:r>
+      <w:r>
+        <w:rPr/>
+        <w:t xml:space="preserve"> or </w:t>
+      </w:r>
+      <w:r>
+        <w:rPr>
+          <w:color w:val="5D5294"/>
+        </w:rPr>
+        <w:t>Momentum</w:t>
+      </w:r>
+      <w:r>
+        <w:rPr/>
+        <w:t xml:space="preserve"> surfaces a</w:t>
+        <w:br/>
+        <w:t>symbol, and any time you have a directional opinion and want the best way to express it.</w:t>
+      </w:r>
+    </w:p>
+    <w:p>
+      <w:pPr>
+        <w:pStyle w:val="Heading3"/>
+      </w:pPr>
+      <w:r>
+        <w:rPr/>
+        <w:t>Related pages</w:t>
+      </w:r>
+    </w:p>
+    <w:p>
+      <w:r>
+        <w:rPr>
+          <w:color w:val="5D5294"/>
+        </w:rPr>
+        <w:t>Market Scanner</w:t>
+      </w:r>
+      <w:r>
+        <w:rPr/>
+        <w:t xml:space="preserve"> · </w:t>
+      </w:r>
+      <w:r>
+        <w:rPr>
+          <w:color w:val="5D5294"/>
+        </w:rPr>
+        <w:t>Calculator</w:t>
+      </w:r>
+      <w:r>
+        <w:rPr/>
+        <w:t xml:space="preserve"> ·</w:t>
+        <w:br/>
+      </w:r>
+      <w:r>
+        <w:rPr>
+          <w:color w:val="5D5294"/>
+        </w:rPr>
+        <w:t>Overview</w:t>
+      </w:r>
+      <w:r>
+        <w:rPr/>
+        <w:t xml:space="preserve"> (for the directional opinion itself).</w:t>
       </w:r>
     </w:p>
     <w:p>

</xml_diff>

<commit_message>
docs(finder): the 7-day front, mispriced wings, and the detail panel
Straddles, strangles, flies, the iron fly, condors and share structures sit
on an expiry at least 7 days out; long flies/condors priced for a credit
(or iron flies for a debit) are not emitted; the Paper Ledger refuses a
debit trade with no debit; the detail panel's share legs, per-leg expiries,
joined breakevens and per-position units; the renamed Advanced expander;
and the Income entry_score calibration basis change from the per-expiry
breakeven move. The design doc's 'the existing nine do not move' is
corrected in place: their grades did, their payoff economics did not.

Co-Authored-By: Claude Opus 5 <noreply@anthropic.com>
</commit_message>
<xml_diff>
--- a/docs/manuals/reference-guide/reference-guide.docx
+++ b/docs/manuals/reference-guide/reference-guide.docx
@@ -27993,17 +27993,17 @@
     <w:p>
       <w:r>
         <w:rPr/>
-        <w:t xml:space="preserve">An </w:t>
-      </w:r>
-      <w:r>
-        <w:rPr>
-          <w:b/>
-        </w:rPr>
-        <w:t>Advanced</w:t>
-      </w:r>
-      <w:r>
-        <w:rPr/>
-        <w:t xml:space="preserve"> panel exposes the credit-spread filters: put/call </w:t>
+        <w:t xml:space="preserve">A collapsed </w:t>
+      </w:r>
+      <w:r>
+        <w:rPr>
+          <w:b/>
+        </w:rPr>
+        <w:t>Advanced — delta bands and credit floor</w:t>
+      </w:r>
+      <w:r>
+        <w:rPr/>
+        <w:t xml:space="preserve"> panel holds put/call </w:t>
       </w:r>
       <w:r>
         <w:rPr>
@@ -28013,11 +28013,10 @@
       </w:r>
       <w:r>
         <w:rPr/>
-        <w:t xml:space="preserve"> bounds (how</w:t>
-        <w:br/>
-        <w:t>far out-of-the-money the strikes sit — a smaller absolute delta is safer but pays less)</w:t>
-        <w:br/>
-        <w:t xml:space="preserve">and a </w:t>
+        <w:br/>
+        <w:t>bounds (how far out-of-the-money the sold strikes sit — a smaller absolute delta is safer</w:t>
+        <w:br/>
+        <w:t xml:space="preserve">but pays less) and a </w:t>
       </w:r>
       <w:r>
         <w:rPr>
@@ -28027,7 +28026,9 @@
       </w:r>
       <w:r>
         <w:rPr/>
-        <w:t xml:space="preserve"> percentage. The delta bounds also place every other sold</w:t>
+        <w:t xml:space="preserve"> percentage, which filters the credit spreads</w:t>
+        <w:br/>
+        <w:t>only. The delta bounds place the credit spreads' short strikes and also every other sold</w:t>
         <w:br/>
         <w:t xml:space="preserve">option that is out of the money by design — the Directional </w:t>
       </w:r>
@@ -28112,25 +28113,33 @@
         <w:rPr>
           <w:b/>
         </w:rPr>
-        <w:t>Straddle, butterfly body, iron butterfly body</w:t>
-      </w:r>
-      <w:r>
-        <w:t xml:space="preserve"> — the at-the-money strike. If that</w:t>
-        <w:br/>
-        <w:t xml:space="preserve">  strike is missing from either side of the chain the structure is </w:t>
-      </w:r>
-      <w:r>
-        <w:rPr>
-          <w:b/>
-        </w:rPr>
-        <w:t>skipped</w:t>
-      </w:r>
-      <w:r>
-        <w:t>, never</w:t>
-        <w:br/>
-        <w:t xml:space="preserve">  moved to the next strike: an off-centre "straddle" is a different trade under a neutral</w:t>
-        <w:br/>
-        <w:t xml:space="preserve">  name.</w:t>
+        <w:t>Which expiration</w:t>
+      </w:r>
+      <w:r>
+        <w:t xml:space="preserve"> — every newer structure except the calendar and diagonal (which</w:t>
+        <w:br/>
+        <w:t xml:space="preserve">  take two, below) sits on the </w:t>
+      </w:r>
+      <w:r>
+        <w:rPr>
+          <w:b/>
+        </w:rPr>
+        <w:t>nearest expiration at least 7 days out</w:t>
+      </w:r>
+      <w:r>
+        <w:t xml:space="preserve"> inside your</w:t>
+        <w:br/>
+        <w:t xml:space="preserve">  DTE range: straddles, strangles, butterflies, the iron butterfly, condors and the</w:t>
+        <w:br/>
+        <w:t xml:space="preserve">  share structures. With DTE min at 0 none of them is built on a 0–6 day expiration,</w:t>
+        <w:br/>
+        <w:t xml:space="preserve">  and nothing needs widening for it — the floor applies by itself. A structure that</w:t>
+        <w:br/>
+        <w:t xml:space="preserve">  close to expiry is a same-day bet rather than the trade its name describes (an</w:t>
+        <w:br/>
+        <w:t xml:space="preserve">  operator decision). The Directional rows and the debit and credit spreads still take</w:t>
+        <w:br/>
+        <w:t xml:space="preserve">  the nearest expiration in the range.</w:t>
       </w:r>
     </w:p>
     <w:p>
@@ -28141,23 +28150,25 @@
         <w:rPr>
           <w:b/>
         </w:rPr>
-        <w:t>Long strangle</w:t>
-      </w:r>
-      <w:r>
-        <w:t xml:space="preserve"> — its own out-of-the-money wings near </w:t>
-      </w:r>
-      <w:r>
-        <w:rPr>
-          <w:b/>
-        </w:rPr>
-        <w:t>0.30 delta</w:t>
-      </w:r>
-      <w:r>
-        <w:t>, not the short</w:t>
-        <w:br/>
-        <w:t xml:space="preserve">  strangle's strikes. Bought at the delta band's midpoint (~0.15 delta) it could never</w:t>
-        <w:br/>
-        <w:t xml:space="preserve">  win often enough to pass.</w:t>
+        <w:t>Straddle, butterfly body, iron butterfly body</w:t>
+      </w:r>
+      <w:r>
+        <w:t xml:space="preserve"> — the at-the-money strike. If that</w:t>
+        <w:br/>
+        <w:t xml:space="preserve">  strike is missing from either side of the chain the structure is </w:t>
+      </w:r>
+      <w:r>
+        <w:rPr>
+          <w:b/>
+        </w:rPr>
+        <w:t>skipped</w:t>
+      </w:r>
+      <w:r>
+        <w:t>, never</w:t>
+        <w:br/>
+        <w:t xml:space="preserve">  moved to the next strike: an off-centre "straddle" is a different trade under a neutral</w:t>
+        <w:br/>
+        <w:t xml:space="preserve">  name.</w:t>
       </w:r>
     </w:p>
     <w:p>
@@ -28168,32 +28179,23 @@
         <w:rPr>
           <w:b/>
         </w:rPr>
-        <w:t>Butterfly and condor wings</w:t>
-      </w:r>
-      <w:r>
-        <w:t xml:space="preserve"> — the distance, listed on </w:t>
-      </w:r>
-      <w:r>
-        <w:rPr>
-          <w:b/>
-        </w:rPr>
-        <w:t>both</w:t>
-      </w:r>
-      <w:r>
-        <w:t xml:space="preserve"> sides of the body,</w:t>
-        <w:br/>
-        <w:t xml:space="preserve">  nearest </w:t>
-      </w:r>
-      <w:r>
-        <w:rPr>
-          <w:b/>
-        </w:rPr>
-        <w:t>half the 1-σ expected move</w:t>
-      </w:r>
-      <w:r>
-        <w:t>. A condor's shorts sit one wing out, its longs</w:t>
-        <w:br/>
-        <w:t xml:space="preserve">  two. Symmetric on purpose: a broken wing is a different risk profile.</w:t>
+        <w:t>Long strangle</w:t>
+      </w:r>
+      <w:r>
+        <w:t xml:space="preserve"> — its own out-of-the-money wings near </w:t>
+      </w:r>
+      <w:r>
+        <w:rPr>
+          <w:b/>
+        </w:rPr>
+        <w:t>0.30 delta</w:t>
+      </w:r>
+      <w:r>
+        <w:t>, not the short</w:t>
+        <w:br/>
+        <w:t xml:space="preserve">  strangle's strikes. Bought at the delta band's midpoint (~0.15 delta) it could never</w:t>
+        <w:br/>
+        <w:t xml:space="preserve">  win often enough to pass.</w:t>
       </w:r>
     </w:p>
     <w:p>
@@ -28204,34 +28206,32 @@
         <w:rPr>
           <w:b/>
         </w:rPr>
-        <w:t>Calendar</w:t>
-      </w:r>
-      <w:r>
-        <w:t xml:space="preserve"> — the near expiration at least </w:t>
-      </w:r>
-      <w:r>
-        <w:rPr>
-          <w:b/>
-        </w:rPr>
-        <w:t>7 days</w:t>
-      </w:r>
-      <w:r>
-        <w:t xml:space="preserve"> out, the later one nearest</w:t>
-        <w:br/>
-        <w:t xml:space="preserve">  </w:t>
-      </w:r>
-      <w:r>
-        <w:rPr>
-          <w:b/>
-        </w:rPr>
-        <w:t>near + 28 days</w:t>
-      </w:r>
-      <w:r>
-        <w:t xml:space="preserve"> and at least a week after it, both inside your DTE range; same</w:t>
-        <w:br/>
-        <w:t xml:space="preserve">  at-the-money strike. Skipped when either month's strike ladder has a hole at the money.</w:t>
-        <w:br/>
-        <w:t xml:space="preserve">  If DTE max does not reach a second expiration, no calendar is built — widen it.</w:t>
+        <w:t>Butterfly and condor wings</w:t>
+      </w:r>
+      <w:r>
+        <w:t xml:space="preserve"> — the distance, listed on </w:t>
+      </w:r>
+      <w:r>
+        <w:rPr>
+          <w:b/>
+        </w:rPr>
+        <w:t>both</w:t>
+      </w:r>
+      <w:r>
+        <w:t xml:space="preserve"> sides of the body,</w:t>
+        <w:br/>
+        <w:t xml:space="preserve">  nearest </w:t>
+      </w:r>
+      <w:r>
+        <w:rPr>
+          <w:b/>
+        </w:rPr>
+        <w:t>half the 1-σ expected move</w:t>
+      </w:r>
+      <w:r>
+        <w:t>. A condor's shorts sit one wing out, its longs</w:t>
+        <w:br/>
+        <w:t xml:space="preserve">  two. Symmetric on purpose: a broken wing is a different risk profile.</w:t>
       </w:r>
     </w:p>
     <w:p>
@@ -28242,34 +28242,47 @@
         <w:rPr>
           <w:b/>
         </w:rPr>
-        <w:t>Diagonal</w:t>
-      </w:r>
-      <w:r>
-        <w:t xml:space="preserve"> — short the near month out of the money near </w:t>
-      </w:r>
-      <w:r>
-        <w:rPr>
-          <w:b/>
-        </w:rPr>
-        <w:t>0.30 delta</w:t>
-      </w:r>
-      <w:r>
-        <w:t xml:space="preserve"> (accepted</w:t>
-        <w:br/>
-        <w:t xml:space="preserve">  only between 0.15 and 0.45), long the later month in the money near </w:t>
-      </w:r>
-      <w:r>
-        <w:rPr>
-          <w:b/>
-        </w:rPr>
-        <w:t>0.70 delta</w:t>
-      </w:r>
-      <w:r>
-        <w:t>.</w:t>
-        <w:br/>
-        <w:t xml:space="preserve">  Skipped when the debit reaches the width between the two strikes, since it then has no</w:t>
-        <w:br/>
-        <w:t xml:space="preserve">  upside worth the name.</w:t>
+        <w:t>Butterfly and condor prices</w:t>
+      </w:r>
+      <w:r>
+        <w:t xml:space="preserve"> — a long butterfly or condor is worth between nothing</w:t>
+        <w:br/>
+        <w:t xml:space="preserve">  and its wing at expiry, so it must cost a </w:t>
+      </w:r>
+      <w:r>
+        <w:rPr>
+          <w:b/>
+        </w:rPr>
+        <w:t>debit</w:t>
+      </w:r>
+      <w:r>
+        <w:t xml:space="preserve"> smaller than the wing; an iron</w:t>
+        <w:br/>
+        <w:t xml:space="preserve">  butterfly is the same payoff shifted down, so it must take in a </w:t>
+      </w:r>
+      <w:r>
+        <w:rPr>
+          <w:b/>
+        </w:rPr>
+        <w:t>credit</w:t>
+      </w:r>
+      <w:r>
+        <w:t xml:space="preserve"> smaller than</w:t>
+        <w:br/>
+        <w:t xml:space="preserve">  the wing. When wide quotes put the mid prices outside that range — a long butterfly</w:t>
+        <w:br/>
+        <w:t xml:space="preserve">  "paid" a credit reports a 100% probability of profit and ranks first — the row is </w:t>
+      </w:r>
+      <w:r>
+        <w:rPr>
+          <w:b/>
+        </w:rPr>
+        <w:t>not</w:t>
+        <w:br/>
+        <w:t xml:space="preserve">  shown</w:t>
+      </w:r>
+      <w:r>
+        <w:t>: the prices are wrong, not the trade good.</w:t>
       </w:r>
     </w:p>
     <w:p>
@@ -28280,10 +28293,86 @@
         <w:rPr>
           <w:b/>
         </w:rPr>
+        <w:t>Calendar</w:t>
+      </w:r>
+      <w:r>
+        <w:t xml:space="preserve"> — the near expiration at least </w:t>
+      </w:r>
+      <w:r>
+        <w:rPr>
+          <w:b/>
+        </w:rPr>
+        <w:t>7 days</w:t>
+      </w:r>
+      <w:r>
+        <w:t xml:space="preserve"> out, the later one nearest</w:t>
+        <w:br/>
+        <w:t xml:space="preserve">  </w:t>
+      </w:r>
+      <w:r>
+        <w:rPr>
+          <w:b/>
+        </w:rPr>
+        <w:t>near + 28 days</w:t>
+      </w:r>
+      <w:r>
+        <w:t xml:space="preserve"> and at least a week after it, both inside your DTE range; same</w:t>
+        <w:br/>
+        <w:t xml:space="preserve">  at-the-money strike. Skipped when either month's strike ladder has a hole at the money.</w:t>
+        <w:br/>
+        <w:t xml:space="preserve">  If DTE max does not reach a second expiration, no calendar is built — widen it.</w:t>
+      </w:r>
+    </w:p>
+    <w:p>
+      <w:pPr>
+        <w:pStyle w:val="ListBullet"/>
+      </w:pPr>
+      <w:r>
+        <w:rPr>
+          <w:b/>
+        </w:rPr>
+        <w:t>Diagonal</w:t>
+      </w:r>
+      <w:r>
+        <w:t xml:space="preserve"> — short the near month out of the money near </w:t>
+      </w:r>
+      <w:r>
+        <w:rPr>
+          <w:b/>
+        </w:rPr>
+        <w:t>0.30 delta</w:t>
+      </w:r>
+      <w:r>
+        <w:t xml:space="preserve"> (accepted</w:t>
+        <w:br/>
+        <w:t xml:space="preserve">  only between 0.15 and 0.45), long the later month in the money near </w:t>
+      </w:r>
+      <w:r>
+        <w:rPr>
+          <w:b/>
+        </w:rPr>
+        <w:t>0.70 delta</w:t>
+      </w:r>
+      <w:r>
+        <w:t>.</w:t>
+        <w:br/>
+        <w:t xml:space="preserve">  Skipped when the debit reaches the width between the two strikes, since it then has no</w:t>
+        <w:br/>
+        <w:t xml:space="preserve">  upside worth the name.</w:t>
+      </w:r>
+    </w:p>
+    <w:p>
+      <w:pPr>
+        <w:pStyle w:val="ListBullet"/>
+      </w:pPr>
+      <w:r>
+        <w:rPr>
+          <w:b/>
+        </w:rPr>
         <w:t>Covered call / protective put / collar</w:t>
       </w:r>
       <w:r>
-        <w:t xml:space="preserve"> — near expiration at least 7 days out. The</w:t>
+        <w:t xml:space="preserve"> — the 7-day expiration above. The</w:t>
         <w:br/>
         <w:t xml:space="preserve">  sold call is at the call band's midpoint; the bought put is near </w:t>
       </w:r>
@@ -28518,6 +28607,83 @@
         <w:rPr>
           <w:b/>
         </w:rPr>
+        <w:t>The Trade detail panel</w:t>
+      </w:r>
+      <w:r>
+        <w:rPr/>
+        <w:t xml:space="preserve"> (click a row) follows the same rules in words: </w:t>
+      </w:r>
+      <w:r>
+        <w:rPr>
+          <w:rFonts w:ascii="Consolas" w:hAnsi="Consolas"/>
+          <w:color w:val="334455"/>
+          <w:sz w:val="19"/>
+        </w:rPr>
+        <w:t>Buy 100</w:t>
+        <w:br/>
+        <w:t>shares</w:t>
+      </w:r>
+      <w:r>
+        <w:rPr/>
+        <w:t xml:space="preserve"> for a share lot, </w:t>
+      </w:r>
+      <w:r>
+        <w:rPr>
+          <w:rFonts w:ascii="Consolas" w:hAnsi="Consolas"/>
+          <w:color w:val="334455"/>
+          <w:sz w:val="19"/>
+        </w:rPr>
+        <w:t>Sell 2× 100 C</w:t>
+      </w:r>
+      <w:r>
+        <w:rPr/>
+        <w:t xml:space="preserve"> for a butterfly's body, each leg on its own line</w:t>
+        <w:br/>
+        <w:t>with its own date when the legs span more than one expiration (the single "Exp" caption is</w:t>
+        <w:br/>
+        <w:t xml:space="preserve">then left off, since it would name only the near month), </w:t>
+      </w:r>
+      <w:r>
+        <w:rPr>
+          <w:b/>
+        </w:rPr>
+        <w:t>every</w:t>
+      </w:r>
+      <w:r>
+        <w:rPr/>
+        <w:t xml:space="preserve"> breakeven joined with</w:t>
+        <w:br/>
+      </w:r>
+      <w:r>
+        <w:rPr>
+          <w:rFonts w:ascii="Consolas" w:hAnsi="Consolas"/>
+          <w:color w:val="334455"/>
+          <w:sz w:val="19"/>
+        </w:rPr>
+        <w:t>/</w:t>
+      </w:r>
+      <w:r>
+        <w:rPr/>
+        <w:t xml:space="preserve">, and dollars stated </w:t>
+      </w:r>
+      <w:r>
+        <w:rPr>
+          <w:b/>
+        </w:rPr>
+        <w:t>per position</w:t>
+      </w:r>
+      <w:r>
+        <w:rPr/>
+        <w:t xml:space="preserve"> rather than per contract when shares are part</w:t>
+        <w:br/>
+        <w:t>of it — a share lot is thousands of dollars, not a contract's worth.</w:t>
+      </w:r>
+    </w:p>
+    <w:p>
+      <w:r>
+        <w:rPr>
+          <w:b/>
+        </w:rPr>
         <w:t>The status line</w:t>
       </w:r>
       <w:r>
@@ -28717,7 +28883,11 @@
       </w:r>
       <w:r>
         <w:rPr/>
-        <w:t>. No button for:</w:t>
+        <w:t>. The ledger refuses a debit structure that arrives with no positive debit,</w:t>
+        <w:br/>
+        <w:t>rather than opening it as a free trade whose every later mark would overstate the</w:t>
+        <w:br/>
+        <w:t>result. No button for:</w:t>
       </w:r>
     </w:p>
     <w:tbl>

</xml_diff>

<commit_message>
docs(finder): the redesigned page
Co-Authored-By: Claude Opus 5 <noreply@anthropic.com>
</commit_message>
<xml_diff>
--- a/docs/manuals/reference-guide/reference-guide.docx
+++ b/docs/manuals/reference-guide/reference-guide.docx
@@ -27696,35 +27696,246 @@
     </w:p>
     <w:p>
       <w:r>
-        <w:rPr>
-          <w:b/>
-        </w:rPr>
-        <w:t>Inputs:</w:t>
-      </w:r>
-      <w:r>
-        <w:rPr/>
-        <w:t xml:space="preserve"> symbol, </w:t>
-      </w:r>
-      <w:r>
-        <w:rPr>
-          <w:b/>
-        </w:rPr>
-        <w:t>DTE min/max</w:t>
-      </w:r>
-      <w:r>
-        <w:rPr/>
-        <w:t xml:space="preserve"> (wider allows more candidates), and a </w:t>
-      </w:r>
-      <w:r>
-        <w:rPr>
-          <w:b/>
-        </w:rPr>
-        <w:t>Strategies</w:t>
-      </w:r>
-      <w:r>
-        <w:rPr/>
-        <w:br/>
-        <w:t>row of seven checkboxes, all ticked by default:</w:t>
+        <w:rPr/>
+        <w:t xml:space="preserve">The page reads top to bottom: a </w:t>
+      </w:r>
+      <w:r>
+        <w:rPr>
+          <w:b/>
+        </w:rPr>
+        <w:t>scan bar</w:t>
+      </w:r>
+      <w:r>
+        <w:rPr/>
+        <w:t xml:space="preserve">, a </w:t>
+      </w:r>
+      <w:r>
+        <w:rPr>
+          <w:b/>
+        </w:rPr>
+        <w:t>summary strip</w:t>
+      </w:r>
+      <w:r>
+        <w:rPr/>
+        <w:t xml:space="preserve">, </w:t>
+      </w:r>
+      <w:r>
+        <w:rPr>
+          <w:b/>
+        </w:rPr>
+        <w:t>strategy chips</w:t>
+      </w:r>
+      <w:r>
+        <w:rPr/>
+        <w:t>,</w:t>
+        <w:br/>
+        <w:t xml:space="preserve">up to four </w:t>
+      </w:r>
+      <w:r>
+        <w:rPr>
+          <w:b/>
+        </w:rPr>
+        <w:t>top picks</w:t>
+      </w:r>
+      <w:r>
+        <w:rPr/>
+        <w:t xml:space="preserve">, and the </w:t>
+      </w:r>
+      <w:r>
+        <w:rPr>
+          <w:b/>
+        </w:rPr>
+        <w:t>ranked list</w:t>
+      </w:r>
+      <w:r>
+        <w:rPr/>
+        <w:t>, with the Trade detail panel beside it.</w:t>
+      </w:r>
+    </w:p>
+    <w:p>
+      <w:r>
+        <w:rPr>
+          <w:b/>
+        </w:rPr>
+        <w:t>The scan bar.</w:t>
+      </w:r>
+      <w:r>
+        <w:rPr/>
+        <w:t xml:space="preserve"> A </w:t>
+      </w:r>
+      <w:r>
+        <w:rPr>
+          <w:b/>
+        </w:rPr>
+        <w:t>Symbol</w:t>
+      </w:r>
+      <w:r>
+        <w:rPr/>
+        <w:t xml:space="preserve"> box and </w:t>
+      </w:r>
+      <w:r>
+        <w:rPr>
+          <w:b/>
+        </w:rPr>
+        <w:t>Scan</w:t>
+      </w:r>
+      <w:r>
+        <w:rPr/>
+        <w:t xml:space="preserve"> (Enter, or tabbing out of the box, scans</w:t>
+        <w:br/>
+        <w:t>too). Nothing else rescans — change the settings, then press Scan.</w:t>
+      </w:r>
+    </w:p>
+    <w:p>
+      <w:pPr>
+        <w:pStyle w:val="ListBullet"/>
+      </w:pPr>
+      <w:r>
+        <w:rPr>
+          <w:b/>
+        </w:rPr>
+        <w:t>Expiry</w:t>
+      </w:r>
+      <w:r>
+        <w:t xml:space="preserve"> presets fill the </w:t>
+      </w:r>
+      <w:r>
+        <w:rPr>
+          <w:b/>
+        </w:rPr>
+        <w:t>DTE min / max</w:t>
+      </w:r>
+      <w:r>
+        <w:t xml:space="preserve"> boxes beside them: </w:t>
+      </w:r>
+      <w:r>
+        <w:rPr>
+          <w:b/>
+        </w:rPr>
+        <w:t>1–2 wk</w:t>
+      </w:r>
+      <w:r>
+        <w:t xml:space="preserve"> (7–14 days),</w:t>
+        <w:br/>
+        <w:t xml:space="preserve">  </w:t>
+      </w:r>
+      <w:r>
+        <w:rPr>
+          <w:b/>
+        </w:rPr>
+        <w:t>2–6 wk</w:t>
+      </w:r>
+      <w:r>
+        <w:t xml:space="preserve"> (14–42), </w:t>
+      </w:r>
+      <w:r>
+        <w:rPr>
+          <w:b/>
+        </w:rPr>
+        <w:t>1–3 mo</w:t>
+      </w:r>
+      <w:r>
+        <w:t xml:space="preserve"> (30–90) and </w:t>
+      </w:r>
+      <w:r>
+        <w:rPr>
+          <w:b/>
+        </w:rPr>
+        <w:t>Any</w:t>
+      </w:r>
+      <w:r>
+        <w:t xml:space="preserve"> (0–120, the default). Typing in</w:t>
+        <w:br/>
+        <w:t xml:space="preserve">  either box releases the preset, so a hand-set range is never shown under a preset's</w:t>
+        <w:br/>
+        <w:t xml:space="preserve">  name. A wider range allows more candidates.</w:t>
+      </w:r>
+    </w:p>
+    <w:p>
+      <w:pPr>
+        <w:pStyle w:val="ListBullet"/>
+      </w:pPr>
+      <w:r>
+        <w:rPr>
+          <w:b/>
+        </w:rPr>
+        <w:t>Risk style</w:t>
+      </w:r>
+      <w:r>
+        <w:t xml:space="preserve"> sets the short-leg delta bands on </w:t>
+      </w:r>
+      <w:r>
+        <w:rPr>
+          <w:b/>
+        </w:rPr>
+        <w:t>both</w:t>
+      </w:r>
+      <w:r>
+        <w:t xml:space="preserve"> sides at once:</w:t>
+        <w:br/>
+        <w:t xml:space="preserve">  </w:t>
+      </w:r>
+      <w:r>
+        <w:rPr>
+          <w:b/>
+        </w:rPr>
+        <w:t>Conservative</w:t>
+      </w:r>
+      <w:r>
+        <w:t xml:space="preserve"> 0.05–0.10, </w:t>
+      </w:r>
+      <w:r>
+        <w:rPr>
+          <w:b/>
+        </w:rPr>
+        <w:t>Balanced</w:t>
+      </w:r>
+      <w:r>
+        <w:t xml:space="preserve"> 0.10–0.20 (the default) and </w:t>
+      </w:r>
+      <w:r>
+        <w:rPr>
+          <w:b/>
+        </w:rPr>
+        <w:t>Aggressive</w:t>
+      </w:r>
+      <w:r>
+        <w:br/>
+        <w:t xml:space="preserve">  0.20–0.30. It is shorthand for the four delta fields under </w:t>
+      </w:r>
+      <w:r>
+        <w:rPr>
+          <w:b/>
+        </w:rPr>
+        <w:t>Advanced</w:t>
+      </w:r>
+      <w:r>
+        <w:t>; edit those by</w:t>
+        <w:br/>
+        <w:t xml:space="preserve">  hand to anything else and the picker shows </w:t>
+      </w:r>
+      <w:r>
+        <w:rPr>
+          <w:b/>
+        </w:rPr>
+        <w:t>Custom</w:t>
+      </w:r>
+      <w:r>
+        <w:t>.</w:t>
+      </w:r>
+    </w:p>
+    <w:p>
+      <w:r>
+        <w:rPr>
+          <w:b/>
+        </w:rPr>
+        <w:t>Every scan builds all seven strategy groups</w:t>
+      </w:r>
+      <w:r>
+        <w:rPr/>
+        <w:t xml:space="preserve"> — the chips below choose what you see,</w:t>
+        <w:br/>
+        <w:t>not what is built:</w:t>
       </w:r>
     </w:p>
     <w:tbl>
@@ -28455,25 +28666,38 @@
         <w:rPr>
           <w:b/>
         </w:rPr>
-        <w:t>The view banner.</w:t>
-      </w:r>
-      <w:r>
-        <w:rPr/>
-        <w:t xml:space="preserve"> Before ranking anything, the scanner </w:t>
+        <w:t>The summary strip.</w:t>
+      </w:r>
+      <w:r>
+        <w:rPr/>
+        <w:t xml:space="preserve"> After a scan it names the symbol and its price, the </w:t>
+      </w:r>
+      <w:r>
+        <w:rPr>
+          <w:b/>
+        </w:rPr>
+        <w:t>Vol Rank</w:t>
+      </w:r>
+      <w:r>
+        <w:rPr/>
+        <w:br/>
+        <w:t xml:space="preserve">(one value per scan, so it is not repeated on every row), and the </w:t>
       </w:r>
       <w:r>
         <w:rPr>
           <w:i/>
         </w:rPr>
-        <w:t>infers a market view</w:t>
-      </w:r>
-      <w:r>
-        <w:rPr/>
-        <w:t xml:space="preserve"> for the</w:t>
-        <w:br/>
-        <w:t>symbol from its technicals and implied volatility — a direction, a conviction level, and</w:t>
-        <w:br/>
-        <w:t>a volatility regime. It then scores each candidate on two things:</w:t>
+        <w:t>market view</w:t>
+      </w:r>
+      <w:r>
+        <w:rPr/>
+        <w:t xml:space="preserve"> the</w:t>
+        <w:br/>
+        <w:t>scanner inferred before ranking anything — shown as pills for a direction, a conviction</w:t>
+        <w:br/>
+        <w:t>level and a volatility regime, read from the symbol's technicals and implied volatility.</w:t>
+        <w:br/>
+        <w:t>It then scores each candidate on two things:</w:t>
       </w:r>
     </w:p>
     <w:p>
@@ -28515,379 +28739,86 @@
         <w:rPr>
           <w:b/>
         </w:rPr>
-        <w:t>The columns:</w:t>
-      </w:r>
-      <w:r>
-        <w:rPr/>
-        <w:t xml:space="preserve"> Strategy · Bias · Legs · Exp · DTE · Debit/Credit · Max P · Max L ·</w:t>
-        <w:br/>
-        <w:t xml:space="preserve">R:R · PoP · BE (breakeven) · Vol Rank · Score · </w:t>
-      </w:r>
-      <w:r>
-        <w:rPr>
-          <w:b/>
-        </w:rPr>
-        <w:t>Grade</w:t>
+        <w:t>Strategy chips.</w:t>
+      </w:r>
+      <w:r>
+        <w:rPr/>
+        <w:t xml:space="preserve"> One chip per group that produced ideas, with its count, plus </w:t>
+      </w:r>
+      <w:r>
+        <w:rPr>
+          <w:b/>
+        </w:rPr>
+        <w:t>All</w:t>
       </w:r>
       <w:r>
         <w:rPr/>
         <w:t>.</w:t>
-      </w:r>
-    </w:p>
-    <w:p>
-      <w:r>
-        <w:rPr>
-          <w:b/>
-        </w:rPr>
-        <w:t>The Grade is quality-gated, not fit-gated</w:t>
-      </w:r>
-      <w:r>
-        <w:rPr/>
-        <w:t xml:space="preserve"> — it is driven by structural quality and</w:t>
-        <w:br/>
-        <w:t>per-family hard gates, and carries a tooltip explaining the reason. A high score with a</w:t>
-        <w:br/>
-        <w:t>poor grade means "fits your view, but badly constructed".</w:t>
-      </w:r>
-    </w:p>
-    <w:p>
-      <w:r>
-        <w:rPr>
-          <w:b/>
-        </w:rPr>
-        <w:t>The Legs column</w:t>
-      </w:r>
-      <w:r>
-        <w:rPr/>
-        <w:t xml:space="preserve"> prints a share lot as </w:t>
-      </w:r>
-      <w:r>
-        <w:rPr>
-          <w:rFonts w:ascii="Consolas" w:hAnsi="Consolas"/>
-          <w:color w:val="334455"/>
-          <w:sz w:val="19"/>
-        </w:rPr>
-        <w:t>L 100 shares</w:t>
-      </w:r>
-      <w:r>
-        <w:rPr/>
-        <w:t>, a leg of more than one</w:t>
-        <w:br/>
-        <w:t xml:space="preserve">contract as </w:t>
-      </w:r>
-      <w:r>
-        <w:rPr>
-          <w:rFonts w:ascii="Consolas" w:hAnsi="Consolas"/>
-          <w:color w:val="334455"/>
-          <w:sz w:val="19"/>
-        </w:rPr>
-        <w:t>S 2×100C</w:t>
-      </w:r>
-      <w:r>
-        <w:rPr/>
-        <w:t xml:space="preserve"> (a butterfly's body), and a leg on a later expiration with its</w:t>
-        <w:br/>
-        <w:t xml:space="preserve">date — </w:t>
-      </w:r>
-      <w:r>
-        <w:rPr>
-          <w:rFonts w:ascii="Consolas" w:hAnsi="Consolas"/>
-          <w:color w:val="334455"/>
-          <w:sz w:val="19"/>
-        </w:rPr>
-        <w:t>S 100C / L 100C 11/13</w:t>
-      </w:r>
-      <w:r>
-        <w:rPr/>
-        <w:t xml:space="preserve"> is a calendar.</w:t>
-      </w:r>
-    </w:p>
-    <w:p>
-      <w:r>
-        <w:rPr>
-          <w:b/>
-        </w:rPr>
-        <w:t>The Trade detail panel</w:t>
-      </w:r>
-      <w:r>
-        <w:rPr/>
-        <w:t xml:space="preserve"> (click a row) follows the same rules in words: </w:t>
-      </w:r>
-      <w:r>
-        <w:rPr>
-          <w:rFonts w:ascii="Consolas" w:hAnsi="Consolas"/>
-          <w:color w:val="334455"/>
-          <w:sz w:val="19"/>
-        </w:rPr>
-        <w:t>Buy 100</w:t>
-        <w:br/>
-        <w:t>shares</w:t>
-      </w:r>
-      <w:r>
-        <w:rPr/>
-        <w:t xml:space="preserve"> for a share lot, </w:t>
-      </w:r>
-      <w:r>
-        <w:rPr>
-          <w:rFonts w:ascii="Consolas" w:hAnsi="Consolas"/>
-          <w:color w:val="334455"/>
-          <w:sz w:val="19"/>
-        </w:rPr>
-        <w:t>Sell 2× 100 C</w:t>
-      </w:r>
-      <w:r>
-        <w:rPr/>
-        <w:t xml:space="preserve"> for a butterfly's body, each leg on its own line</w:t>
-        <w:br/>
-        <w:t>with its own date when the legs span more than one expiration (the single "Exp" caption is</w:t>
-        <w:br/>
-        <w:t xml:space="preserve">then left off, since it would name only the near month), </w:t>
-      </w:r>
-      <w:r>
-        <w:rPr>
-          <w:b/>
-        </w:rPr>
-        <w:t>every</w:t>
-      </w:r>
-      <w:r>
-        <w:rPr/>
-        <w:t xml:space="preserve"> breakeven joined with</w:t>
-        <w:br/>
-      </w:r>
-      <w:r>
-        <w:rPr>
-          <w:rFonts w:ascii="Consolas" w:hAnsi="Consolas"/>
-          <w:color w:val="334455"/>
-          <w:sz w:val="19"/>
-        </w:rPr>
-        <w:t>/</w:t>
-      </w:r>
-      <w:r>
-        <w:rPr/>
-        <w:t xml:space="preserve">, and dollars stated </w:t>
-      </w:r>
-      <w:r>
-        <w:rPr>
-          <w:b/>
-        </w:rPr>
-        <w:t>per position</w:t>
-      </w:r>
-      <w:r>
-        <w:rPr/>
-        <w:t xml:space="preserve"> rather than per contract when shares are part</w:t>
-        <w:br/>
-        <w:t>of it — a share lot is thousands of dollars, not a contract's worth.</w:t>
-      </w:r>
-    </w:p>
-    <w:p>
-      <w:r>
-        <w:rPr>
-          <w:b/>
-        </w:rPr>
-        <w:t>The status line</w:t>
-      </w:r>
-      <w:r>
-        <w:rPr/>
-        <w:t xml:space="preserve"> reports how many candidates were </w:t>
-      </w:r>
-      <w:r>
-        <w:rPr>
-          <w:b/>
-        </w:rPr>
-        <w:t>cut below the quality bar</w:t>
-      </w:r>
-      <w:r>
-        <w:rPr/>
-        <w:t>. That</w:t>
-        <w:br/>
-        <w:t xml:space="preserve">count is what distinguishes </w:t>
-      </w:r>
-      <w:r>
-        <w:rPr>
-          <w:i/>
-        </w:rPr>
-        <w:t>"the scan found things and rejected them all"</w:t>
-      </w:r>
-      <w:r>
-        <w:rPr/>
-        <w:t xml:space="preserve"> from </w:t>
-      </w:r>
-      <w:r>
-        <w:rPr>
-          <w:i/>
-        </w:rPr>
-        <w:t>"the</w:t>
-        <w:br/>
-        <w:t>scan found nothing"</w:t>
-      </w:r>
-      <w:r>
-        <w:rPr/>
-        <w:t xml:space="preserve"> — two very different situations that would otherwise look identical.</w:t>
-      </w:r>
-    </w:p>
-    <w:p>
-      <w:r>
-        <w:rPr/>
-        <w:t xml:space="preserve">⚠ </w:t>
-      </w:r>
-      <w:r>
-        <w:rPr>
-          <w:b/>
-        </w:rPr>
-        <w:t>On fairly priced options, two structures are in that count on nearly every scan: the</w:t>
-        <w:br/>
-        <w:t>short straddle and the covered call.</w:t>
-      </w:r>
-      <w:r>
-        <w:rPr/>
-        <w:t xml:space="preserve"> Both are judged as premium sales, whose bar asks</w:t>
-        <w:br/>
-        <w:t>for a 65% probability of profit, and both measure around 57% and 52%. That is an operator</w:t>
-        <w:br/>
-        <w:t>decision — no lower bar is invented without outcome data — so they are counted, not</w:t>
-        <w:br/>
-        <w:t xml:space="preserve">shown. The cut is not unconditional: when options are priced </w:t>
-      </w:r>
-      <w:r>
-        <w:rPr>
-          <w:b/>
-        </w:rPr>
-        <w:t>rich</w:t>
-      </w:r>
-      <w:r>
-        <w:rPr/>
-        <w:t xml:space="preserve"> — premium well above</w:t>
-        <w:br/>
-        <w:t>the volatility the probability is computed from — a short straddle's larger credit widens</w:t>
-        <w:br/>
-        <w:t>its breakevens past the bar (in a synthetic test, from about 20% rich), and it is listed.</w:t>
-        <w:br/>
-        <w:t>The covered call stayed cut in every case tested. The long straddle and</w:t>
-        <w:br/>
-        <w:t xml:space="preserve">long strangle typically pass only as </w:t>
-      </w:r>
-      <w:r>
-        <w:rPr>
-          <w:i/>
-        </w:rPr>
-        <w:t>Marginal</w:t>
-      </w:r>
-      <w:r>
-        <w:rPr/>
-        <w:t>. Measured outcomes for every structure are</w:t>
-        <w:br/>
-        <w:t xml:space="preserve">in the </w:t>
-      </w:r>
-      <w:r>
-        <w:rPr>
-          <w:i/>
-        </w:rPr>
-        <w:t>Technical Reference</w:t>
-      </w:r>
-      <w:r>
-        <w:rPr/>
-        <w:t xml:space="preserve"> (Strategy Finder scoring).</w:t>
-      </w:r>
-    </w:p>
-    <w:p>
-      <w:r>
-        <w:rPr>
-          <w:b/>
-        </w:rPr>
-        <w:t>Earnings.</w:t>
-      </w:r>
-      <w:r>
-        <w:rPr/>
-        <w:t xml:space="preserve"> A calendar or diagonal is checked against its </w:t>
-      </w:r>
-      <w:r>
-        <w:rPr>
-          <w:b/>
-        </w:rPr>
-        <w:t>latest</w:t>
-      </w:r>
-      <w:r>
-        <w:rPr/>
-        <w:t xml:space="preserve"> expiration: the</w:t>
-        <w:br/>
-        <w:t>back month is still open through a report that lands after the front expires.</w:t>
-      </w:r>
-    </w:p>
-    <w:p>
-      <w:r>
-        <w:rPr>
-          <w:b/>
-        </w:rPr>
-        <w:t>Row actions</w:t>
-      </w:r>
-      <w:r>
-        <w:rPr/>
-        <w:t xml:space="preserve"> send to </w:t>
-      </w:r>
-      <w:r>
-        <w:rPr>
-          <w:color w:val="5D5294"/>
+        <w:br/>
+        <w:t>A chip shows only its group; more chips add groups; removing the last chip, or clicking</w:t>
+        <w:br/>
+      </w:r>
+      <w:r>
+        <w:rPr>
+          <w:b/>
+        </w:rPr>
+        <w:t>All</w:t>
+      </w:r>
+      <w:r>
+        <w:rPr/>
+        <w:t>, shows everything. The filter is instant — nothing is rescanned — and both the</w:t>
+        <w:br/>
+        <w:t>cards and the list follow it. A new symbol starts back at All.</w:t>
+      </w:r>
+    </w:p>
+    <w:p>
+      <w:r>
+        <w:rPr>
+          <w:b/>
+        </w:rPr>
+        <w:t>Top picks.</w:t>
+      </w:r>
+      <w:r>
+        <w:rPr/>
+        <w:t xml:space="preserve"> Up to four cards, each the best-scoring idea from a </w:t>
+      </w:r>
+      <w:r>
+        <w:rPr>
+          <w:b/>
+        </w:rPr>
+        <w:t>different</w:t>
+      </w:r>
+      <w:r>
+        <w:rPr/>
+        <w:t xml:space="preserve"> group</w:t>
+        <w:br/>
+        <w:t>among what the chips show — the cards exist to compare structures, and four spreads in a</w:t>
+        <w:br/>
+        <w:t>row would be one idea shown four times. A card carries the score and grade, the</w:t>
+        <w:br/>
+        <w:t xml:space="preserve">expiration and days to go, the legs, the cost, </w:t>
+      </w:r>
+      <w:r>
+        <w:rPr>
+          <w:b/>
         </w:rPr>
         <w:t>Calculator</w:t>
       </w:r>
       <w:r>
         <w:rPr/>
-        <w:t xml:space="preserve"> or </w:t>
-      </w:r>
-      <w:r>
-        <w:rPr>
-          <w:color w:val="5D5294"/>
-        </w:rPr>
-        <w:t>Expected Move</w:t>
-      </w:r>
-      <w:r>
-        <w:rPr/>
-        <w:t xml:space="preserve"> for</w:t>
-        <w:br/>
-        <w:t>all types — a calendar arrives with both expirations and a share leg as the Calculator's</w:t>
-        <w:br/>
-        <w:t xml:space="preserve">stock leg. ⚠ Clicking an expiration pill on the Calculator afterwards moves </w:t>
-      </w:r>
-      <w:r>
-        <w:rPr>
-          <w:b/>
-        </w:rPr>
-        <w:t>every</w:t>
-      </w:r>
-      <w:r>
-        <w:rPr/>
-        <w:br/>
-        <w:t>option leg to that one date, which collapses a calendar into a single-expiry trade.</w:t>
-      </w:r>
-    </w:p>
-    <w:p>
-      <w:r>
-        <w:rPr>
-          <w:b/>
-        </w:rPr>
-        <w:t>Send to Paper trade</w:t>
-      </w:r>
-      <w:r>
-        <w:rPr/>
-        <w:t xml:space="preserve"> appears for credit structures (PCS, CCS, IC), defined-risk debit</w:t>
-        <w:br/>
-        <w:t xml:space="preserve">structures (long call/put, bull call, bear put) and the </w:t>
-      </w:r>
-      <w:r>
-        <w:rPr>
-          <w:b/>
-        </w:rPr>
-        <w:t>call and put butterflies and</w:t>
-        <w:br/>
-        <w:t>condors</w:t>
-      </w:r>
-      <w:r>
-        <w:rPr/>
-        <w:t>. The ledger refuses a debit structure that arrives with no positive debit,</w:t>
-        <w:br/>
-        <w:t>rather than opening it as a free trade whose every later mark would overstate the</w:t>
-        <w:br/>
-        <w:t>result. No button for:</w:t>
+        <w:t xml:space="preserve"> and — where the Paper</w:t>
+        <w:br/>
+        <w:t xml:space="preserve">Ledger can record it — </w:t>
+      </w:r>
+      <w:r>
+        <w:rPr>
+          <w:b/>
+        </w:rPr>
+        <w:t>Paper</w:t>
+      </w:r>
+      <w:r>
+        <w:rPr/>
+        <w:t>, plus three pictures:</w:t>
       </w:r>
     </w:p>
     <w:tbl>
@@ -28925,7 +28856,7 @@
               <w:rPr>
                 <w:b/>
               </w:rPr>
-              <w:t>Structure</w:t>
+              <w:t>Picture</w:t>
             </w:r>
           </w:p>
         </w:tc>
@@ -28944,7 +28875,7 @@
               <w:rPr>
                 <w:b/>
               </w:rPr>
-              <w:t>Why</w:t>
+              <w:t>How to read it</w:t>
             </w:r>
           </w:p>
         </w:tc>
@@ -28957,8 +28888,10 @@
           <w:p>
             <w:r/>
             <w:r>
-              <w:rPr/>
-              <w:t>Naked shorts</w:t>
+              <w:rPr>
+                <w:b/>
+              </w:rPr>
+              <w:t>Payoff shape</w:t>
             </w:r>
           </w:p>
         </w:tc>
@@ -28970,7 +28903,27 @@
             <w:r/>
             <w:r>
               <w:rPr/>
-              <w:t>undefined risk</w:t>
+              <w:t xml:space="preserve">Profit or loss at the (nearest) expiration across a range of prices around today's: </w:t>
+            </w:r>
+            <w:r>
+              <w:rPr>
+                <w:b/>
+              </w:rPr>
+              <w:t>green</w:t>
+            </w:r>
+            <w:r>
+              <w:rPr/>
+              <w:t xml:space="preserve"> where it makes money, </w:t>
+            </w:r>
+            <w:r>
+              <w:rPr>
+                <w:b/>
+              </w:rPr>
+              <w:t>red</w:t>
+            </w:r>
+            <w:r>
+              <w:rPr/>
+              <w:t xml:space="preserve"> where it loses, a dashed zero line, and a tick at today's price. A shape to recognise the bet by, not a chart to read values off</w:t>
             </w:r>
           </w:p>
         </w:tc>
@@ -28984,8 +28937,10 @@
           <w:p>
             <w:r/>
             <w:r>
-              <w:rPr/>
-              <w:t>Straddles and strangles, long or short</w:t>
+              <w:rPr>
+                <w:b/>
+              </w:rPr>
+              <w:t>Split bar</w:t>
             </w:r>
           </w:p>
         </w:tc>
@@ -29000,11 +28955,37 @@
               <w:rPr>
                 <w:b/>
               </w:rPr>
-              <w:t>analysis only</w:t>
-            </w:r>
-            <w:r>
-              <w:rPr/>
-              <w:t xml:space="preserve"> — a standing decision; the paper ledger does not accept them</w:t>
+              <w:t>Max loss</w:t>
+            </w:r>
+            <w:r>
+              <w:rPr/>
+              <w:t xml:space="preserve"> in red growing left from the centre, </w:t>
+            </w:r>
+            <w:r>
+              <w:rPr>
+                <w:b/>
+              </w:rPr>
+              <w:t>max profit</w:t>
+            </w:r>
+            <w:r>
+              <w:rPr/>
+              <w:t xml:space="preserve"> in green growing right, both scaled to the </w:t>
+            </w:r>
+            <w:r>
+              <w:rPr>
+                <w:b/>
+              </w:rPr>
+              <w:t>larger of the two</w:t>
+            </w:r>
+            <w:r>
+              <w:rPr/>
+              <w:t xml:space="preserve"> — so it shows the balance of one trade (a butterfly mostly green, a covered call mostly red), never a comparison between trades. An unlimited side fills its half and reads </w:t>
+            </w:r>
+            <w:r>
+              <w:rPr>
+                <w:b/>
+              </w:rPr>
+              <w:t>∞</w:t>
             </w:r>
           </w:p>
         </w:tc>
@@ -29017,8 +28998,10 @@
           <w:p>
             <w:r/>
             <w:r>
-              <w:rPr/>
-              <w:t>Iron butterfly</w:t>
+              <w:rPr>
+                <w:b/>
+              </w:rPr>
+              <w:t>Probability-of-profit bar</w:t>
             </w:r>
           </w:p>
         </w:tc>
@@ -29030,61 +29013,37 @@
             <w:r/>
             <w:r>
               <w:rPr/>
-              <w:t>the ledger's credit path understands only two-strike spreads and iron condors</w:t>
-            </w:r>
-          </w:p>
-        </w:tc>
-      </w:tr>
-      <w:tr>
-        <w:tc>
-          <w:tcPr>
-            <w:tcW w:type="dxa" w:w="4320"/>
-            <w:shd w:val="clear" w:color="auto" w:fill="F4F6FA"/>
-          </w:tcPr>
-          <w:p>
-            <w:r/>
-            <w:r>
-              <w:rPr/>
-              <w:t>Calendars and diagonals</w:t>
-            </w:r>
-          </w:p>
-        </w:tc>
-        <w:tc>
-          <w:tcPr>
-            <w:tcW w:type="dxa" w:w="4320"/>
-            <w:shd w:val="clear" w:color="auto" w:fill="F4F6FA"/>
-          </w:tcPr>
-          <w:p>
-            <w:r/>
-            <w:r>
-              <w:rPr/>
-              <w:t>the ledger settles every leg at intrinsic, which is wrong for a back month</w:t>
-            </w:r>
-          </w:p>
-        </w:tc>
-      </w:tr>
-      <w:tr>
-        <w:tc>
-          <w:tcPr>
-            <w:tcW w:type="dxa" w:w="4320"/>
-          </w:tcPr>
-          <w:p>
-            <w:r/>
-            <w:r>
-              <w:rPr/>
-              <w:t>Covered call, protective put, collar</w:t>
-            </w:r>
-          </w:p>
-        </w:tc>
-        <w:tc>
-          <w:tcPr>
-            <w:tcW w:type="dxa" w:w="4320"/>
-          </w:tcPr>
-          <w:p>
-            <w:r/>
-            <w:r>
-              <w:rPr/>
-              <w:t>the ledger holds no shares</w:t>
+              <w:t xml:space="preserve">0–100%: </w:t>
+            </w:r>
+            <w:r>
+              <w:rPr>
+                <w:b/>
+              </w:rPr>
+              <w:t>amber</w:t>
+            </w:r>
+            <w:r>
+              <w:rPr/>
+              <w:t xml:space="preserve"> under 40%, </w:t>
+            </w:r>
+            <w:r>
+              <w:rPr>
+                <w:b/>
+              </w:rPr>
+              <w:t>blue</w:t>
+            </w:r>
+            <w:r>
+              <w:rPr/>
+              <w:t xml:space="preserve"> from 40% to 60%, </w:t>
+            </w:r>
+            <w:r>
+              <w:rPr>
+                <w:b/>
+              </w:rPr>
+              <w:t>green</w:t>
+            </w:r>
+            <w:r>
+              <w:rPr/>
+              <w:t xml:space="preserve"> over 60%</w:t>
             </w:r>
           </w:p>
         </w:tc>
@@ -29092,6 +29051,1042 @@
     </w:tbl>
     <w:p/>
     <w:p>
+      <w:r>
+        <w:rPr/>
+        <w:t>Clicking a card opens it in the detail panel.</w:t>
+      </w:r>
+    </w:p>
+    <w:p>
+      <w:r>
+        <w:rPr>
+          <w:b/>
+        </w:rPr>
+        <w:t>Cost</w:t>
+      </w:r>
+      <w:r>
+        <w:rPr/>
+        <w:t xml:space="preserve"> names the direction in words — </w:t>
+      </w:r>
+      <w:r>
+        <w:rPr>
+          <w:rFonts w:ascii="Consolas" w:hAnsi="Consolas"/>
+          <w:color w:val="334455"/>
+          <w:sz w:val="19"/>
+        </w:rPr>
+        <w:t>$195 debit</w:t>
+      </w:r>
+      <w:r>
+        <w:rPr/>
+        <w:t xml:space="preserve">, </w:t>
+      </w:r>
+      <w:r>
+        <w:rPr>
+          <w:rFonts w:ascii="Consolas" w:hAnsi="Consolas"/>
+          <w:color w:val="334455"/>
+          <w:sz w:val="19"/>
+        </w:rPr>
+        <w:t>$804 credit</w:t>
+      </w:r>
+      <w:r>
+        <w:rPr/>
+        <w:t xml:space="preserve"> — and adds </w:t>
+      </w:r>
+      <w:r>
+        <w:rPr>
+          <w:i/>
+        </w:rPr>
+        <w:t>for 100</w:t>
+        <w:br/>
+        <w:t>shares</w:t>
+      </w:r>
+      <w:r>
+        <w:rPr/>
+        <w:t xml:space="preserve"> when the trade holds stock (</w:t>
+      </w:r>
+      <w:r>
+        <w:rPr>
+          <w:rFonts w:ascii="Consolas" w:hAnsi="Consolas"/>
+          <w:color w:val="334455"/>
+          <w:sz w:val="19"/>
+        </w:rPr>
+        <w:t>$54,058 debit for 100 shares</w:t>
+      </w:r>
+      <w:r>
+        <w:rPr/>
+        <w:t>), so a collar is never</w:t>
+        <w:br/>
+        <w:t>mistaken for a contract's worth.</w:t>
+      </w:r>
+    </w:p>
+    <w:p>
+      <w:r>
+        <w:rPr>
+          <w:b/>
+        </w:rPr>
+        <w:t>The ranked list.</w:t>
+      </w:r>
+      <w:r>
+        <w:rPr/>
+        <w:t xml:space="preserve"> Every idea the chips show, best score first:</w:t>
+      </w:r>
+    </w:p>
+    <w:tbl>
+      <w:tblPr>
+        <w:tblW w:type="auto" w:w="0"/>
+        <w:jc w:val="left"/>
+        <w:tblLayout w:type="autofit"/>
+        <w:tblLook w:firstColumn="1" w:firstRow="1" w:lastColumn="0" w:lastRow="0" w:noHBand="0" w:noVBand="1" w:val="04A0"/>
+        <w:tblBorders>
+          <w:top w:val="single" w:sz="4" w:space="0" w:color="D8DEE9"/>
+          <w:left w:val="single" w:sz="4" w:space="0" w:color="D8DEE9"/>
+          <w:bottom w:val="single" w:sz="4" w:space="0" w:color="D8DEE9"/>
+          <w:right w:val="single" w:sz="4" w:space="0" w:color="D8DEE9"/>
+          <w:insideH w:val="single" w:sz="4" w:space="0" w:color="D8DEE9"/>
+          <w:insideV w:val="single" w:sz="4" w:space="0" w:color="D8DEE9"/>
+        </w:tblBorders>
+      </w:tblPr>
+      <w:tblGrid>
+        <w:gridCol w:w="4320"/>
+        <w:gridCol w:w="4320"/>
+      </w:tblGrid>
+      <w:tr>
+        <w:tc>
+          <w:tcPr>
+            <w:tcW w:type="dxa" w:w="4320"/>
+            <w:shd w:val="clear" w:color="auto" w:fill="EAF2FB"/>
+          </w:tcPr>
+          <w:p>
+            <w:r>
+              <w:rPr>
+                <w:b/>
+              </w:rPr>
+            </w:r>
+            <w:r>
+              <w:rPr>
+                <w:b/>
+              </w:rPr>
+              <w:t>Column</w:t>
+            </w:r>
+          </w:p>
+        </w:tc>
+        <w:tc>
+          <w:tcPr>
+            <w:tcW w:type="dxa" w:w="4320"/>
+            <w:shd w:val="clear" w:color="auto" w:fill="EAF2FB"/>
+          </w:tcPr>
+          <w:p>
+            <w:r>
+              <w:rPr>
+                <w:b/>
+              </w:rPr>
+            </w:r>
+            <w:r>
+              <w:rPr>
+                <w:b/>
+              </w:rPr>
+              <w:t>Shows</w:t>
+            </w:r>
+          </w:p>
+        </w:tc>
+      </w:tr>
+      <w:tr>
+        <w:tc>
+          <w:tcPr>
+            <w:tcW w:type="dxa" w:w="4320"/>
+          </w:tcPr>
+          <w:p>
+            <w:r/>
+            <w:r>
+              <w:rPr>
+                <w:b/>
+              </w:rPr>
+              <w:t>Strategy</w:t>
+            </w:r>
+          </w:p>
+        </w:tc>
+        <w:tc>
+          <w:tcPr>
+            <w:tcW w:type="dxa" w:w="4320"/>
+          </w:tcPr>
+          <w:p>
+            <w:r/>
+            <w:r>
+              <w:rPr/>
+              <w:t>name, with a small payoff shape</w:t>
+            </w:r>
+          </w:p>
+        </w:tc>
+      </w:tr>
+      <w:tr>
+        <w:tc>
+          <w:tcPr>
+            <w:tcW w:type="dxa" w:w="4320"/>
+            <w:shd w:val="clear" w:color="auto" w:fill="F4F6FA"/>
+          </w:tcPr>
+          <w:p>
+            <w:r/>
+            <w:r>
+              <w:rPr>
+                <w:b/>
+              </w:rPr>
+              <w:t>Score</w:t>
+            </w:r>
+          </w:p>
+        </w:tc>
+        <w:tc>
+          <w:tcPr>
+            <w:tcW w:type="dxa" w:w="4320"/>
+            <w:shd w:val="clear" w:color="auto" w:fill="F4F6FA"/>
+          </w:tcPr>
+          <w:p>
+            <w:r/>
+            <w:r>
+              <w:rPr/>
+              <w:t>0–100, coloured by zone</w:t>
+            </w:r>
+          </w:p>
+        </w:tc>
+      </w:tr>
+      <w:tr>
+        <w:tc>
+          <w:tcPr>
+            <w:tcW w:type="dxa" w:w="4320"/>
+          </w:tcPr>
+          <w:p>
+            <w:r/>
+            <w:r>
+              <w:rPr>
+                <w:b/>
+              </w:rPr>
+              <w:t>Expiry</w:t>
+            </w:r>
+          </w:p>
+        </w:tc>
+        <w:tc>
+          <w:tcPr>
+            <w:tcW w:type="dxa" w:w="4320"/>
+          </w:tcPr>
+          <w:p>
+            <w:r/>
+            <w:r>
+              <w:rPr/>
+              <w:t>expiration and days to go</w:t>
+            </w:r>
+          </w:p>
+        </w:tc>
+      </w:tr>
+      <w:tr>
+        <w:tc>
+          <w:tcPr>
+            <w:tcW w:type="dxa" w:w="4320"/>
+            <w:shd w:val="clear" w:color="auto" w:fill="F4F6FA"/>
+          </w:tcPr>
+          <w:p>
+            <w:r/>
+            <w:r>
+              <w:rPr>
+                <w:b/>
+              </w:rPr>
+              <w:t>Cost</w:t>
+            </w:r>
+          </w:p>
+        </w:tc>
+        <w:tc>
+          <w:tcPr>
+            <w:tcW w:type="dxa" w:w="4320"/>
+            <w:shd w:val="clear" w:color="auto" w:fill="F4F6FA"/>
+          </w:tcPr>
+          <w:p>
+            <w:r/>
+            <w:r>
+              <w:rPr/>
+              <w:t>as on the cards</w:t>
+            </w:r>
+          </w:p>
+        </w:tc>
+      </w:tr>
+      <w:tr>
+        <w:tc>
+          <w:tcPr>
+            <w:tcW w:type="dxa" w:w="4320"/>
+          </w:tcPr>
+          <w:p>
+            <w:r/>
+            <w:r>
+              <w:rPr>
+                <w:b/>
+              </w:rPr>
+              <w:t>Max profit</w:t>
+            </w:r>
+            <w:r>
+              <w:rPr/>
+              <w:t xml:space="preserve"> / </w:t>
+            </w:r>
+            <w:r>
+              <w:rPr>
+                <w:b/>
+              </w:rPr>
+              <w:t>Max loss</w:t>
+            </w:r>
+          </w:p>
+        </w:tc>
+        <w:tc>
+          <w:tcPr>
+            <w:tcW w:type="dxa" w:w="4320"/>
+          </w:tcPr>
+          <w:p>
+            <w:r/>
+            <w:r>
+              <w:rPr/>
+              <w:t xml:space="preserve">dollars, or </w:t>
+            </w:r>
+            <w:r>
+              <w:rPr>
+                <w:b/>
+              </w:rPr>
+              <w:t>∞</w:t>
+            </w:r>
+            <w:r>
+              <w:rPr/>
+              <w:t xml:space="preserve">; a naked short's loss carries an </w:t>
+            </w:r>
+            <w:r>
+              <w:rPr>
+                <w:i/>
+              </w:rPr>
+              <w:t>undefined risk</w:t>
+            </w:r>
+            <w:r>
+              <w:rPr/>
+              <w:t xml:space="preserve"> tag, because its figure is a margin estimate, not a cap</w:t>
+            </w:r>
+          </w:p>
+        </w:tc>
+      </w:tr>
+      <w:tr>
+        <w:tc>
+          <w:tcPr>
+            <w:tcW w:type="dxa" w:w="4320"/>
+            <w:shd w:val="clear" w:color="auto" w:fill="F4F6FA"/>
+          </w:tcPr>
+          <w:p>
+            <w:r/>
+            <w:r>
+              <w:rPr>
+                <w:b/>
+              </w:rPr>
+              <w:t>Probability of profit</w:t>
+            </w:r>
+          </w:p>
+        </w:tc>
+        <w:tc>
+          <w:tcPr>
+            <w:tcW w:type="dxa" w:w="4320"/>
+            <w:shd w:val="clear" w:color="auto" w:fill="F4F6FA"/>
+          </w:tcPr>
+          <w:p>
+            <w:r/>
+            <w:r>
+              <w:rPr/>
+              <w:t>bar plus percent</w:t>
+            </w:r>
+          </w:p>
+        </w:tc>
+      </w:tr>
+      <w:tr>
+        <w:tc>
+          <w:tcPr>
+            <w:tcW w:type="dxa" w:w="4320"/>
+          </w:tcPr>
+          <w:p>
+            <w:r/>
+            <w:r>
+              <w:rPr>
+                <w:b/>
+              </w:rPr>
+              <w:t>Grade</w:t>
+            </w:r>
+          </w:p>
+        </w:tc>
+        <w:tc>
+          <w:tcPr>
+            <w:tcW w:type="dxa" w:w="4320"/>
+          </w:tcPr>
+          <w:p>
+            <w:r/>
+            <w:r>
+              <w:rPr/>
+              <w:t>quality grade, with its reason on hover</w:t>
+            </w:r>
+          </w:p>
+        </w:tc>
+      </w:tr>
+    </w:tbl>
+    <w:p/>
+    <w:p>
+      <w:r>
+        <w:rPr/>
+        <w:t xml:space="preserve">The last column holds </w:t>
+      </w:r>
+      <w:r>
+        <w:rPr>
+          <w:b/>
+        </w:rPr>
+        <w:t>Send to Calculator</w:t>
+      </w:r>
+      <w:r>
+        <w:rPr/>
+        <w:t xml:space="preserve">, </w:t>
+      </w:r>
+      <w:r>
+        <w:rPr>
+          <w:b/>
+        </w:rPr>
+        <w:t>Send to Paper trade</w:t>
+      </w:r>
+      <w:r>
+        <w:rPr/>
+        <w:t xml:space="preserve"> (where allowed) and</w:t>
+        <w:br/>
+      </w:r>
+      <w:r>
+        <w:rPr>
+          <w:b/>
+        </w:rPr>
+        <w:t>Expected Move</w:t>
+      </w:r>
+      <w:r>
+        <w:rPr/>
+        <w:t>. The number columns sort on their values. The list grows with the page</w:t>
+        <w:br/>
+        <w:t>rather than scrolling in a short box. Legs, breakevens and bias are not columns — they are</w:t>
+        <w:br/>
+        <w:t>in the detail panel.</w:t>
+      </w:r>
+    </w:p>
+    <w:p>
+      <w:r>
+        <w:rPr>
+          <w:b/>
+        </w:rPr>
+        <w:t>The Grade is quality-gated, not fit-gated</w:t>
+      </w:r>
+      <w:r>
+        <w:rPr/>
+        <w:t xml:space="preserve"> — it is driven by structural quality and</w:t>
+        <w:br/>
+        <w:t>per-family hard gates, and carries a tooltip explaining the reason. A high score with a</w:t>
+        <w:br/>
+        <w:t>poor grade means "fits your view, but badly constructed".</w:t>
+      </w:r>
+    </w:p>
+    <w:p>
+      <w:r>
+        <w:rPr>
+          <w:b/>
+        </w:rPr>
+        <w:t>The legs line on a card</w:t>
+      </w:r>
+      <w:r>
+        <w:rPr/>
+        <w:t xml:space="preserve"> prints a share lot as </w:t>
+      </w:r>
+      <w:r>
+        <w:rPr>
+          <w:rFonts w:ascii="Consolas" w:hAnsi="Consolas"/>
+          <w:color w:val="334455"/>
+          <w:sz w:val="19"/>
+        </w:rPr>
+        <w:t>L 100 shares</w:t>
+      </w:r>
+      <w:r>
+        <w:rPr/>
+        <w:t>, a leg of more than one</w:t>
+        <w:br/>
+        <w:t xml:space="preserve">contract as </w:t>
+      </w:r>
+      <w:r>
+        <w:rPr>
+          <w:rFonts w:ascii="Consolas" w:hAnsi="Consolas"/>
+          <w:color w:val="334455"/>
+          <w:sz w:val="19"/>
+        </w:rPr>
+        <w:t>S 2×100C</w:t>
+      </w:r>
+      <w:r>
+        <w:rPr/>
+        <w:t xml:space="preserve"> (a butterfly's body), and a leg on a later expiration with its</w:t>
+        <w:br/>
+        <w:t xml:space="preserve">date — </w:t>
+      </w:r>
+      <w:r>
+        <w:rPr>
+          <w:rFonts w:ascii="Consolas" w:hAnsi="Consolas"/>
+          <w:color w:val="334455"/>
+          <w:sz w:val="19"/>
+        </w:rPr>
+        <w:t>S 100C / L 100C 11/13</w:t>
+      </w:r>
+      <w:r>
+        <w:rPr/>
+        <w:t xml:space="preserve"> is a calendar.</w:t>
+      </w:r>
+    </w:p>
+    <w:p>
+      <w:r>
+        <w:rPr>
+          <w:b/>
+        </w:rPr>
+        <w:t>The Trade detail panel</w:t>
+      </w:r>
+      <w:r>
+        <w:rPr/>
+        <w:t xml:space="preserve"> starts </w:t>
+      </w:r>
+      <w:r>
+        <w:rPr>
+          <w:b/>
+        </w:rPr>
+        <w:t>closed</w:t>
+      </w:r>
+      <w:r>
+        <w:rPr/>
+        <w:t>, so the list keeps its width, opens whenever</w:t>
+        <w:br/>
+        <w:t>a card or row is clicked, and is cleared by a new scan. It follows the same rules in</w:t>
+        <w:br/>
+        <w:t xml:space="preserve">words: </w:t>
+      </w:r>
+      <w:r>
+        <w:rPr>
+          <w:rFonts w:ascii="Consolas" w:hAnsi="Consolas"/>
+          <w:color w:val="334455"/>
+          <w:sz w:val="19"/>
+        </w:rPr>
+        <w:t>Buy 100</w:t>
+        <w:br/>
+        <w:t>shares</w:t>
+      </w:r>
+      <w:r>
+        <w:rPr/>
+        <w:t xml:space="preserve"> for a share lot, </w:t>
+      </w:r>
+      <w:r>
+        <w:rPr>
+          <w:rFonts w:ascii="Consolas" w:hAnsi="Consolas"/>
+          <w:color w:val="334455"/>
+          <w:sz w:val="19"/>
+        </w:rPr>
+        <w:t>Sell 2× 100 C</w:t>
+      </w:r>
+      <w:r>
+        <w:rPr/>
+        <w:t xml:space="preserve"> for a butterfly's body, each leg on its own line</w:t>
+        <w:br/>
+        <w:t>with its own date when the legs span more than one expiration (the single "Exp" caption is</w:t>
+        <w:br/>
+        <w:t xml:space="preserve">then left off, since it would name only the near month), </w:t>
+      </w:r>
+      <w:r>
+        <w:rPr>
+          <w:b/>
+        </w:rPr>
+        <w:t>every</w:t>
+      </w:r>
+      <w:r>
+        <w:rPr/>
+        <w:t xml:space="preserve"> breakeven joined with</w:t>
+        <w:br/>
+      </w:r>
+      <w:r>
+        <w:rPr>
+          <w:rFonts w:ascii="Consolas" w:hAnsi="Consolas"/>
+          <w:color w:val="334455"/>
+          <w:sz w:val="19"/>
+        </w:rPr>
+        <w:t>/</w:t>
+      </w:r>
+      <w:r>
+        <w:rPr/>
+        <w:t xml:space="preserve">, and dollars stated </w:t>
+      </w:r>
+      <w:r>
+        <w:rPr>
+          <w:b/>
+        </w:rPr>
+        <w:t>per position</w:t>
+      </w:r>
+      <w:r>
+        <w:rPr/>
+        <w:t xml:space="preserve"> rather than per contract when shares are part</w:t>
+        <w:br/>
+        <w:t>of it — a share lot is thousands of dollars, not a contract's worth.</w:t>
+      </w:r>
+    </w:p>
+    <w:p>
+      <w:r>
+        <w:rPr>
+          <w:b/>
+        </w:rPr>
+        <w:t>The count line</w:t>
+      </w:r>
+      <w:r>
+        <w:rPr/>
+        <w:t xml:space="preserve"> in the summary strip reads like </w:t>
+      </w:r>
+      <w:r>
+        <w:rPr>
+          <w:i/>
+        </w:rPr>
+        <w:t>16 ideas · 6 below the quality bar ·</w:t>
+        <w:br/>
+        <w:t>0 where premium is too cheap to sell</w:t>
+      </w:r>
+      <w:r>
+        <w:rPr/>
+        <w:t xml:space="preserve">. The </w:t>
+      </w:r>
+      <w:r>
+        <w:rPr>
+          <w:b/>
+        </w:rPr>
+        <w:t>below the quality bar</w:t>
+      </w:r>
+      <w:r>
+        <w:rPr/>
+        <w:t xml:space="preserve"> count is what</w:t>
+        <w:br/>
+        <w:t xml:space="preserve">distinguishes </w:t>
+      </w:r>
+      <w:r>
+        <w:rPr>
+          <w:i/>
+        </w:rPr>
+        <w:t>"the scan found things and rejected them all"</w:t>
+      </w:r>
+      <w:r>
+        <w:rPr/>
+        <w:t xml:space="preserve"> from </w:t>
+      </w:r>
+      <w:r>
+        <w:rPr>
+          <w:i/>
+        </w:rPr>
+        <w:t>"the scan found</w:t>
+        <w:br/>
+        <w:t>nothing"</w:t>
+      </w:r>
+      <w:r>
+        <w:rPr/>
+        <w:t xml:space="preserve"> — two very different situations that would otherwise look identical. The </w:t>
+      </w:r>
+      <w:r>
+        <w:rPr>
+          <w:b/>
+        </w:rPr>
+        <w:t>too</w:t>
+        <w:br/>
+        <w:t>cheap to sell</w:t>
+      </w:r>
+      <w:r>
+        <w:rPr/>
+        <w:t xml:space="preserve"> count is a different reason: trades that would sell premium, dropped</w:t>
+        <w:br/>
+        <w:t>because this symbol's volatility is historically low (trades that buy premium are kept).</w:t>
+      </w:r>
+    </w:p>
+    <w:p>
+      <w:r>
+        <w:rPr>
+          <w:b/>
+        </w:rPr>
+        <w:t>While a scan runs</w:t>
+      </w:r>
+      <w:r>
+        <w:rPr/>
+        <w:t xml:space="preserve"> the cards become placeholders reading </w:t>
+      </w:r>
+      <w:r>
+        <w:rPr>
+          <w:i/>
+        </w:rPr>
+        <w:t>Scanning SPY…</w:t>
+      </w:r>
+      <w:r>
+        <w:rPr/>
+        <w:t xml:space="preserve"> — the symbol</w:t>
+        <w:br/>
+        <w:t>asked for, never the previous one. A slow scan says it is taking longer than expected</w:t>
+        <w:br/>
+        <w:t>and keeps waiting; whatever lands belongs to the symbol being scanned.</w:t>
+      </w:r>
+    </w:p>
+    <w:p>
+      <w:r>
+        <w:rPr/>
+        <w:t xml:space="preserve">⚠ </w:t>
+      </w:r>
+      <w:r>
+        <w:rPr>
+          <w:b/>
+        </w:rPr>
+        <w:t>On fairly priced options, two structures are in that count on nearly every scan: the</w:t>
+        <w:br/>
+        <w:t>short straddle and the covered call.</w:t>
+      </w:r>
+      <w:r>
+        <w:rPr/>
+        <w:t xml:space="preserve"> Both are judged as premium sales, whose bar asks</w:t>
+        <w:br/>
+        <w:t>for a 65% probability of profit, and both measure around 57% and 52%. That is an operator</w:t>
+        <w:br/>
+        <w:t>decision — no lower bar is invented without outcome data — so they are counted, not</w:t>
+        <w:br/>
+        <w:t xml:space="preserve">shown. The cut is not unconditional: when options are priced </w:t>
+      </w:r>
+      <w:r>
+        <w:rPr>
+          <w:b/>
+        </w:rPr>
+        <w:t>rich</w:t>
+      </w:r>
+      <w:r>
+        <w:rPr/>
+        <w:t xml:space="preserve"> — premium well above</w:t>
+        <w:br/>
+        <w:t>the volatility the probability is computed from — a short straddle's larger credit widens</w:t>
+        <w:br/>
+        <w:t>its breakevens past the bar (in a synthetic test, from about 20% rich), and it is listed.</w:t>
+        <w:br/>
+        <w:t>The covered call stayed cut in every case tested. The long straddle and</w:t>
+        <w:br/>
+        <w:t xml:space="preserve">long strangle typically pass only as </w:t>
+      </w:r>
+      <w:r>
+        <w:rPr>
+          <w:i/>
+        </w:rPr>
+        <w:t>Marginal</w:t>
+      </w:r>
+      <w:r>
+        <w:rPr/>
+        <w:t>. Measured outcomes for every structure are</w:t>
+        <w:br/>
+        <w:t xml:space="preserve">in the </w:t>
+      </w:r>
+      <w:r>
+        <w:rPr>
+          <w:i/>
+        </w:rPr>
+        <w:t>Technical Reference</w:t>
+      </w:r>
+      <w:r>
+        <w:rPr/>
+        <w:t xml:space="preserve"> (Strategy Finder scoring).</w:t>
+      </w:r>
+    </w:p>
+    <w:p>
+      <w:r>
+        <w:rPr>
+          <w:b/>
+        </w:rPr>
+        <w:t>Earnings.</w:t>
+      </w:r>
+      <w:r>
+        <w:rPr/>
+        <w:t xml:space="preserve"> A calendar or diagonal is checked against its </w:t>
+      </w:r>
+      <w:r>
+        <w:rPr>
+          <w:b/>
+        </w:rPr>
+        <w:t>latest</w:t>
+      </w:r>
+      <w:r>
+        <w:rPr/>
+        <w:t xml:space="preserve"> expiration: the</w:t>
+        <w:br/>
+        <w:t>back month is still open through a report that lands after the front expires.</w:t>
+      </w:r>
+    </w:p>
+    <w:p>
+      <w:r>
+        <w:rPr>
+          <w:b/>
+        </w:rPr>
+        <w:t>Calculator</w:t>
+      </w:r>
+      <w:r>
+        <w:rPr/>
+        <w:t xml:space="preserve"> (on a card) and the list's </w:t>
+      </w:r>
+      <w:r>
+        <w:rPr>
+          <w:b/>
+        </w:rPr>
+        <w:t>Send to Calculator</w:t>
+      </w:r>
+      <w:r>
+        <w:rPr/>
+        <w:t xml:space="preserve"> and </w:t>
+      </w:r>
+      <w:r>
+        <w:rPr>
+          <w:b/>
+        </w:rPr>
+        <w:t>Expected Move</w:t>
+      </w:r>
+      <w:r>
+        <w:rPr/>
+        <w:br/>
+        <w:t>work for all types — a calendar arrives with both expirations and a share leg as the Calculator's</w:t>
+        <w:br/>
+        <w:t xml:space="preserve">stock leg. ⚠ Clicking an expiration pill on the Calculator afterwards moves </w:t>
+      </w:r>
+      <w:r>
+        <w:rPr>
+          <w:b/>
+        </w:rPr>
+        <w:t>every</w:t>
+      </w:r>
+      <w:r>
+        <w:rPr/>
+        <w:br/>
+        <w:t>option leg to that one date, which collapses a calendar into a single-expiry trade.</w:t>
+      </w:r>
+    </w:p>
+    <w:p>
+      <w:r>
+        <w:rPr>
+          <w:b/>
+        </w:rPr>
+        <w:t>Send to Paper trade</w:t>
+      </w:r>
+      <w:r>
+        <w:rPr/>
+        <w:t xml:space="preserve"> appears for credit structures (PCS, CCS, IC), defined-risk debit</w:t>
+        <w:br/>
+        <w:t xml:space="preserve">structures (long call/put, bull call, bear put) and the </w:t>
+      </w:r>
+      <w:r>
+        <w:rPr>
+          <w:b/>
+        </w:rPr>
+        <w:t>call and put butterflies and</w:t>
+        <w:br/>
+        <w:t>condors</w:t>
+      </w:r>
+      <w:r>
+        <w:rPr/>
+        <w:t>. The ledger refuses a debit structure that arrives with no positive debit,</w:t>
+        <w:br/>
+        <w:t>rather than opening it as a free trade whose every later mark would overstate the</w:t>
+        <w:br/>
+        <w:t>result. No button for:</w:t>
+      </w:r>
+    </w:p>
+    <w:tbl>
+      <w:tblPr>
+        <w:tblW w:type="auto" w:w="0"/>
+        <w:jc w:val="left"/>
+        <w:tblLayout w:type="autofit"/>
+        <w:tblLook w:firstColumn="1" w:firstRow="1" w:lastColumn="0" w:lastRow="0" w:noHBand="0" w:noVBand="1" w:val="04A0"/>
+        <w:tblBorders>
+          <w:top w:val="single" w:sz="4" w:space="0" w:color="D8DEE9"/>
+          <w:left w:val="single" w:sz="4" w:space="0" w:color="D8DEE9"/>
+          <w:bottom w:val="single" w:sz="4" w:space="0" w:color="D8DEE9"/>
+          <w:right w:val="single" w:sz="4" w:space="0" w:color="D8DEE9"/>
+          <w:insideH w:val="single" w:sz="4" w:space="0" w:color="D8DEE9"/>
+          <w:insideV w:val="single" w:sz="4" w:space="0" w:color="D8DEE9"/>
+        </w:tblBorders>
+      </w:tblPr>
+      <w:tblGrid>
+        <w:gridCol w:w="4320"/>
+        <w:gridCol w:w="4320"/>
+      </w:tblGrid>
+      <w:tr>
+        <w:tc>
+          <w:tcPr>
+            <w:tcW w:type="dxa" w:w="4320"/>
+            <w:shd w:val="clear" w:color="auto" w:fill="EAF2FB"/>
+          </w:tcPr>
+          <w:p>
+            <w:r>
+              <w:rPr>
+                <w:b/>
+              </w:rPr>
+            </w:r>
+            <w:r>
+              <w:rPr>
+                <w:b/>
+              </w:rPr>
+              <w:t>Structure</w:t>
+            </w:r>
+          </w:p>
+        </w:tc>
+        <w:tc>
+          <w:tcPr>
+            <w:tcW w:type="dxa" w:w="4320"/>
+            <w:shd w:val="clear" w:color="auto" w:fill="EAF2FB"/>
+          </w:tcPr>
+          <w:p>
+            <w:r>
+              <w:rPr>
+                <w:b/>
+              </w:rPr>
+            </w:r>
+            <w:r>
+              <w:rPr>
+                <w:b/>
+              </w:rPr>
+              <w:t>Why</w:t>
+            </w:r>
+          </w:p>
+        </w:tc>
+      </w:tr>
+      <w:tr>
+        <w:tc>
+          <w:tcPr>
+            <w:tcW w:type="dxa" w:w="4320"/>
+          </w:tcPr>
+          <w:p>
+            <w:r/>
+            <w:r>
+              <w:rPr/>
+              <w:t>Naked shorts</w:t>
+            </w:r>
+          </w:p>
+        </w:tc>
+        <w:tc>
+          <w:tcPr>
+            <w:tcW w:type="dxa" w:w="4320"/>
+          </w:tcPr>
+          <w:p>
+            <w:r/>
+            <w:r>
+              <w:rPr/>
+              <w:t>undefined risk</w:t>
+            </w:r>
+          </w:p>
+        </w:tc>
+      </w:tr>
+      <w:tr>
+        <w:tc>
+          <w:tcPr>
+            <w:tcW w:type="dxa" w:w="4320"/>
+            <w:shd w:val="clear" w:color="auto" w:fill="F4F6FA"/>
+          </w:tcPr>
+          <w:p>
+            <w:r/>
+            <w:r>
+              <w:rPr/>
+              <w:t>Straddles and strangles, long or short</w:t>
+            </w:r>
+          </w:p>
+        </w:tc>
+        <w:tc>
+          <w:tcPr>
+            <w:tcW w:type="dxa" w:w="4320"/>
+            <w:shd w:val="clear" w:color="auto" w:fill="F4F6FA"/>
+          </w:tcPr>
+          <w:p>
+            <w:r/>
+            <w:r>
+              <w:rPr>
+                <w:b/>
+              </w:rPr>
+              <w:t>analysis only</w:t>
+            </w:r>
+            <w:r>
+              <w:rPr/>
+              <w:t xml:space="preserve"> — a standing decision; the paper ledger does not accept them</w:t>
+            </w:r>
+          </w:p>
+        </w:tc>
+      </w:tr>
+      <w:tr>
+        <w:tc>
+          <w:tcPr>
+            <w:tcW w:type="dxa" w:w="4320"/>
+          </w:tcPr>
+          <w:p>
+            <w:r/>
+            <w:r>
+              <w:rPr/>
+              <w:t>Iron butterfly</w:t>
+            </w:r>
+          </w:p>
+        </w:tc>
+        <w:tc>
+          <w:tcPr>
+            <w:tcW w:type="dxa" w:w="4320"/>
+          </w:tcPr>
+          <w:p>
+            <w:r/>
+            <w:r>
+              <w:rPr/>
+              <w:t>the ledger's credit path understands only two-strike spreads and iron condors</w:t>
+            </w:r>
+          </w:p>
+        </w:tc>
+      </w:tr>
+      <w:tr>
+        <w:tc>
+          <w:tcPr>
+            <w:tcW w:type="dxa" w:w="4320"/>
+            <w:shd w:val="clear" w:color="auto" w:fill="F4F6FA"/>
+          </w:tcPr>
+          <w:p>
+            <w:r/>
+            <w:r>
+              <w:rPr/>
+              <w:t>Calendars and diagonals</w:t>
+            </w:r>
+          </w:p>
+        </w:tc>
+        <w:tc>
+          <w:tcPr>
+            <w:tcW w:type="dxa" w:w="4320"/>
+            <w:shd w:val="clear" w:color="auto" w:fill="F4F6FA"/>
+          </w:tcPr>
+          <w:p>
+            <w:r/>
+            <w:r>
+              <w:rPr/>
+              <w:t>the ledger settles every leg at intrinsic, which is wrong for a back month</w:t>
+            </w:r>
+          </w:p>
+        </w:tc>
+      </w:tr>
+      <w:tr>
+        <w:tc>
+          <w:tcPr>
+            <w:tcW w:type="dxa" w:w="4320"/>
+          </w:tcPr>
+          <w:p>
+            <w:r/>
+            <w:r>
+              <w:rPr/>
+              <w:t>Covered call, protective put, collar</w:t>
+            </w:r>
+          </w:p>
+        </w:tc>
+        <w:tc>
+          <w:tcPr>
+            <w:tcW w:type="dxa" w:w="4320"/>
+          </w:tcPr>
+          <w:p>
+            <w:r/>
+            <w:r>
+              <w:rPr/>
+              <w:t>the ledger holds no shares</w:t>
+            </w:r>
+          </w:p>
+        </w:tc>
+      </w:tr>
+    </w:tbl>
+    <w:p/>
+    <w:p>
       <w:pPr>
         <w:pStyle w:val="Heading3"/>
       </w:pPr>
@@ -29129,9 +30124,9 @@
         <w:rPr/>
         <w:t xml:space="preserve"> The inferred view is a model output, not a fact. If you disagree</w:t>
         <w:br/>
-        <w:t>with the banner, the ranking beneath it is ranking against the wrong hypothesis — read</w:t>
-        <w:br/>
-        <w:t>the banner first and discard the scan if it is wrong.</w:t>
+        <w:t>with the view pills, the ranking beneath them is ranking against the wrong hypothesis —</w:t>
+        <w:br/>
+        <w:t>read the pills first and discard the scan if they are wrong.</w:t>
       </w:r>
     </w:p>
     <w:p>

</xml_diff>

<commit_message>
fix(finder): top picks fill every slot when a filter leaves fewer groups
top_picks still gives each visible group's best idea a card before any group
gets a second, but when the rows span fewer than four groups (one chip
clicked, say) the remaining slots now fill with the next-best ideas in score
order - a Calendars-only filter showed a single card. The existing
distinct-groups test's two-spread case now expects both (authorised); new
tests cover a one-group list of five and the distinct-first-then-fill order.

The design doc, page help and the User and Reference Guide Strategy Finder
sections say so; both manuals rebuilt.

Co-Authored-By: Claude Opus 5 <noreply@anthropic.com>
</commit_message>
<xml_diff>
--- a/docs/manuals/reference-guide/reference-guide.docx
+++ b/docs/manuals/reference-guide/reference-guide.docx
@@ -28780,21 +28780,15 @@
       </w:r>
       <w:r>
         <w:rPr/>
-        <w:t xml:space="preserve"> Up to four cards, each the best-scoring idea from a </w:t>
-      </w:r>
-      <w:r>
-        <w:rPr>
-          <w:b/>
-        </w:rPr>
-        <w:t>different</w:t>
-      </w:r>
-      <w:r>
-        <w:rPr/>
-        <w:t xml:space="preserve"> group</w:t>
-        <w:br/>
-        <w:t>among what the chips show — the cards exist to compare structures, and four spreads in a</w:t>
-        <w:br/>
-        <w:t>row would be one idea shown four times. A card carries the score and grade, the</w:t>
+        <w:t xml:space="preserve"> Up to four cards. Each group among what the chips show gets its</w:t>
+        <w:br/>
+        <w:t>best-scoring idea onto a card before any group gets a second — the cards exist to compare</w:t>
+        <w:br/>
+        <w:t>structures, and four spreads in a row would be one idea shown four times. When fewer than</w:t>
+        <w:br/>
+        <w:t>four groups are showing (a single chip clicked, say), the spare cards go to the next-best</w:t>
+        <w:br/>
+        <w:t>ideas by score, so the row still fills. A card carries the score and grade, the</w:t>
         <w:br/>
         <w:t xml:space="preserve">expiration and days to go, the legs, the cost, </w:t>
       </w:r>

</xml_diff>

<commit_message>
docs(finder): the top-picks fill rule, the payoff window and the slow-scan card
Corrected in place: CHANGELOG and webgui-routes describe top picks filling
every slot and the one still card plus the new status line when a scan has not
landed; routes and the design doc's Data section give the payoff window as the
wider of +/-2 expected moves and the outermost strikes +/-3%, and a no-marks row
getting no curve; the design doc records the detail panel's open()/collapse()
and the 280x56 card shape. Page help and the User and Reference Guides say what
a slow scan now shows; both manuals rebuilt.

Co-Authored-By: Claude Opus 5 <noreply@anthropic.com>
</commit_message>
<xml_diff>
--- a/docs/manuals/reference-guide/reference-guide.docx
+++ b/docs/manuals/reference-guide/reference-guide.docx
@@ -29710,9 +29710,13 @@
         <w:rPr/>
         <w:t xml:space="preserve"> — the symbol</w:t>
         <w:br/>
-        <w:t>asked for, never the previous one. A slow scan says it is taking longer than expected</w:t>
-        <w:br/>
-        <w:t>and keeps waiting; whatever lands belongs to the symbol being scanned.</w:t>
+        <w:t>asked for, never the previous one. A slow scan turns them into one still card and says</w:t>
+        <w:br/>
+        <w:t>it is taking longer than expected — a late result still appears, and if nothing arrives,</w:t>
+        <w:br/>
+        <w:t>check System Status and scan again; whatever lands belongs to the scan asked for, same</w:t>
+        <w:br/>
+        <w:t>symbol and same settings.</w:t>
       </w:r>
     </w:p>
     <w:p>

</xml_diff>

<commit_message>
feat(finder): the ranked list names each row's strikes
A Strikes column beside Expiry prints the top-pick card's legs line
(strategy_table.legs_summary, injected into finder_rows). Strikes and Cost
wrap, and every header may wrap, so the actions stay on screen at 1440 px;
a leg never breaks across lines.

Co-Authored-By: Claude Opus 5 <noreply@anthropic.com>
</commit_message>
<xml_diff>
--- a/docs/manuals/reference-guide/reference-guide.docx
+++ b/docs/manuals/reference-guide/reference-guide.docx
@@ -29252,7 +29252,7 @@
               <w:rPr>
                 <w:b/>
               </w:rPr>
-              <w:t>Expiry</w:t>
+              <w:t>Strikes</w:t>
             </w:r>
           </w:p>
         </w:tc>
@@ -29264,7 +29264,39 @@
             <w:r/>
             <w:r>
               <w:rPr/>
-              <w:t>expiration and days to go</w:t>
+              <w:t xml:space="preserve">each leg, as on the cards: </w:t>
+            </w:r>
+            <w:r>
+              <w:rPr>
+                <w:rFonts w:ascii="Consolas" w:hAnsi="Consolas"/>
+                <w:color w:val="334455"/>
+                <w:sz w:val="19"/>
+              </w:rPr>
+              <w:t>L 765P / S 761P</w:t>
+            </w:r>
+            <w:r>
+              <w:rPr/>
+              <w:t>; a leg on a later expiration adds its date (</w:t>
+            </w:r>
+            <w:r>
+              <w:rPr>
+                <w:rFonts w:ascii="Consolas" w:hAnsi="Consolas"/>
+                <w:color w:val="334455"/>
+                <w:sz w:val="19"/>
+              </w:rPr>
+              <w:t>S 220P / L 220P 10/16</w:t>
+            </w:r>
+            <w:r>
+              <w:rPr/>
+              <w:t xml:space="preserve">), a share leg reads </w:t>
+            </w:r>
+            <w:r>
+              <w:rPr>
+                <w:rFonts w:ascii="Consolas" w:hAnsi="Consolas"/>
+                <w:color w:val="334455"/>
+                <w:sz w:val="19"/>
+              </w:rPr>
+              <w:t>L 100 shares</w:t>
             </w:r>
           </w:p>
         </w:tc>
@@ -29281,7 +29313,7 @@
               <w:rPr>
                 <w:b/>
               </w:rPr>
-              <w:t>Cost</w:t>
+              <w:t>Expiry</w:t>
             </w:r>
           </w:p>
         </w:tc>
@@ -29294,7 +29326,7 @@
             <w:r/>
             <w:r>
               <w:rPr/>
-              <w:t>as on the cards</w:t>
+              <w:t>expiration and days to go</w:t>
             </w:r>
           </w:p>
         </w:tc>
@@ -29310,17 +29342,7 @@
               <w:rPr>
                 <w:b/>
               </w:rPr>
-              <w:t>Max profit</w:t>
-            </w:r>
-            <w:r>
-              <w:rPr/>
-              <w:t xml:space="preserve"> / </w:t>
-            </w:r>
-            <w:r>
-              <w:rPr>
-                <w:b/>
-              </w:rPr>
-              <w:t>Max loss</w:t>
+              <w:t>Cost</w:t>
             </w:r>
           </w:p>
         </w:tc>
@@ -29332,27 +29354,7 @@
             <w:r/>
             <w:r>
               <w:rPr/>
-              <w:t xml:space="preserve">dollars, or </w:t>
-            </w:r>
-            <w:r>
-              <w:rPr>
-                <w:b/>
-              </w:rPr>
-              <w:t>∞</w:t>
-            </w:r>
-            <w:r>
-              <w:rPr/>
-              <w:t xml:space="preserve">; a naked short's loss carries an </w:t>
-            </w:r>
-            <w:r>
-              <w:rPr>
-                <w:i/>
-              </w:rPr>
-              <w:t>undefined risk</w:t>
-            </w:r>
-            <w:r>
-              <w:rPr/>
-              <w:t xml:space="preserve"> tag, because its figure is a margin estimate, not a cap</w:t>
+              <w:t>as on the cards</w:t>
             </w:r>
           </w:p>
         </w:tc>
@@ -29369,7 +29371,17 @@
               <w:rPr>
                 <w:b/>
               </w:rPr>
-              <w:t>Probability of profit</w:t>
+              <w:t>Max profit</w:t>
+            </w:r>
+            <w:r>
+              <w:rPr/>
+              <w:t xml:space="preserve"> / </w:t>
+            </w:r>
+            <w:r>
+              <w:rPr>
+                <w:b/>
+              </w:rPr>
+              <w:t>Max loss</w:t>
             </w:r>
           </w:p>
         </w:tc>
@@ -29382,7 +29394,27 @@
             <w:r/>
             <w:r>
               <w:rPr/>
-              <w:t>bar plus percent</w:t>
+              <w:t xml:space="preserve">dollars, or </w:t>
+            </w:r>
+            <w:r>
+              <w:rPr>
+                <w:b/>
+              </w:rPr>
+              <w:t>∞</w:t>
+            </w:r>
+            <w:r>
+              <w:rPr/>
+              <w:t xml:space="preserve">; a naked short's loss carries an </w:t>
+            </w:r>
+            <w:r>
+              <w:rPr>
+                <w:i/>
+              </w:rPr>
+              <w:t>undefined risk</w:t>
+            </w:r>
+            <w:r>
+              <w:rPr/>
+              <w:t xml:space="preserve"> tag, because its figure is a margin estimate, not a cap</w:t>
             </w:r>
           </w:p>
         </w:tc>
@@ -29398,6 +29430,35 @@
               <w:rPr>
                 <w:b/>
               </w:rPr>
+              <w:t>Probability of profit</w:t>
+            </w:r>
+          </w:p>
+        </w:tc>
+        <w:tc>
+          <w:tcPr>
+            <w:tcW w:type="dxa" w:w="4320"/>
+          </w:tcPr>
+          <w:p>
+            <w:r/>
+            <w:r>
+              <w:rPr/>
+              <w:t>bar plus percent</w:t>
+            </w:r>
+          </w:p>
+        </w:tc>
+      </w:tr>
+      <w:tr>
+        <w:tc>
+          <w:tcPr>
+            <w:tcW w:type="dxa" w:w="4320"/>
+            <w:shd w:val="clear" w:color="auto" w:fill="F4F6FA"/>
+          </w:tcPr>
+          <w:p>
+            <w:r/>
+            <w:r>
+              <w:rPr>
+                <w:b/>
+              </w:rPr>
               <w:t>Grade</w:t>
             </w:r>
           </w:p>
@@ -29405,6 +29466,7 @@
         <w:tc>
           <w:tcPr>
             <w:tcW w:type="dxa" w:w="4320"/>
+            <w:shd w:val="clear" w:color="auto" w:fill="F4F6FA"/>
           </w:tcPr>
           <w:p>
             <w:r/>
@@ -29453,9 +29515,9 @@
         <w:rPr/>
         <w:t>. The number columns sort on their values. The list grows with the page</w:t>
         <w:br/>
-        <w:t>rather than scrolling in a short box. Legs, breakevens and bias are not columns — they are</w:t>
-        <w:br/>
-        <w:t>in the detail panel.</w:t>
+        <w:t>rather than scrolling in a short box. Breakevens and bias are not columns — they are in the</w:t>
+        <w:br/>
+        <w:t>detail panel, along with each leg written out in full.</w:t>
       </w:r>
     </w:p>
     <w:p>

</xml_diff>

<commit_message>
docs: Reference Guide Paper wording; limits guard covers every table
Co-Authored-By: Claude Opus 5 <noreply@anthropic.com>
</commit_message>
<xml_diff>
--- a/docs/manuals/reference-guide/reference-guide.docx
+++ b/docs/manuals/reference-guide/reference-guide.docx
@@ -20668,7 +20668,9 @@
         <w:br/>
         <w:t>trade, plus limits per symbol, sector, expiration and for the whole ledger); a</w:t>
         <w:br/>
-        <w:t>message a moment later says it opened, or why not and how many contracts would fit.</w:t>
+        <w:t>message a moment later says whether it opened — or why not, and how many contracts</w:t>
+        <w:br/>
+        <w:t>would fit when a smaller size would.</w:t>
       </w:r>
     </w:p>
     <w:p>
@@ -25002,7 +25004,7 @@
     <w:p>
       <w:r>
         <w:rPr/>
-        <w:t xml:space="preserve">The last four are the </w:t>
+        <w:t xml:space="preserve">The last four rows are the </w:t>
       </w:r>
       <w:r>
         <w:rPr>
@@ -25012,7 +25014,7 @@
       </w:r>
       <w:r>
         <w:rPr/>
-        <w:t>'s own concentration limits.</w:t>
+        <w:t>'s own six concentration limits.</w:t>
         <w:br/>
         <w:t xml:space="preserve">The per-trade limit is not: the engine's is </w:t>
       </w:r>
@@ -25036,11 +25038,13 @@
         <w:rPr>
           <w:b/>
         </w:rPr>
-        <w:t>Every click gets an answer</w:t>
-      </w:r>
-      <w:r>
-        <w:rPr/>
-        <w:t>, a second or so later, on the page you sent it from:</w:t>
+        <w:t>Every click gets an answer while the options service is running</w:t>
+      </w:r>
+      <w:r>
+        <w:rPr/>
+        <w:t>, a second or so</w:t>
+        <w:br/>
+        <w:t>later, on the page you sent it from:</w:t>
       </w:r>
     </w:p>
     <w:p>
@@ -25804,7 +25808,7 @@
     <w:p>
       <w:r>
         <w:rPr/>
-        <w:t>Five limits. The first four each refuse a single trade; the fifth</w:t>
+        <w:t>Eight limits. The first seven each refuse a single trade; the last</w:t>
         <w:br/>
         <w:t>stops the day.</w:t>
       </w:r>
@@ -26025,7 +26029,7 @@
               <w:rPr>
                 <w:b/>
               </w:rPr>
-              <w:t>Positions in one expiry</w:t>
+              <w:t>Positions in one sector</w:t>
             </w:r>
           </w:p>
         </w:tc>
@@ -26053,13 +26057,7 @@
             <w:r/>
             <w:r>
               <w:rPr/>
-              <w:t xml:space="preserve">A sixth open position sharing an expiration date, </w:t>
-            </w:r>
-            <w:r>
-              <w:rPr>
-                <w:i/>
-              </w:rPr>
-              <w:t>across all names</w:t>
+              <w:t>A sixth open position in the same sector; the index products ($SPX, SPY, QQQ, $NDX, DIA, IWM) count as one group</w:t>
             </w:r>
           </w:p>
         </w:tc>
@@ -26072,6 +26070,146 @@
           <w:p>
             <w:r/>
             <w:r>
+              <w:rPr>
+                <w:b/>
+              </w:rPr>
+              <w:t>Risk in one sector</w:t>
+            </w:r>
+          </w:p>
+        </w:tc>
+        <w:tc>
+          <w:tcPr>
+            <w:tcW w:type="dxa" w:w="2880"/>
+          </w:tcPr>
+          <w:p>
+            <w:r/>
+            <w:r>
+              <w:rPr>
+                <w:b/>
+              </w:rPr>
+              <w:t>$1,500</w:t>
+            </w:r>
+          </w:p>
+        </w:tc>
+        <w:tc>
+          <w:tcPr>
+            <w:tcW w:type="dxa" w:w="2880"/>
+          </w:tcPr>
+          <w:p>
+            <w:r/>
+            <w:r>
+              <w:rPr/>
+              <w:t>An entry that would push one sector's summed max loss past the cap</w:t>
+            </w:r>
+          </w:p>
+        </w:tc>
+      </w:tr>
+      <w:tr>
+        <w:tc>
+          <w:tcPr>
+            <w:tcW w:type="dxa" w:w="2880"/>
+            <w:shd w:val="clear" w:color="auto" w:fill="F4F6FA"/>
+          </w:tcPr>
+          <w:p>
+            <w:r/>
+            <w:r>
+              <w:rPr>
+                <w:b/>
+              </w:rPr>
+              <w:t>Positions in one expiry</w:t>
+            </w:r>
+          </w:p>
+        </w:tc>
+        <w:tc>
+          <w:tcPr>
+            <w:tcW w:type="dxa" w:w="2880"/>
+            <w:shd w:val="clear" w:color="auto" w:fill="F4F6FA"/>
+          </w:tcPr>
+          <w:p>
+            <w:r/>
+            <w:r>
+              <w:rPr>
+                <w:b/>
+              </w:rPr>
+              <w:t>5</w:t>
+            </w:r>
+          </w:p>
+        </w:tc>
+        <w:tc>
+          <w:tcPr>
+            <w:tcW w:type="dxa" w:w="2880"/>
+            <w:shd w:val="clear" w:color="auto" w:fill="F4F6FA"/>
+          </w:tcPr>
+          <w:p>
+            <w:r/>
+            <w:r>
+              <w:rPr/>
+              <w:t xml:space="preserve">A sixth open position sharing an expiration date, </w:t>
+            </w:r>
+            <w:r>
+              <w:rPr>
+                <w:i/>
+              </w:rPr>
+              <w:t>across all names</w:t>
+            </w:r>
+          </w:p>
+        </w:tc>
+      </w:tr>
+      <w:tr>
+        <w:tc>
+          <w:tcPr>
+            <w:tcW w:type="dxa" w:w="2880"/>
+          </w:tcPr>
+          <w:p>
+            <w:r/>
+            <w:r>
+              <w:rPr>
+                <w:b/>
+              </w:rPr>
+              <w:t>Open risk across the book</w:t>
+            </w:r>
+          </w:p>
+        </w:tc>
+        <w:tc>
+          <w:tcPr>
+            <w:tcW w:type="dxa" w:w="2880"/>
+          </w:tcPr>
+          <w:p>
+            <w:r/>
+            <w:r>
+              <w:rPr>
+                <w:b/>
+              </w:rPr>
+              <w:t>20%</w:t>
+            </w:r>
+            <w:r>
+              <w:rPr/>
+              <w:t xml:space="preserve"> of the session's starting equity</w:t>
+            </w:r>
+          </w:p>
+        </w:tc>
+        <w:tc>
+          <w:tcPr>
+            <w:tcW w:type="dxa" w:w="2880"/>
+          </w:tcPr>
+          <w:p>
+            <w:r/>
+            <w:r>
+              <w:rPr/>
+              <w:t>An entry that would push the whole book's open max loss past that share</w:t>
+            </w:r>
+          </w:p>
+        </w:tc>
+      </w:tr>
+      <w:tr>
+        <w:tc>
+          <w:tcPr>
+            <w:tcW w:type="dxa" w:w="2880"/>
+            <w:shd w:val="clear" w:color="auto" w:fill="F4F6FA"/>
+          </w:tcPr>
+          <w:p>
+            <w:r/>
+            <w:r>
               <w:rPr/>
               <w:t>Session drawdown</w:t>
             </w:r>
@@ -26080,6 +26218,7 @@
         <w:tc>
           <w:tcPr>
             <w:tcW w:type="dxa" w:w="2880"/>
+            <w:shd w:val="clear" w:color="auto" w:fill="F4F6FA"/>
           </w:tcPr>
           <w:p>
             <w:r/>
@@ -26092,6 +26231,7 @@
         <w:tc>
           <w:tcPr>
             <w:tcW w:type="dxa" w:w="2880"/>
+            <w:shd w:val="clear" w:color="auto" w:fill="F4F6FA"/>
           </w:tcPr>
           <w:p>
             <w:r/>
@@ -26107,7 +26247,7 @@
     <w:p>
       <w:r>
         <w:rPr/>
-        <w:t>The three concentration limits were added on 2026-09-09. Before them the engine had</w:t>
+        <w:t>The six concentration limits (the bold rows) were added from 2026-09-09. Before them the engine had</w:t>
         <w:br/>
         <w:t>nothing between "one trade" and "the whole account", and a book could be entirely one</w:t>
         <w:br/>
@@ -26137,7 +26277,7 @@
     <w:p>
       <w:r>
         <w:rPr/>
-        <w:t xml:space="preserve">All three live in </w:t>
+        <w:t xml:space="preserve">All of these live in </w:t>
       </w:r>
       <w:r>
         <w:rPr>
@@ -26279,7 +26419,7 @@
         <w:t>REJECTED</w:t>
       </w:r>
       <w:r>
-        <w:t>; the three concentration</w:t>
+        <w:t>; the six concentration</w:t>
         <w:br/>
         <w:t xml:space="preserve">  limits do not — they skip the signal silently and log to the service journal</w:t>
         <w:br/>

</xml_diff>

<commit_message>
docs: the Go / No-Go checklist
CHANGELOG entry for Phase 4, per-page detail in webgui-routes.md (the Checks
column and Only clear on both tables, and a Trade detail panel section), the
per-page hover guides, and both end-user manuals: how to use the checklist and
the filter to pick a trade (User Guide), and what each of the nine checks reads,
why a check can be left out or unfinished, and what "Partly checked" means
(Reference Guide). Manuals rebuilt with build_docs.py.

CLAUDE.md gains two in-place corrections rather than a narrative: the Tier-1
book_caps clause now names the checklist's Paper book line as a consumer, and
the "a dialog that cannot preview never blocks" rule states that the checklist
obeys it too - no preview is a GREY line, never Blocked, which is why Only clear
filters on its own flag rather than on the verdict.

checks.py, checks_feed.py and book_fit.py join test_no_inline_style.py's list.

Co-Authored-By: Claude Opus 5 <noreply@anthropic.com>
</commit_message>
<xml_diff>
--- a/docs/manuals/reference-guide/reference-guide.docx
+++ b/docs/manuals/reference-guide/reference-guide.docx
@@ -20686,7 +20686,1692 @@
         <w:rPr/>
         <w:t xml:space="preserve"> to open the Trade detail panel on the right, with a probability</w:t>
         <w:br/>
-        <w:t>speedometer and full contract detail.</w:t>
+        <w:t>speedometer and full contract detail — and the checklist at the top of it.</w:t>
+      </w:r>
+    </w:p>
+    <w:p>
+      <w:pPr>
+        <w:pStyle w:val="Heading3"/>
+      </w:pPr>
+      <w:r>
+        <w:rPr/>
+        <w:t>The Go / No-Go checklist</w:t>
+      </w:r>
+    </w:p>
+    <w:p>
+      <w:r>
+        <w:rPr/>
+        <w:t xml:space="preserve">The </w:t>
+      </w:r>
+      <w:r>
+        <w:rPr>
+          <w:b/>
+        </w:rPr>
+        <w:t>Checks</w:t>
+      </w:r>
+      <w:r>
+        <w:rPr/>
+        <w:t xml:space="preserve"> column states, in one chip, what a candidate has and has not</w:t>
+        <w:br/>
+        <w:t xml:space="preserve">cleared. It is a </w:t>
+      </w:r>
+      <w:r>
+        <w:rPr>
+          <w:i/>
+        </w:rPr>
+        <w:t>reading</w:t>
+      </w:r>
+      <w:r>
+        <w:rPr/>
+        <w:t>, not a gate: the only thing on it that can stop a trade</w:t>
+        <w:br/>
+        <w:t>is the paper book, because every rule the app enforces was already applied before</w:t>
+        <w:br/>
+        <w:t>the row reached the table. The same nine checks appear on the</w:t>
+        <w:br/>
+      </w:r>
+      <w:r>
+        <w:rPr>
+          <w:color w:val="5D5294"/>
+        </w:rPr>
+        <w:t>Strategy Finder</w:t>
+      </w:r>
+      <w:r>
+        <w:rPr/>
+        <w:t xml:space="preserve"> and, written out one line each, in the Trade</w:t>
+        <w:br/>
+        <w:t>detail panel.</w:t>
+      </w:r>
+    </w:p>
+    <w:tbl>
+      <w:tblPr>
+        <w:tblW w:type="auto" w:w="0"/>
+        <w:jc w:val="left"/>
+        <w:tblLayout w:type="autofit"/>
+        <w:tblLook w:firstColumn="1" w:firstRow="1" w:lastColumn="0" w:lastRow="0" w:noHBand="0" w:noVBand="1" w:val="04A0"/>
+        <w:tblBorders>
+          <w:top w:val="single" w:sz="4" w:space="0" w:color="D8DEE9"/>
+          <w:left w:val="single" w:sz="4" w:space="0" w:color="D8DEE9"/>
+          <w:bottom w:val="single" w:sz="4" w:space="0" w:color="D8DEE9"/>
+          <w:right w:val="single" w:sz="4" w:space="0" w:color="D8DEE9"/>
+          <w:insideH w:val="single" w:sz="4" w:space="0" w:color="D8DEE9"/>
+          <w:insideV w:val="single" w:sz="4" w:space="0" w:color="D8DEE9"/>
+        </w:tblBorders>
+      </w:tblPr>
+      <w:tblGrid>
+        <w:gridCol w:w="2160"/>
+        <w:gridCol w:w="2160"/>
+        <w:gridCol w:w="2160"/>
+        <w:gridCol w:w="2160"/>
+      </w:tblGrid>
+      <w:tr>
+        <w:tc>
+          <w:tcPr>
+            <w:tcW w:type="dxa" w:w="2160"/>
+            <w:shd w:val="clear" w:color="auto" w:fill="EAF2FB"/>
+          </w:tcPr>
+          <w:p>
+            <w:r>
+              <w:rPr>
+                <w:b/>
+              </w:rPr>
+            </w:r>
+            <w:r>
+              <w:rPr>
+                <w:b/>
+              </w:rPr>
+              <w:t>Check</w:t>
+            </w:r>
+          </w:p>
+        </w:tc>
+        <w:tc>
+          <w:tcPr>
+            <w:tcW w:type="dxa" w:w="2160"/>
+            <w:shd w:val="clear" w:color="auto" w:fill="EAF2FB"/>
+          </w:tcPr>
+          <w:p>
+            <w:r>
+              <w:rPr>
+                <w:b/>
+              </w:rPr>
+            </w:r>
+            <w:r>
+              <w:rPr>
+                <w:b/>
+              </w:rPr>
+              <w:t>What it reads</w:t>
+            </w:r>
+          </w:p>
+        </w:tc>
+        <w:tc>
+          <w:tcPr>
+            <w:tcW w:type="dxa" w:w="2160"/>
+            <w:shd w:val="clear" w:color="auto" w:fill="EAF2FB"/>
+          </w:tcPr>
+          <w:p>
+            <w:r>
+              <w:rPr>
+                <w:b/>
+              </w:rPr>
+            </w:r>
+            <w:r>
+              <w:rPr>
+                <w:b/>
+              </w:rPr>
+              <w:t>Green</w:t>
+            </w:r>
+          </w:p>
+        </w:tc>
+        <w:tc>
+          <w:tcPr>
+            <w:tcW w:type="dxa" w:w="2160"/>
+            <w:shd w:val="clear" w:color="auto" w:fill="EAF2FB"/>
+          </w:tcPr>
+          <w:p>
+            <w:r>
+              <w:rPr>
+                <w:b/>
+              </w:rPr>
+            </w:r>
+            <w:r>
+              <w:rPr>
+                <w:b/>
+              </w:rPr>
+              <w:t>Amber</w:t>
+            </w:r>
+          </w:p>
+        </w:tc>
+      </w:tr>
+      <w:tr>
+        <w:tc>
+          <w:tcPr>
+            <w:tcW w:type="dxa" w:w="2160"/>
+          </w:tcPr>
+          <w:p>
+            <w:r/>
+            <w:r>
+              <w:rPr>
+                <w:b/>
+              </w:rPr>
+              <w:t>Paper book</w:t>
+            </w:r>
+          </w:p>
+        </w:tc>
+        <w:tc>
+          <w:tcPr>
+            <w:tcW w:type="dxa" w:w="2160"/>
+          </w:tcPr>
+          <w:p>
+            <w:r/>
+            <w:r>
+              <w:rPr/>
+              <w:t xml:space="preserve">the </w:t>
+            </w:r>
+            <w:r>
+              <w:rPr>
+                <w:color w:val="5D5294"/>
+              </w:rPr>
+              <w:t>Paper Ledger's</w:t>
+            </w:r>
+            <w:r>
+              <w:rPr/>
+              <w:t xml:space="preserve"> limits against its own open trades, for one contract</w:t>
+            </w:r>
+          </w:p>
+        </w:tc>
+        <w:tc>
+          <w:tcPr>
+            <w:tcW w:type="dxa" w:w="2160"/>
+          </w:tcPr>
+          <w:p>
+            <w:r/>
+            <w:r>
+              <w:rPr/>
+              <w:t>it fits, with the largest quantity that would</w:t>
+            </w:r>
+          </w:p>
+        </w:tc>
+        <w:tc>
+          <w:tcPr>
+            <w:tcW w:type="dxa" w:w="2160"/>
+          </w:tcPr>
+          <w:p>
+            <w:r/>
+            <w:r>
+              <w:rPr/>
+              <w:t xml:space="preserve">— (this one is </w:t>
+            </w:r>
+            <w:r>
+              <w:rPr>
+                <w:b/>
+              </w:rPr>
+              <w:t>red</w:t>
+            </w:r>
+            <w:r>
+              <w:rPr/>
+              <w:t xml:space="preserve"> when it does not: </w:t>
+            </w:r>
+            <w:r>
+              <w:rPr>
+                <w:i/>
+              </w:rPr>
+              <w:t>over $750 per trade</w:t>
+            </w:r>
+            <w:r>
+              <w:rPr/>
+              <w:t xml:space="preserve">, </w:t>
+            </w:r>
+            <w:r>
+              <w:rPr>
+                <w:i/>
+              </w:rPr>
+              <w:t>symbol full</w:t>
+            </w:r>
+            <w:r>
+              <w:rPr/>
+              <w:t xml:space="preserve">, </w:t>
+            </w:r>
+            <w:r>
+              <w:rPr>
+                <w:i/>
+              </w:rPr>
+              <w:t>sector risk full</w:t>
+            </w:r>
+            <w:r>
+              <w:rPr/>
+              <w:t xml:space="preserve"> …)</w:t>
+            </w:r>
+          </w:p>
+        </w:tc>
+      </w:tr>
+      <w:tr>
+        <w:tc>
+          <w:tcPr>
+            <w:tcW w:type="dxa" w:w="2160"/>
+            <w:shd w:val="clear" w:color="auto" w:fill="F4F6FA"/>
+          </w:tcPr>
+          <w:p>
+            <w:r/>
+            <w:r>
+              <w:rPr>
+                <w:b/>
+              </w:rPr>
+              <w:t>Earnings</w:t>
+            </w:r>
+          </w:p>
+        </w:tc>
+        <w:tc>
+          <w:tcPr>
+            <w:tcW w:type="dxa" w:w="2160"/>
+            <w:shd w:val="clear" w:color="auto" w:fill="F4F6FA"/>
+          </w:tcPr>
+          <w:p>
+            <w:r/>
+            <w:r>
+              <w:rPr/>
+              <w:t>whether the company reports before the trade expires</w:t>
+            </w:r>
+          </w:p>
+        </w:tc>
+        <w:tc>
+          <w:tcPr>
+            <w:tcW w:type="dxa" w:w="2160"/>
+            <w:shd w:val="clear" w:color="auto" w:fill="F4F6FA"/>
+          </w:tcPr>
+          <w:p>
+            <w:r/>
+            <w:r>
+              <w:rPr/>
+              <w:t xml:space="preserve">no report scheduled, or one </w:t>
+            </w:r>
+            <w:r>
+              <w:rPr>
+                <w:b/>
+              </w:rPr>
+              <w:t>after</w:t>
+            </w:r>
+            <w:r>
+              <w:rPr/>
+              <w:t xml:space="preserve"> expiry</w:t>
+            </w:r>
+          </w:p>
+        </w:tc>
+        <w:tc>
+          <w:tcPr>
+            <w:tcW w:type="dxa" w:w="2160"/>
+            <w:shd w:val="clear" w:color="auto" w:fill="F4F6FA"/>
+          </w:tcPr>
+          <w:p>
+            <w:r/>
+            <w:r>
+              <w:rPr/>
+              <w:t xml:space="preserve">a report </w:t>
+            </w:r>
+            <w:r>
+              <w:rPr>
+                <w:b/>
+              </w:rPr>
+              <w:t>before</w:t>
+            </w:r>
+            <w:r>
+              <w:rPr/>
+              <w:t xml:space="preserve"> expiry, or on expiry day, with the date</w:t>
+            </w:r>
+          </w:p>
+        </w:tc>
+      </w:tr>
+      <w:tr>
+        <w:tc>
+          <w:tcPr>
+            <w:tcW w:type="dxa" w:w="2160"/>
+          </w:tcPr>
+          <w:p>
+            <w:r/>
+            <w:r>
+              <w:rPr>
+                <w:b/>
+              </w:rPr>
+              <w:t>Vol rank</w:t>
+            </w:r>
+          </w:p>
+        </w:tc>
+        <w:tc>
+          <w:tcPr>
+            <w:tcW w:type="dxa" w:w="2160"/>
+          </w:tcPr>
+          <w:p>
+            <w:r/>
+            <w:r>
+              <w:rPr/>
+              <w:t>how rich this symbol's premium is against the floor the scan applies</w:t>
+            </w:r>
+          </w:p>
+        </w:tc>
+        <w:tc>
+          <w:tcPr>
+            <w:tcW w:type="dxa" w:w="2160"/>
+          </w:tcPr>
+          <w:p>
+            <w:r/>
+            <w:r>
+              <w:rPr/>
+              <w:t xml:space="preserve">at least </w:t>
+            </w:r>
+            <w:r>
+              <w:rPr>
+                <w:b/>
+              </w:rPr>
+              <w:t>10 points above</w:t>
+            </w:r>
+            <w:r>
+              <w:rPr/>
+              <w:t xml:space="preserve"> the floor</w:t>
+            </w:r>
+          </w:p>
+        </w:tc>
+        <w:tc>
+          <w:tcPr>
+            <w:tcW w:type="dxa" w:w="2160"/>
+          </w:tcPr>
+          <w:p>
+            <w:r/>
+            <w:r>
+              <w:rPr/>
+              <w:t>inside those 10 points</w:t>
+            </w:r>
+          </w:p>
+        </w:tc>
+      </w:tr>
+      <w:tr>
+        <w:tc>
+          <w:tcPr>
+            <w:tcW w:type="dxa" w:w="2160"/>
+            <w:shd w:val="clear" w:color="auto" w:fill="F4F6FA"/>
+          </w:tcPr>
+          <w:p>
+            <w:r/>
+            <w:r>
+              <w:rPr>
+                <w:b/>
+              </w:rPr>
+              <w:t>Cost to trade</w:t>
+            </w:r>
+          </w:p>
+        </w:tc>
+        <w:tc>
+          <w:tcPr>
+            <w:tcW w:type="dxa" w:w="2160"/>
+            <w:shd w:val="clear" w:color="auto" w:fill="F4F6FA"/>
+          </w:tcPr>
+          <w:p>
+            <w:r/>
+            <w:r>
+              <w:rPr/>
+              <w:t>the round-trip bid-ask as a share of the credit or debit</w:t>
+            </w:r>
+          </w:p>
+        </w:tc>
+        <w:tc>
+          <w:tcPr>
+            <w:tcW w:type="dxa" w:w="2160"/>
+            <w:shd w:val="clear" w:color="auto" w:fill="F4F6FA"/>
+          </w:tcPr>
+          <w:p>
+            <w:r/>
+            <w:r>
+              <w:rPr>
+                <w:b/>
+              </w:rPr>
+              <w:t>10%</w:t>
+            </w:r>
+            <w:r>
+              <w:rPr/>
+              <w:t xml:space="preserve"> or less</w:t>
+            </w:r>
+          </w:p>
+        </w:tc>
+        <w:tc>
+          <w:tcPr>
+            <w:tcW w:type="dxa" w:w="2160"/>
+            <w:shd w:val="clear" w:color="auto" w:fill="F4F6FA"/>
+          </w:tcPr>
+          <w:p>
+            <w:r/>
+            <w:r>
+              <w:rPr/>
+              <w:t xml:space="preserve">more, and worded </w:t>
+            </w:r>
+            <w:r>
+              <w:rPr>
+                <w:i/>
+              </w:rPr>
+              <w:t>very wide</w:t>
+            </w:r>
+            <w:r>
+              <w:rPr/>
+              <w:t xml:space="preserve"> above </w:t>
+            </w:r>
+            <w:r>
+              <w:rPr>
+                <w:b/>
+              </w:rPr>
+              <w:t>25%</w:t>
+            </w:r>
+          </w:p>
+        </w:tc>
+      </w:tr>
+      <w:tr>
+        <w:tc>
+          <w:tcPr>
+            <w:tcW w:type="dxa" w:w="2160"/>
+          </w:tcPr>
+          <w:p>
+            <w:r/>
+            <w:r>
+              <w:rPr>
+                <w:b/>
+              </w:rPr>
+              <w:t>Expected move</w:t>
+            </w:r>
+          </w:p>
+        </w:tc>
+        <w:tc>
+          <w:tcPr>
+            <w:tcW w:type="dxa" w:w="2160"/>
+          </w:tcPr>
+          <w:p>
+            <w:r/>
+            <w:r>
+              <w:rPr/>
+              <w:t>how far the short strike (or, for a straddle-shaped trade, the break-even) sits from the price in expected moves to expiry</w:t>
+            </w:r>
+          </w:p>
+        </w:tc>
+        <w:tc>
+          <w:tcPr>
+            <w:tcW w:type="dxa" w:w="2160"/>
+          </w:tcPr>
+          <w:p>
+            <w:r/>
+            <w:r>
+              <w:rPr>
+                <w:b/>
+              </w:rPr>
+              <w:t>1.0</w:t>
+            </w:r>
+            <w:r>
+              <w:rPr/>
+              <w:t xml:space="preserve"> expected move or more</w:t>
+            </w:r>
+          </w:p>
+        </w:tc>
+        <w:tc>
+          <w:tcPr>
+            <w:tcW w:type="dxa" w:w="2160"/>
+          </w:tcPr>
+          <w:p>
+            <w:r/>
+            <w:r>
+              <w:rPr/>
+              <w:t>inside one, or already at or past the price</w:t>
+            </w:r>
+          </w:p>
+        </w:tc>
+      </w:tr>
+      <w:tr>
+        <w:tc>
+          <w:tcPr>
+            <w:tcW w:type="dxa" w:w="2160"/>
+            <w:shd w:val="clear" w:color="auto" w:fill="F4F6FA"/>
+          </w:tcPr>
+          <w:p>
+            <w:r/>
+            <w:r>
+              <w:rPr>
+                <w:b/>
+              </w:rPr>
+              <w:t>Walls</w:t>
+            </w:r>
+          </w:p>
+        </w:tc>
+        <w:tc>
+          <w:tcPr>
+            <w:tcW w:type="dxa" w:w="2160"/>
+            <w:shd w:val="clear" w:color="auto" w:fill="F4F6FA"/>
+          </w:tcPr>
+          <w:p>
+            <w:r/>
+            <w:r>
+              <w:rPr/>
+              <w:t xml:space="preserve">the same strike against the </w:t>
+            </w:r>
+            <w:r>
+              <w:rPr>
+                <w:color w:val="5D5294"/>
+              </w:rPr>
+              <w:t>Opportunity Board's</w:t>
+            </w:r>
+            <w:r>
+              <w:rPr/>
+              <w:t xml:space="preserve"> call and put walls</w:t>
+            </w:r>
+          </w:p>
+        </w:tc>
+        <w:tc>
+          <w:tcPr>
+            <w:tcW w:type="dxa" w:w="2160"/>
+            <w:shd w:val="clear" w:color="auto" w:fill="F4F6FA"/>
+          </w:tcPr>
+          <w:p>
+            <w:r/>
+            <w:r>
+              <w:rPr/>
+              <w:t>beyond the wall on that side</w:t>
+            </w:r>
+          </w:p>
+        </w:tc>
+        <w:tc>
+          <w:tcPr>
+            <w:tcW w:type="dxa" w:w="2160"/>
+            <w:shd w:val="clear" w:color="auto" w:fill="F4F6FA"/>
+          </w:tcPr>
+          <w:p>
+            <w:r/>
+            <w:r>
+              <w:rPr/>
+              <w:t>inside it</w:t>
+            </w:r>
+          </w:p>
+        </w:tc>
+      </w:tr>
+      <w:tr>
+        <w:tc>
+          <w:tcPr>
+            <w:tcW w:type="dxa" w:w="2160"/>
+          </w:tcPr>
+          <w:p>
+            <w:r/>
+            <w:r>
+              <w:rPr>
+                <w:b/>
+              </w:rPr>
+              <w:t>Dealer gamma</w:t>
+            </w:r>
+          </w:p>
+        </w:tc>
+        <w:tc>
+          <w:tcPr>
+            <w:tcW w:type="dxa" w:w="2160"/>
+          </w:tcPr>
+          <w:p>
+            <w:r/>
+            <w:r>
+              <w:rPr/>
+              <w:t>the board's gamma regime for the symbol</w:t>
+            </w:r>
+          </w:p>
+        </w:tc>
+        <w:tc>
+          <w:tcPr>
+            <w:tcW w:type="dxa" w:w="2160"/>
+          </w:tcPr>
+          <w:p>
+            <w:r/>
+            <w:r>
+              <w:rPr/>
+              <w:t xml:space="preserve">price </w:t>
+            </w:r>
+            <w:r>
+              <w:rPr>
+                <w:b/>
+              </w:rPr>
+              <w:t>above</w:t>
+            </w:r>
+            <w:r>
+              <w:rPr/>
+              <w:t xml:space="preserve"> the flip</w:t>
+            </w:r>
+          </w:p>
+        </w:tc>
+        <w:tc>
+          <w:tcPr>
+            <w:tcW w:type="dxa" w:w="2160"/>
+          </w:tcPr>
+          <w:p>
+            <w:r/>
+            <w:r>
+              <w:rPr/>
+              <w:t xml:space="preserve">below it — </w:t>
+            </w:r>
+            <w:r>
+              <w:rPr>
+                <w:i/>
+              </w:rPr>
+              <w:t>moves can accelerate</w:t>
+            </w:r>
+          </w:p>
+        </w:tc>
+      </w:tr>
+      <w:tr>
+        <w:tc>
+          <w:tcPr>
+            <w:tcW w:type="dxa" w:w="2160"/>
+            <w:shd w:val="clear" w:color="auto" w:fill="F4F6FA"/>
+          </w:tcPr>
+          <w:p>
+            <w:r/>
+            <w:r>
+              <w:rPr>
+                <w:b/>
+              </w:rPr>
+              <w:t>Direction</w:t>
+            </w:r>
+          </w:p>
+        </w:tc>
+        <w:tc>
+          <w:tcPr>
+            <w:tcW w:type="dxa" w:w="2160"/>
+            <w:shd w:val="clear" w:color="auto" w:fill="F4F6FA"/>
+          </w:tcPr>
+          <w:p>
+            <w:r/>
+            <w:r>
+              <w:rPr/>
+              <w:t>the trade's own bias against the tape: a 0–4 DTE trade against the symbol's intraday move, a longer hold against the market's committed direction</w:t>
+            </w:r>
+          </w:p>
+        </w:tc>
+        <w:tc>
+          <w:tcPr>
+            <w:tcW w:type="dxa" w:w="2160"/>
+            <w:shd w:val="clear" w:color="auto" w:fill="F4F6FA"/>
+          </w:tcPr>
+          <w:p>
+            <w:r/>
+            <w:r>
+              <w:rPr/>
+              <w:t>agrees, and says which reading it used</w:t>
+            </w:r>
+          </w:p>
+        </w:tc>
+        <w:tc>
+          <w:tcPr>
+            <w:tcW w:type="dxa" w:w="2160"/>
+            <w:shd w:val="clear" w:color="auto" w:fill="F4F6FA"/>
+          </w:tcPr>
+          <w:p>
+            <w:r/>
+            <w:r>
+              <w:rPr/>
+              <w:t>opposes</w:t>
+            </w:r>
+          </w:p>
+        </w:tc>
+      </w:tr>
+      <w:tr>
+        <w:tc>
+          <w:tcPr>
+            <w:tcW w:type="dxa" w:w="2160"/>
+          </w:tcPr>
+          <w:p>
+            <w:r/>
+            <w:r>
+              <w:rPr>
+                <w:b/>
+              </w:rPr>
+              <w:t>Track record</w:t>
+            </w:r>
+          </w:p>
+        </w:tc>
+        <w:tc>
+          <w:tcPr>
+            <w:tcW w:type="dxa" w:w="2160"/>
+          </w:tcPr>
+          <w:p>
+            <w:r/>
+            <w:r>
+              <w:rPr/>
+              <w:t>the calibrated expected value for this trade type and score band, from your own closed trades</w:t>
+            </w:r>
+          </w:p>
+        </w:tc>
+        <w:tc>
+          <w:tcPr>
+            <w:tcW w:type="dxa" w:w="2160"/>
+          </w:tcPr>
+          <w:p>
+            <w:r/>
+            <w:r>
+              <w:rPr/>
+              <w:t>positive</w:t>
+            </w:r>
+          </w:p>
+        </w:tc>
+        <w:tc>
+          <w:tcPr>
+            <w:tcW w:type="dxa" w:w="2160"/>
+          </w:tcPr>
+          <w:p>
+            <w:r/>
+            <w:r>
+              <w:rPr/>
+              <w:t>zero or negative</w:t>
+            </w:r>
+          </w:p>
+        </w:tc>
+      </w:tr>
+    </w:tbl>
+    <w:p/>
+    <w:p>
+      <w:r>
+        <w:rPr>
+          <w:b/>
+        </w:rPr>
+        <w:t>Two rules decide what you see.</w:t>
+      </w:r>
+      <w:r>
+        <w:rPr/>
+        <w:t xml:space="preserve"> A check that does not apply to a structure is</w:t>
+        <w:br/>
+      </w:r>
+      <w:r>
+        <w:rPr>
+          <w:b/>
+        </w:rPr>
+        <w:t>omitted, never shown as passing</w:t>
+      </w:r>
+      <w:r>
+        <w:rPr/>
+        <w:t xml:space="preserve"> — a long call has no short strike, so it gets no</w:t>
+        <w:br/>
+        <w:t>expected-move or wall line, which is why the chip counts (</w:t>
+      </w:r>
+      <w:r>
+        <w:rPr>
+          <w:i/>
+        </w:rPr>
+        <w:t>Clear · 7 of 9</w:t>
+      </w:r>
+      <w:r>
+        <w:rPr/>
+        <w:t>) rather</w:t>
+        <w:br/>
+        <w:t xml:space="preserve">than claiming nine passes. And </w:t>
+      </w:r>
+      <w:r>
+        <w:rPr>
+          <w:b/>
+        </w:rPr>
+        <w:t>only the paper-book line can be red</w:t>
+      </w:r>
+      <w:r>
+        <w:rPr/>
+        <w:t>: the other</w:t>
+        <w:br/>
+        <w:t>eight are judgment, and an amber line is a reason to look, not a refusal.</w:t>
+      </w:r>
+    </w:p>
+    <w:p>
+      <w:r>
+        <w:rPr>
+          <w:b/>
+        </w:rPr>
+        <w:t>Which lines a row does not get:</w:t>
+      </w:r>
+    </w:p>
+    <w:tbl>
+      <w:tblPr>
+        <w:tblW w:type="auto" w:w="0"/>
+        <w:jc w:val="left"/>
+        <w:tblLayout w:type="autofit"/>
+        <w:tblLook w:firstColumn="1" w:firstRow="1" w:lastColumn="0" w:lastRow="0" w:noHBand="0" w:noVBand="1" w:val="04A0"/>
+        <w:tblBorders>
+          <w:top w:val="single" w:sz="4" w:space="0" w:color="D8DEE9"/>
+          <w:left w:val="single" w:sz="4" w:space="0" w:color="D8DEE9"/>
+          <w:bottom w:val="single" w:sz="4" w:space="0" w:color="D8DEE9"/>
+          <w:right w:val="single" w:sz="4" w:space="0" w:color="D8DEE9"/>
+          <w:insideH w:val="single" w:sz="4" w:space="0" w:color="D8DEE9"/>
+          <w:insideV w:val="single" w:sz="4" w:space="0" w:color="D8DEE9"/>
+        </w:tblBorders>
+      </w:tblPr>
+      <w:tblGrid>
+        <w:gridCol w:w="4320"/>
+        <w:gridCol w:w="4320"/>
+      </w:tblGrid>
+      <w:tr>
+        <w:tc>
+          <w:tcPr>
+            <w:tcW w:type="dxa" w:w="4320"/>
+            <w:shd w:val="clear" w:color="auto" w:fill="EAF2FB"/>
+          </w:tcPr>
+          <w:p>
+            <w:r>
+              <w:rPr>
+                <w:b/>
+              </w:rPr>
+            </w:r>
+            <w:r>
+              <w:rPr>
+                <w:b/>
+              </w:rPr>
+              <w:t>Line</w:t>
+            </w:r>
+          </w:p>
+        </w:tc>
+        <w:tc>
+          <w:tcPr>
+            <w:tcW w:type="dxa" w:w="4320"/>
+            <w:shd w:val="clear" w:color="auto" w:fill="EAF2FB"/>
+          </w:tcPr>
+          <w:p>
+            <w:r>
+              <w:rPr>
+                <w:b/>
+              </w:rPr>
+            </w:r>
+            <w:r>
+              <w:rPr>
+                <w:b/>
+              </w:rPr>
+              <w:t>Left out when</w:t>
+            </w:r>
+          </w:p>
+        </w:tc>
+      </w:tr>
+      <w:tr>
+        <w:tc>
+          <w:tcPr>
+            <w:tcW w:type="dxa" w:w="4320"/>
+          </w:tcPr>
+          <w:p>
+            <w:r/>
+            <w:r>
+              <w:rPr>
+                <w:b/>
+              </w:rPr>
+              <w:t>Vol rank</w:t>
+            </w:r>
+            <w:r>
+              <w:rPr/>
+              <w:t xml:space="preserve">, </w:t>
+            </w:r>
+            <w:r>
+              <w:rPr>
+                <w:b/>
+              </w:rPr>
+              <w:t>Expected move</w:t>
+            </w:r>
+            <w:r>
+              <w:rPr/>
+              <w:t xml:space="preserve">, </w:t>
+            </w:r>
+            <w:r>
+              <w:rPr>
+                <w:b/>
+              </w:rPr>
+              <w:t>Walls</w:t>
+            </w:r>
+            <w:r>
+              <w:rPr/>
+              <w:t xml:space="preserve">, </w:t>
+            </w:r>
+            <w:r>
+              <w:rPr>
+                <w:b/>
+              </w:rPr>
+              <w:t>Dealer gamma</w:t>
+            </w:r>
+          </w:p>
+        </w:tc>
+        <w:tc>
+          <w:tcPr>
+            <w:tcW w:type="dxa" w:w="4320"/>
+          </w:tcPr>
+          <w:p>
+            <w:r/>
+            <w:r>
+              <w:rPr/>
+              <w:t xml:space="preserve">the trade </w:t>
+            </w:r>
+            <w:r>
+              <w:rPr>
+                <w:b/>
+              </w:rPr>
+              <w:t>buys</w:t>
+            </w:r>
+            <w:r>
+              <w:rPr/>
+              <w:t xml:space="preserve"> premium rather than selling it. A long call is not made better or worse by rich premium or by where the dealer walls sit</w:t>
+            </w:r>
+          </w:p>
+        </w:tc>
+      </w:tr>
+      <w:tr>
+        <w:tc>
+          <w:tcPr>
+            <w:tcW w:type="dxa" w:w="4320"/>
+            <w:shd w:val="clear" w:color="auto" w:fill="F4F6FA"/>
+          </w:tcPr>
+          <w:p>
+            <w:r/>
+            <w:r>
+              <w:rPr>
+                <w:b/>
+              </w:rPr>
+              <w:t>Vol rank</w:t>
+            </w:r>
+          </w:p>
+        </w:tc>
+        <w:tc>
+          <w:tcPr>
+            <w:tcW w:type="dxa" w:w="4320"/>
+            <w:shd w:val="clear" w:color="auto" w:fill="F4F6FA"/>
+          </w:tcPr>
+          <w:p>
+            <w:r/>
+            <w:r>
+              <w:rPr/>
+              <w:t>the scan applies no floor to this trade type</w:t>
+            </w:r>
+          </w:p>
+        </w:tc>
+      </w:tr>
+      <w:tr>
+        <w:tc>
+          <w:tcPr>
+            <w:tcW w:type="dxa" w:w="4320"/>
+          </w:tcPr>
+          <w:p>
+            <w:r/>
+            <w:r>
+              <w:rPr>
+                <w:b/>
+              </w:rPr>
+              <w:t>Direction</w:t>
+            </w:r>
+          </w:p>
+        </w:tc>
+        <w:tc>
+          <w:tcPr>
+            <w:tcW w:type="dxa" w:w="4320"/>
+          </w:tcPr>
+          <w:p>
+            <w:r/>
+            <w:r>
+              <w:rPr/>
+              <w:t>the trade has no directional bias — an iron condor is neutral by construction</w:t>
+            </w:r>
+          </w:p>
+        </w:tc>
+      </w:tr>
+      <w:tr>
+        <w:tc>
+          <w:tcPr>
+            <w:tcW w:type="dxa" w:w="4320"/>
+            <w:shd w:val="clear" w:color="auto" w:fill="F4F6FA"/>
+          </w:tcPr>
+          <w:p>
+            <w:r/>
+            <w:r>
+              <w:rPr>
+                <w:b/>
+              </w:rPr>
+              <w:t>Track record</w:t>
+            </w:r>
+          </w:p>
+        </w:tc>
+        <w:tc>
+          <w:tcPr>
+            <w:tcW w:type="dxa" w:w="4320"/>
+            <w:shd w:val="clear" w:color="auto" w:fill="F4F6FA"/>
+          </w:tcPr>
+          <w:p>
+            <w:r/>
+            <w:r>
+              <w:rPr/>
+              <w:t xml:space="preserve">the row was scored by the Strategy Finder's Fit+Quality model. Its score is not on the scale the calibration buckets are built from, so answering would print another model's history (the detail panel's </w:t>
+            </w:r>
+            <w:r>
+              <w:rPr>
+                <w:i/>
+              </w:rPr>
+              <w:t>Signals like this</w:t>
+            </w:r>
+            <w:r>
+              <w:rPr/>
+              <w:t xml:space="preserve"> row is withheld on those rows for the same reason)</w:t>
+            </w:r>
+          </w:p>
+        </w:tc>
+      </w:tr>
+      <w:tr>
+        <w:tc>
+          <w:tcPr>
+            <w:tcW w:type="dxa" w:w="4320"/>
+          </w:tcPr>
+          <w:p>
+            <w:r/>
+            <w:r>
+              <w:rPr>
+                <w:b/>
+              </w:rPr>
+              <w:t>Paper book</w:t>
+            </w:r>
+          </w:p>
+        </w:tc>
+        <w:tc>
+          <w:tcPr>
+            <w:tcW w:type="dxa" w:w="4320"/>
+          </w:tcPr>
+          <w:p>
+            <w:r/>
+            <w:r>
+              <w:rPr/>
+              <w:t>the row cannot be paper-traded — a structure the ledger does not record, or a dropped row whose price is frozen</w:t>
+            </w:r>
+          </w:p>
+        </w:tc>
+      </w:tr>
+    </w:tbl>
+    <w:p/>
+    <w:p>
+      <w:r>
+        <w:rPr/>
+        <w:t xml:space="preserve">Whether a trade sells or buys premium is read from </w:t>
+      </w:r>
+      <w:r>
+        <w:rPr>
+          <w:b/>
+        </w:rPr>
+        <w:t>what it is and what it costs</w:t>
+      </w:r>
+      <w:r>
+        <w:rPr/>
+        <w:t>,</w:t>
+        <w:br/>
+        <w:t>never from its vega: the scanner reports a credit spread's net vega as a positive</w:t>
+        <w:br/>
+        <w:t xml:space="preserve">number, so reading that sign would call every credit spread a premium </w:t>
+      </w:r>
+      <w:r>
+        <w:rPr>
+          <w:i/>
+        </w:rPr>
+        <w:t>purchase</w:t>
+      </w:r>
+      <w:r>
+        <w:rPr/>
+        <w:t>.</w:t>
+      </w:r>
+    </w:p>
+    <w:p>
+      <w:r>
+        <w:rPr>
+          <w:b/>
+        </w:rPr>
+        <w:t>The verdicts:</w:t>
+      </w:r>
+    </w:p>
+    <w:tbl>
+      <w:tblPr>
+        <w:tblW w:type="auto" w:w="0"/>
+        <w:jc w:val="left"/>
+        <w:tblLayout w:type="autofit"/>
+        <w:tblLook w:firstColumn="1" w:firstRow="1" w:lastColumn="0" w:lastRow="0" w:noHBand="0" w:noVBand="1" w:val="04A0"/>
+        <w:tblBorders>
+          <w:top w:val="single" w:sz="4" w:space="0" w:color="D8DEE9"/>
+          <w:left w:val="single" w:sz="4" w:space="0" w:color="D8DEE9"/>
+          <w:bottom w:val="single" w:sz="4" w:space="0" w:color="D8DEE9"/>
+          <w:right w:val="single" w:sz="4" w:space="0" w:color="D8DEE9"/>
+          <w:insideH w:val="single" w:sz="4" w:space="0" w:color="D8DEE9"/>
+          <w:insideV w:val="single" w:sz="4" w:space="0" w:color="D8DEE9"/>
+        </w:tblBorders>
+      </w:tblPr>
+      <w:tblGrid>
+        <w:gridCol w:w="4320"/>
+        <w:gridCol w:w="4320"/>
+      </w:tblGrid>
+      <w:tr>
+        <w:tc>
+          <w:tcPr>
+            <w:tcW w:type="dxa" w:w="4320"/>
+            <w:shd w:val="clear" w:color="auto" w:fill="EAF2FB"/>
+          </w:tcPr>
+          <w:p>
+            <w:r>
+              <w:rPr>
+                <w:b/>
+              </w:rPr>
+            </w:r>
+            <w:r>
+              <w:rPr>
+                <w:b/>
+              </w:rPr>
+              <w:t>Chip</w:t>
+            </w:r>
+          </w:p>
+        </w:tc>
+        <w:tc>
+          <w:tcPr>
+            <w:tcW w:type="dxa" w:w="4320"/>
+            <w:shd w:val="clear" w:color="auto" w:fill="EAF2FB"/>
+          </w:tcPr>
+          <w:p>
+            <w:r>
+              <w:rPr>
+                <w:b/>
+              </w:rPr>
+            </w:r>
+            <w:r>
+              <w:rPr>
+                <w:b/>
+              </w:rPr>
+              <w:t>Meaning</w:t>
+            </w:r>
+          </w:p>
+        </w:tc>
+      </w:tr>
+      <w:tr>
+        <w:tc>
+          <w:tcPr>
+            <w:tcW w:type="dxa" w:w="4320"/>
+          </w:tcPr>
+          <w:p>
+            <w:r/>
+            <w:r>
+              <w:rPr>
+                <w:b/>
+              </w:rPr>
+              <w:t>Clear · 7 of 9</w:t>
+            </w:r>
+          </w:p>
+        </w:tc>
+        <w:tc>
+          <w:tcPr>
+            <w:tcW w:type="dxa" w:w="4320"/>
+          </w:tcPr>
+          <w:p>
+            <w:r/>
+            <w:r>
+              <w:rPr/>
+              <w:t>every check that ran passed; nine exist, seven applied</w:t>
+            </w:r>
+          </w:p>
+        </w:tc>
+      </w:tr>
+      <w:tr>
+        <w:tc>
+          <w:tcPr>
+            <w:tcW w:type="dxa" w:w="4320"/>
+            <w:shd w:val="clear" w:color="auto" w:fill="F4F6FA"/>
+          </w:tcPr>
+          <w:p>
+            <w:r/>
+            <w:r>
+              <w:rPr>
+                <w:b/>
+              </w:rPr>
+              <w:t>2 cautions</w:t>
+            </w:r>
+          </w:p>
+        </w:tc>
+        <w:tc>
+          <w:tcPr>
+            <w:tcW w:type="dxa" w:w="4320"/>
+            <w:shd w:val="clear" w:color="auto" w:fill="F4F6FA"/>
+          </w:tcPr>
+          <w:p>
+            <w:r/>
+            <w:r>
+              <w:rPr/>
+              <w:t>that many amber lines. The full text is on hover, the reasons in the detail panel</w:t>
+            </w:r>
+          </w:p>
+        </w:tc>
+      </w:tr>
+      <w:tr>
+        <w:tc>
+          <w:tcPr>
+            <w:tcW w:type="dxa" w:w="4320"/>
+          </w:tcPr>
+          <w:p>
+            <w:r/>
+            <w:r>
+              <w:rPr>
+                <w:b/>
+              </w:rPr>
+              <w:t>Blocked · symbol full</w:t>
+            </w:r>
+          </w:p>
+        </w:tc>
+        <w:tc>
+          <w:tcPr>
+            <w:tcW w:type="dxa" w:w="4320"/>
+          </w:tcPr>
+          <w:p>
+            <w:r/>
+            <w:r>
+              <w:rPr/>
+              <w:t>the paper book would refuse it, with the binding limit named</w:t>
+            </w:r>
+          </w:p>
+        </w:tc>
+      </w:tr>
+      <w:tr>
+        <w:tc>
+          <w:tcPr>
+            <w:tcW w:type="dxa" w:w="4320"/>
+            <w:shd w:val="clear" w:color="auto" w:fill="F4F6FA"/>
+          </w:tcPr>
+          <w:p>
+            <w:r/>
+            <w:r>
+              <w:rPr>
+                <w:b/>
+              </w:rPr>
+              <w:t>Partly checked · 5 of 7 checked</w:t>
+            </w:r>
+          </w:p>
+        </w:tc>
+        <w:tc>
+          <w:tcPr>
+            <w:tcW w:type="dxa" w:w="4320"/>
+            <w:shd w:val="clear" w:color="auto" w:fill="F4F6FA"/>
+          </w:tcPr>
+          <w:p>
+            <w:r/>
+            <w:r>
+              <w:rPr/>
+              <w:t xml:space="preserve">at least one grey line is grey </w:t>
+            </w:r>
+            <w:r>
+              <w:rPr>
+                <w:i/>
+              </w:rPr>
+              <w:t>because a feed it reads was not there</w:t>
+            </w:r>
+            <w:r>
+              <w:rPr/>
+              <w:t xml:space="preserve"> — so the verdict is incomplete, and deliberately not "Clear"</w:t>
+            </w:r>
+          </w:p>
+        </w:tc>
+      </w:tr>
+      <w:tr>
+        <w:tc>
+          <w:tcPr>
+            <w:tcW w:type="dxa" w:w="4320"/>
+          </w:tcPr>
+          <w:p>
+            <w:r/>
+            <w:r>
+              <w:rPr>
+                <w:b/>
+              </w:rPr>
+              <w:t>unchecked</w:t>
+            </w:r>
+          </w:p>
+        </w:tc>
+        <w:tc>
+          <w:tcPr>
+            <w:tcW w:type="dxa" w:w="4320"/>
+          </w:tcPr>
+          <w:p>
+            <w:r/>
+            <w:r>
+              <w:rPr/>
+              <w:t>nothing could be judged at all</w:t>
+            </w:r>
+          </w:p>
+        </w:tc>
+      </w:tr>
+      <w:tr>
+        <w:tc>
+          <w:tcPr>
+            <w:tcW w:type="dxa" w:w="4320"/>
+            <w:shd w:val="clear" w:color="auto" w:fill="F4F6FA"/>
+          </w:tcPr>
+          <w:p>
+            <w:r/>
+            <w:r>
+              <w:rPr>
+                <w:b/>
+              </w:rPr>
+              <w:t>—</w:t>
+            </w:r>
+          </w:p>
+        </w:tc>
+        <w:tc>
+          <w:tcPr>
+            <w:tcW w:type="dxa" w:w="4320"/>
+            <w:shd w:val="clear" w:color="auto" w:fill="F4F6FA"/>
+          </w:tcPr>
+          <w:p>
+            <w:r/>
+            <w:r>
+              <w:rPr/>
+              <w:t>the page has not read the checks yet</w:t>
+            </w:r>
+          </w:p>
+        </w:tc>
+      </w:tr>
+    </w:tbl>
+    <w:p/>
+    <w:p>
+      <w:r>
+        <w:rPr/>
+        <w:t xml:space="preserve">They are decided in that order, so a </w:t>
+      </w:r>
+      <w:r>
+        <w:rPr>
+          <w:b/>
+        </w:rPr>
+        <w:t>block outranks a caution and a caution</w:t>
+        <w:br/>
+        <w:t>outranks an incomplete reading</w:t>
+      </w:r>
+      <w:r>
+        <w:rPr/>
+        <w:t xml:space="preserve">: a row reading </w:t>
+      </w:r>
+      <w:r>
+        <w:rPr>
+          <w:i/>
+        </w:rPr>
+        <w:t>2 cautions</w:t>
+      </w:r>
+      <w:r>
+        <w:rPr/>
+        <w:t xml:space="preserve"> may also have a line</w:t>
+        <w:br/>
+        <w:t xml:space="preserve">the checks could not finish. Only </w:t>
+      </w:r>
+      <w:r>
+        <w:rPr>
+          <w:i/>
+        </w:rPr>
+        <w:t>Clear</w:t>
+      </w:r>
+      <w:r>
+        <w:rPr/>
+        <w:t xml:space="preserve"> promises that nothing is outstanding —</w:t>
+        <w:br/>
+        <w:t xml:space="preserve">which is exactly why a missing feed is reported as </w:t>
+      </w:r>
+      <w:r>
+        <w:rPr>
+          <w:i/>
+        </w:rPr>
+        <w:t>Partly checked</w:t>
+      </w:r>
+      <w:r>
+        <w:rPr/>
+        <w:t xml:space="preserve"> instead.</w:t>
+      </w:r>
+    </w:p>
+    <w:p>
+      <w:r>
+        <w:rPr>
+          <w:b/>
+        </w:rPr>
+        <w:t>Why a check cannot run, and what it says instead.</w:t>
+      </w:r>
+      <w:r>
+        <w:rPr/>
+        <w:t xml:space="preserve"> Each check reads its own</w:t>
+        <w:br/>
+        <w:t xml:space="preserve">inputs, and each says which is missing rather than assuming: </w:t>
+      </w:r>
+      <w:r>
+        <w:rPr>
+          <w:i/>
+        </w:rPr>
+        <w:t>No IV history</w:t>
+      </w:r>
+      <w:r>
+        <w:rPr/>
+        <w:t>,</w:t>
+        <w:br/>
+      </w:r>
+      <w:r>
+        <w:rPr>
+          <w:i/>
+        </w:rPr>
+        <w:t>Bid-ask not measured</w:t>
+      </w:r>
+      <w:r>
+        <w:rPr/>
+        <w:t xml:space="preserve">, </w:t>
+      </w:r>
+      <w:r>
+        <w:rPr>
+          <w:i/>
+        </w:rPr>
+        <w:t>Expected move not measured</w:t>
+      </w:r>
+      <w:r>
+        <w:rPr/>
+        <w:t xml:space="preserve">, </w:t>
+      </w:r>
+      <w:r>
+        <w:rPr>
+          <w:i/>
+        </w:rPr>
+        <w:t>Breakevens unknown</w:t>
+      </w:r>
+      <w:r>
+        <w:rPr/>
+        <w:t xml:space="preserve">, </w:t>
+      </w:r>
+      <w:r>
+        <w:rPr>
+          <w:i/>
+        </w:rPr>
+        <w:t>No</w:t>
+        <w:br/>
+        <w:t>wall reading</w:t>
+      </w:r>
+      <w:r>
+        <w:rPr/>
+        <w:t xml:space="preserve">, </w:t>
+      </w:r>
+      <w:r>
+        <w:rPr>
+          <w:i/>
+        </w:rPr>
+        <w:t>No gamma flip reading</w:t>
+      </w:r>
+      <w:r>
+        <w:rPr/>
+        <w:t xml:space="preserve">, </w:t>
+      </w:r>
+      <w:r>
+        <w:rPr>
+          <w:i/>
+        </w:rPr>
+        <w:t>No reading of market direction</w:t>
+      </w:r>
+      <w:r>
+        <w:rPr/>
+        <w:t xml:space="preserve">, </w:t>
+      </w:r>
+      <w:r>
+        <w:rPr>
+          <w:i/>
+        </w:rPr>
+        <w:t>No</w:t>
+        <w:br/>
+        <w:t>earnings coverage</w:t>
+      </w:r>
+      <w:r>
+        <w:rPr/>
+        <w:t xml:space="preserve">, </w:t>
+      </w:r>
+      <w:r>
+        <w:rPr>
+          <w:i/>
+        </w:rPr>
+        <w:t>Not enough history for this score</w:t>
+      </w:r>
+      <w:r>
+        <w:rPr/>
+        <w:t>. The paper-book line</w:t>
+        <w:br/>
+        <w:t>without a book to check against says the same thing the Paper trade box does —</w:t>
+        <w:br/>
+      </w:r>
+      <w:r>
+        <w:rPr>
+          <w:i/>
+        </w:rPr>
+        <w:t>Can't preview this trade here — the paper ledger still checks every cap when you</w:t>
+        <w:br/>
+        <w:t>create it.</w:t>
+      </w:r>
+      <w:r>
+        <w:rPr/>
+        <w:t xml:space="preserve"> A line that fails unexpectedly reads </w:t>
+      </w:r>
+      <w:r>
+        <w:rPr>
+          <w:i/>
+        </w:rPr>
+        <w:t>Couldn't check</w:t>
+      </w:r>
+      <w:r>
+        <w:rPr/>
+        <w:t>, and costs that</w:t>
+        <w:br/>
+        <w:t>one line, never the list.</w:t>
+      </w:r>
+    </w:p>
+    <w:p>
+      <w:r>
+        <w:rPr/>
+        <w:t xml:space="preserve">The distinction the summary turns on: a grey line because the check </w:t>
+      </w:r>
+      <w:r>
+        <w:rPr>
+          <w:b/>
+        </w:rPr>
+        <w:t>does not</w:t>
+        <w:br/>
+        <w:t>apply</w:t>
+      </w:r>
+      <w:r>
+        <w:rPr/>
+        <w:t xml:space="preserve"> leaves the verdict Clear; a grey line because a </w:t>
+      </w:r>
+      <w:r>
+        <w:rPr>
+          <w:b/>
+        </w:rPr>
+        <w:t>live feed was not there</w:t>
+      </w:r>
+      <w:r>
+        <w:rPr/>
+        <w:br/>
+        <w:t xml:space="preserve">makes it </w:t>
+      </w:r>
+      <w:r>
+        <w:rPr>
+          <w:i/>
+        </w:rPr>
+        <w:t>Partly checked</w:t>
+      </w:r>
+      <w:r>
+        <w:rPr/>
+        <w:t>. Four feeds carry the live half — the Opportunity Board</w:t>
+        <w:br/>
+        <w:t>(price, walls, gamma regime, intraday trend), the market regime, the overnight</w:t>
+        <w:br/>
+        <w:t>calibration, and the paper ledger's book — and a cold one is passed through as</w:t>
+        <w:br/>
+        <w:t>absent rather than as an empty reading, precisely so the summary cannot read Clear</w:t>
+        <w:br/>
+        <w:t>with a check missing.</w:t>
+      </w:r>
+    </w:p>
+    <w:p>
+      <w:r>
+        <w:rPr>
+          <w:b/>
+        </w:rPr>
+        <w:t>Refresh.</w:t>
+      </w:r>
+      <w:r>
+        <w:rPr/>
+        <w:t xml:space="preserve"> The column re-stamps when the paper ledger's book, the market regime</w:t>
+        <w:br/>
+        <w:t xml:space="preserve">or the calibration changes, and otherwise on a fixed </w:t>
+      </w:r>
+      <w:r>
+        <w:rPr>
+          <w:b/>
+        </w:rPr>
+        <w:t>five-minute</w:t>
+      </w:r>
+      <w:r>
+        <w:rPr/>
+        <w:t xml:space="preserve"> cadence, and</w:t>
+        <w:br/>
+        <w:t xml:space="preserve">then only if the Opportunity Board has actually moved since the last stamp. </w:t>
+      </w:r>
+      <w:r>
+        <w:rPr>
+          <w:b/>
+        </w:rPr>
+        <w:t>A</w:t>
+        <w:br/>
+        <w:t>re-stamp never re-scans</w:t>
+      </w:r>
+      <w:r>
+        <w:rPr/>
+        <w:t xml:space="preserve"> — a scan is a paid Schwab fetch, and the row's prices stay</w:t>
+        <w:br/>
+        <w:t xml:space="preserve">the scan's. The detail panel reads its context live, showing </w:t>
+      </w:r>
+      <w:r>
+        <w:rPr>
+          <w:i/>
+        </w:rPr>
+        <w:t>Checking…</w:t>
+      </w:r>
+      <w:r>
+        <w:rPr/>
+        <w:t xml:space="preserve"> rather</w:t>
+        <w:br/>
+        <w:t>than a stale verdict while it does.</w:t>
+      </w:r>
+    </w:p>
+    <w:p>
+      <w:r>
+        <w:rPr>
+          <w:b/>
+        </w:rPr>
+        <w:t>Only clear</w:t>
+      </w:r>
+      <w:r>
+        <w:rPr/>
+        <w:t xml:space="preserve"> keeps a row only when its chip reads Clear </w:t>
+      </w:r>
+      <w:r>
+        <w:rPr>
+          <w:b/>
+        </w:rPr>
+        <w:t>and</w:t>
+      </w:r>
+      <w:r>
+        <w:rPr/>
+        <w:t xml:space="preserve"> its paper-book fit</w:t>
+        <w:br/>
+        <w:t>was actually checked. A row that reads Clear over a grey book line is hidden: a grey</w:t>
+        <w:br/>
+        <w:t>book line does not change the verdict, but the filter promises a fit was tested. A</w:t>
+        <w:br/>
+        <w:t>row carrying no verdict at all is hidden for the same reason — the filter fails</w:t>
+        <w:br/>
+        <w:t>closed. It re-filters rows already on screen and reads nothing.</w:t>
       </w:r>
     </w:p>
     <w:p>
@@ -30050,6 +31735,80 @@
         <w:rPr>
           <w:b/>
         </w:rPr>
+        <w:t>Only clear</w:t>
+      </w:r>
+      <w:r>
+        <w:rPr/>
+        <w:t>, the switch beside the chips, hides every idea that is not fully</w:t>
+        <w:br/>
+        <w:t xml:space="preserve">clear on the </w:t>
+      </w:r>
+      <w:r>
+        <w:rPr>
+          <w:color w:val="5D5294"/>
+        </w:rPr>
+        <w:t>Go / No-Go checklist</w:t>
+      </w:r>
+      <w:r>
+        <w:rPr/>
+        <w:t xml:space="preserve"> — the same nine checks</w:t>
+        <w:br/>
+        <w:t>the Market Scanner shows, read against the same live feeds. Two differences from</w:t>
+        <w:br/>
+        <w:t xml:space="preserve">the Scanner's copy, both deliberate: it filters the </w:t>
+      </w:r>
+      <w:r>
+        <w:rPr>
+          <w:b/>
+        </w:rPr>
+        <w:t>ranked list only</w:t>
+      </w:r>
+      <w:r>
+        <w:rPr/>
+        <w:t>, leaving</w:t>
+        <w:br/>
+        <w:t>the top-pick cards to go on showing the best of each group (the cards exist to</w:t>
+        <w:br/>
+        <w:t>compare structures, and hiding one would remove the comparison rather than a</w:t>
+        <w:br/>
+        <w:t xml:space="preserve">candidate), and the summary's count line reports the hiding — </w:t>
+      </w:r>
+      <w:r>
+        <w:rPr>
+          <w:i/>
+        </w:rPr>
+        <w:t>3 of 40 shown · 37</w:t>
+        <w:br/>
+        <w:t>hidden by Only clear</w:t>
+      </w:r>
+      <w:r>
+        <w:rPr/>
+        <w:t xml:space="preserve">, or </w:t>
+      </w:r>
+      <w:r>
+        <w:rPr>
+          <w:i/>
+        </w:rPr>
+        <w:t>3 of the 20 in the chosen strategies shown</w:t>
+      </w:r>
+      <w:r>
+        <w:rPr/>
+        <w:t xml:space="preserve"> while a</w:t>
+        <w:br/>
+        <w:t>strategy chip is active, since the total is then the chip's list and reading it as</w:t>
+        <w:br/>
+        <w:t>a share of the whole scan would be wrong. Nothing hidden adds nothing to the line.</w:t>
+        <w:br/>
+        <w:t>A list painted before the page has read the checks carries no verdicts at all, and</w:t>
+        <w:br/>
+        <w:t>those rows are hidden rather than judged.</w:t>
+      </w:r>
+    </w:p>
+    <w:p>
+      <w:r>
+        <w:rPr>
+          <w:b/>
+        </w:rPr>
         <w:t>Top picks.</w:t>
       </w:r>
       <w:r>
@@ -30765,7 +32524,7 @@
               <w:rPr>
                 <w:b/>
               </w:rPr>
-              <w:t>Grade</w:t>
+              <w:t>Checks</w:t>
             </w:r>
           </w:p>
         </w:tc>
@@ -30773,6 +32532,54 @@
           <w:tcPr>
             <w:tcW w:type="dxa" w:w="4320"/>
             <w:shd w:val="clear" w:color="auto" w:fill="F4F6FA"/>
+          </w:tcPr>
+          <w:p>
+            <w:r/>
+            <w:r>
+              <w:rPr/>
+              <w:t xml:space="preserve">the </w:t>
+            </w:r>
+            <w:r>
+              <w:rPr>
+                <w:color w:val="5D5294"/>
+              </w:rPr>
+              <w:t>Go / No-Go checklist's</w:t>
+            </w:r>
+            <w:r>
+              <w:rPr/>
+              <w:t xml:space="preserve"> verdict in one chip, the full sentence on hover and every line in the detail panel. </w:t>
+            </w:r>
+            <w:r>
+              <w:rPr>
+                <w:b/>
+              </w:rPr>
+              <w:t>Not sortable</w:t>
+            </w:r>
+            <w:r>
+              <w:rPr/>
+              <w:t>: its words would sort alphabetically, which is not an ordering of how clear a trade is</w:t>
+            </w:r>
+          </w:p>
+        </w:tc>
+      </w:tr>
+      <w:tr>
+        <w:tc>
+          <w:tcPr>
+            <w:tcW w:type="dxa" w:w="4320"/>
+          </w:tcPr>
+          <w:p>
+            <w:r/>
+            <w:r>
+              <w:rPr>
+                <w:b/>
+              </w:rPr>
+              <w:t>Grade</w:t>
+            </w:r>
+          </w:p>
+        </w:tc>
+        <w:tc>
+          <w:tcPr>
+            <w:tcW w:type="dxa" w:w="4320"/>
           </w:tcPr>
           <w:p>
             <w:r/>
@@ -30996,7 +32803,45 @@
         <w:rPr/>
         <w:t xml:space="preserve"> rather than per contract when shares are part</w:t>
         <w:br/>
-        <w:t>of it — a share lot is thousands of dollars, not a contract's worth.</w:t>
+        <w:t>of it — a share lot is thousands of dollars, not a contract's worth. It opens with the</w:t>
+        <w:br/>
+      </w:r>
+      <w:r>
+        <w:rPr>
+          <w:b/>
+        </w:rPr>
+        <w:t>checklist</w:t>
+      </w:r>
+      <w:r>
+        <w:rPr/>
+        <w:t xml:space="preserve"> — the nine checks behind the row's chip, written out — and judges the same</w:t>
+        <w:br/>
+        <w:t>candidate the chip was judged on, including that row's paper-trade gate; it says</w:t>
+        <w:br/>
+      </w:r>
+      <w:r>
+        <w:rPr>
+          <w:i/>
+        </w:rPr>
+        <w:t>Checking…</w:t>
+      </w:r>
+      <w:r>
+        <w:rPr/>
+        <w:t xml:space="preserve"> while it reads the feeds, and </w:t>
+      </w:r>
+      <w:r>
+        <w:rPr>
+          <w:i/>
+        </w:rPr>
+        <w:t>This trade is no longer in the scan's results</w:t>
+        <w:br/>
+        <w:t>— the details below are as it last read</w:t>
+      </w:r>
+      <w:r>
+        <w:rPr/>
+        <w:t xml:space="preserve"> once the list stops carrying the row, rather</w:t>
+        <w:br/>
+        <w:t>than keeping a verdict on something that has gone.</w:t>
       </w:r>
     </w:p>
     <w:p>

</xml_diff>